<commit_message>
Uzupełnij kolumnę Uzasadnienie w pliku do generatora
Co-Authored-By: Claude Sonnet 5.5 <noreply@anthropic.com>
Claude-Session: https://claude.ai/code/session_01KN7DvfDj9VhKkqEBm66mEf
</commit_message>
<xml_diff>
--- a/Wynagrodzenia_do_generatora.docx
+++ b/Wynagrodzenia_do_generatora.docx
@@ -4,7 +4,7 @@
   <w:body>
     <w:tbl>
       <w:tblPr>
-        <w:tblW w:type="dxa" w:w="13700"/>
+        <w:tblW w:type="dxa" w:w="15700"/>
         <w:tblBorders>
           <w:top w:val="single" w:color="auto" w:sz="4"/>
           <w:left w:val="single" w:color="auto" w:sz="4"/>
@@ -15,11 +15,11 @@
         </w:tblBorders>
       </w:tblPr>
       <w:tblGrid>
-        <w:gridCol w:w="900"/>
-        <w:gridCol w:w="2600"/>
+        <w:gridCol w:w="800"/>
         <w:gridCol w:w="1700"/>
-        <w:gridCol w:w="1500"/>
-        <w:gridCol w:w="7000"/>
+        <w:gridCol w:w="1400"/>
+        <w:gridCol w:w="5900"/>
+        <w:gridCol w:w="5900"/>
       </w:tblGrid>
       <w:tr>
         <w:trPr>
@@ -27,7 +27,7 @@
         </w:trPr>
         <w:tc>
           <w:tcPr>
-            <w:tcW w:type="dxa" w:w="900"/>
+            <w:tcW w:type="dxa" w:w="800"/>
             <w:tcBorders>
               <w:top w:val="single" w:color="999999" w:sz="4"/>
               <w:left w:val="single" w:color="999999" w:sz="4"/>
@@ -57,7 +57,7 @@
         </w:tc>
         <w:tc>
           <w:tcPr>
-            <w:tcW w:type="dxa" w:w="2600"/>
+            <w:tcW w:type="dxa" w:w="1700"/>
             <w:tcBorders>
               <w:top w:val="single" w:color="999999" w:sz="4"/>
               <w:left w:val="single" w:color="999999" w:sz="4"/>
@@ -87,7 +87,7 @@
         </w:tc>
         <w:tc>
           <w:tcPr>
-            <w:tcW w:type="dxa" w:w="1700"/>
+            <w:tcW w:type="dxa" w:w="1400"/>
             <w:tcBorders>
               <w:top w:val="single" w:color="999999" w:sz="4"/>
               <w:left w:val="single" w:color="999999" w:sz="4"/>
@@ -117,7 +117,7 @@
         </w:tc>
         <w:tc>
           <w:tcPr>
-            <w:tcW w:type="dxa" w:w="1500"/>
+            <w:tcW w:type="dxa" w:w="5900"/>
             <w:tcBorders>
               <w:top w:val="single" w:color="999999" w:sz="4"/>
               <w:left w:val="single" w:color="999999" w:sz="4"/>
@@ -147,7 +147,7 @@
         </w:tc>
         <w:tc>
           <w:tcPr>
-            <w:tcW w:type="dxa" w:w="7000"/>
+            <w:tcW w:type="dxa" w:w="5900"/>
             <w:tcBorders>
               <w:top w:val="single" w:color="999999" w:sz="4"/>
               <w:left w:val="single" w:color="999999" w:sz="4"/>
@@ -182,7 +182,7 @@
         </w:trPr>
         <w:tc>
           <w:tcPr>
-            <w:tcW w:type="dxa" w:w="900"/>
+            <w:tcW w:type="dxa" w:w="800"/>
             <w:tcBorders>
               <w:top w:val="single" w:color="999999" w:sz="4"/>
               <w:left w:val="single" w:color="999999" w:sz="4"/>
@@ -211,7 +211,7 @@
         </w:tc>
         <w:tc>
           <w:tcPr>
-            <w:tcW w:type="dxa" w:w="2600"/>
+            <w:tcW w:type="dxa" w:w="1700"/>
             <w:tcBorders>
               <w:top w:val="single" w:color="999999" w:sz="4"/>
               <w:left w:val="single" w:color="999999" w:sz="4"/>
@@ -240,7 +240,7 @@
         </w:tc>
         <w:tc>
           <w:tcPr>
-            <w:tcW w:type="dxa" w:w="1700"/>
+            <w:tcW w:type="dxa" w:w="1400"/>
             <w:tcBorders>
               <w:top w:val="single" w:color="999999" w:sz="4"/>
               <w:left w:val="single" w:color="999999" w:sz="4"/>
@@ -269,36 +269,36 @@
         </w:tc>
         <w:tc>
           <w:tcPr>
-            <w:tcW w:type="dxa" w:w="1500"/>
-            <w:tcBorders>
-              <w:top w:val="single" w:color="999999" w:sz="4"/>
-              <w:left w:val="single" w:color="999999" w:sz="4"/>
-              <w:bottom w:val="single" w:color="999999" w:sz="4"/>
-              <w:right w:val="single" w:color="999999" w:sz="4"/>
-            </w:tcBorders>
-            <w:tcMar>
-              <w:top w:type="dxa" w:w="60"/>
-              <w:left w:type="dxa" w:w="80"/>
-              <w:bottom w:type="dxa" w:w="60"/>
-              <w:right w:type="dxa" w:w="80"/>
-            </w:tcMar>
-          </w:tcPr>
-          <w:p>
-            <w:r>
-              <w:rPr>
-                <w:rFonts w:ascii="Arial" w:cs="Arial" w:eastAsia="Arial" w:hAnsi="Arial"/>
-                <w:b w:val="false"/>
-                <w:bCs w:val="false"/>
-                <w:sz w:val="16"/>
-                <w:szCs w:val="16"/>
-              </w:rPr>
-              <w:t xml:space="preserve"/>
-            </w:r>
-          </w:p>
-        </w:tc>
-        <w:tc>
-          <w:tcPr>
-            <w:tcW w:type="dxa" w:w="7000"/>
+            <w:tcW w:type="dxa" w:w="5900"/>
+            <w:tcBorders>
+              <w:top w:val="single" w:color="999999" w:sz="4"/>
+              <w:left w:val="single" w:color="999999" w:sz="4"/>
+              <w:bottom w:val="single" w:color="999999" w:sz="4"/>
+              <w:right w:val="single" w:color="999999" w:sz="4"/>
+            </w:tcBorders>
+            <w:tcMar>
+              <w:top w:type="dxa" w:w="60"/>
+              <w:left w:type="dxa" w:w="80"/>
+              <w:bottom w:type="dxa" w:w="60"/>
+              <w:right w:type="dxa" w:w="80"/>
+            </w:tcMar>
+          </w:tcPr>
+          <w:p>
+            <w:r>
+              <w:rPr>
+                <w:rFonts w:ascii="Arial" w:cs="Arial" w:eastAsia="Arial" w:hAnsi="Arial"/>
+                <w:b w:val="false"/>
+                <w:bCs w:val="false"/>
+                <w:sz w:val="16"/>
+                <w:szCs w:val="16"/>
+              </w:rPr>
+              <w:t xml:space="preserve">AI Lead zaprojektuje architekturę potoku wielomodalnej akwizycji i zdefiniuje wymaganie synchronizacji znaczników czasu do 0,001 s dla kamer, radaru mmWave i czujników MEMS. Opracuje algorytm wykrywania i korekcji utraty synchronizacji przy drganiach oraz framework oceny jakości strumieni (kompletność, ciągłość, spójność czasowa). Przygotuje schemat anotacji i kryteria jakości danych, a także oceni zgodność anotatorów współczynnikiem Cohena i zdecyduje o reanotacji, gdy zgodność spadnie poniżej 0,80. Opracuje strukturę i wersjonowanie zbioru przekazywanego do PRz. Stanowisko jest niezbędne, ponieważ jakość synchronizacji i anotacji decyduje o tym, czy modele w zadaniach Z4 i Z8 będzie można wytrenować. Zakres stanowiska ma wyłącznie charakter badawczo-rozwojowy i nie obejmuje czynności zarządczych, kierowniczych, koordynacyjnych, administracyjnych ani nadzorczych.</w:t>
+            </w:r>
+          </w:p>
+        </w:tc>
+        <w:tc>
+          <w:tcPr>
+            <w:tcW w:type="dxa" w:w="5900"/>
             <w:tcBorders>
               <w:top w:val="single" w:color="999999" w:sz="4"/>
               <w:left w:val="single" w:color="999999" w:sz="4"/>
@@ -332,7 +332,7 @@
         </w:trPr>
         <w:tc>
           <w:tcPr>
-            <w:tcW w:type="dxa" w:w="900"/>
+            <w:tcW w:type="dxa" w:w="800"/>
             <w:tcBorders>
               <w:top w:val="single" w:color="999999" w:sz="4"/>
               <w:left w:val="single" w:color="999999" w:sz="4"/>
@@ -361,7 +361,7 @@
         </w:tc>
         <w:tc>
           <w:tcPr>
-            <w:tcW w:type="dxa" w:w="2600"/>
+            <w:tcW w:type="dxa" w:w="1700"/>
             <w:tcBorders>
               <w:top w:val="single" w:color="999999" w:sz="4"/>
               <w:left w:val="single" w:color="999999" w:sz="4"/>
@@ -390,7 +390,7 @@
         </w:tc>
         <w:tc>
           <w:tcPr>
-            <w:tcW w:type="dxa" w:w="1700"/>
+            <w:tcW w:type="dxa" w:w="1400"/>
             <w:tcBorders>
               <w:top w:val="single" w:color="999999" w:sz="4"/>
               <w:left w:val="single" w:color="999999" w:sz="4"/>
@@ -419,36 +419,36 @@
         </w:tc>
         <w:tc>
           <w:tcPr>
-            <w:tcW w:type="dxa" w:w="1500"/>
-            <w:tcBorders>
-              <w:top w:val="single" w:color="999999" w:sz="4"/>
-              <w:left w:val="single" w:color="999999" w:sz="4"/>
-              <w:bottom w:val="single" w:color="999999" w:sz="4"/>
-              <w:right w:val="single" w:color="999999" w:sz="4"/>
-            </w:tcBorders>
-            <w:tcMar>
-              <w:top w:type="dxa" w:w="60"/>
-              <w:left w:type="dxa" w:w="80"/>
-              <w:bottom w:type="dxa" w:w="60"/>
-              <w:right w:type="dxa" w:w="80"/>
-            </w:tcMar>
-          </w:tcPr>
-          <w:p>
-            <w:r>
-              <w:rPr>
-                <w:rFonts w:ascii="Arial" w:cs="Arial" w:eastAsia="Arial" w:hAnsi="Arial"/>
-                <w:b w:val="false"/>
-                <w:bCs w:val="false"/>
-                <w:sz w:val="16"/>
-                <w:szCs w:val="16"/>
-              </w:rPr>
-              <w:t xml:space="preserve"/>
-            </w:r>
-          </w:p>
-        </w:tc>
-        <w:tc>
-          <w:tcPr>
-            <w:tcW w:type="dxa" w:w="7000"/>
+            <w:tcW w:type="dxa" w:w="5900"/>
+            <w:tcBorders>
+              <w:top w:val="single" w:color="999999" w:sz="4"/>
+              <w:left w:val="single" w:color="999999" w:sz="4"/>
+              <w:bottom w:val="single" w:color="999999" w:sz="4"/>
+              <w:right w:val="single" w:color="999999" w:sz="4"/>
+            </w:tcBorders>
+            <w:tcMar>
+              <w:top w:type="dxa" w:w="60"/>
+              <w:left w:type="dxa" w:w="80"/>
+              <w:bottom w:type="dxa" w:w="60"/>
+              <w:right w:type="dxa" w:w="80"/>
+            </w:tcMar>
+          </w:tcPr>
+          <w:p>
+            <w:r>
+              <w:rPr>
+                <w:rFonts w:ascii="Arial" w:cs="Arial" w:eastAsia="Arial" w:hAnsi="Arial"/>
+                <w:b w:val="false"/>
+                <w:bCs w:val="false"/>
+                <w:sz w:val="16"/>
+                <w:szCs w:val="16"/>
+              </w:rPr>
+              <w:t xml:space="preserve">AI Senior Engineer zaprogramuje moduł ujednolicania znaczników czasu dla strumieni o częstotliwościach od około 0,017 Hz do 1000 Hz, system monitorowania integralności danych oraz oprogramowanie kalibracji kamer z automatyczną weryfikacją. Opracuje specyfikację anotacji segmentacji instancji w standardzie COCO dla anotatorów Everest11: kryteria decyzyjne dla każdej klasy zabezpieczeń, warunki graniczne okluzji i protokół kontroli jakości. Wykona analizę pilotażową zbioru pod kątem możliwości trenowania modeli. Stanowisko jest niezbędne dla wiarygodności i kompletności zbioru. Zakres stanowiska ma wyłącznie charakter badawczo-rozwojowy i nie obejmuje czynności zarządczych, kierowniczych, koordynacyjnych, administracyjnych ani nadzorczych.</w:t>
+            </w:r>
+          </w:p>
+        </w:tc>
+        <w:tc>
+          <w:tcPr>
+            <w:tcW w:type="dxa" w:w="5900"/>
             <w:tcBorders>
               <w:top w:val="single" w:color="999999" w:sz="4"/>
               <w:left w:val="single" w:color="999999" w:sz="4"/>
@@ -482,7 +482,7 @@
         </w:trPr>
         <w:tc>
           <w:tcPr>
-            <w:tcW w:type="dxa" w:w="900"/>
+            <w:tcW w:type="dxa" w:w="800"/>
             <w:tcBorders>
               <w:top w:val="single" w:color="999999" w:sz="4"/>
               <w:left w:val="single" w:color="999999" w:sz="4"/>
@@ -511,7 +511,7 @@
         </w:tc>
         <w:tc>
           <w:tcPr>
-            <w:tcW w:type="dxa" w:w="2600"/>
+            <w:tcW w:type="dxa" w:w="1700"/>
             <w:tcBorders>
               <w:top w:val="single" w:color="999999" w:sz="4"/>
               <w:left w:val="single" w:color="999999" w:sz="4"/>
@@ -540,7 +540,7 @@
         </w:tc>
         <w:tc>
           <w:tcPr>
-            <w:tcW w:type="dxa" w:w="1700"/>
+            <w:tcW w:type="dxa" w:w="1400"/>
             <w:tcBorders>
               <w:top w:val="single" w:color="999999" w:sz="4"/>
               <w:left w:val="single" w:color="999999" w:sz="4"/>
@@ -569,36 +569,36 @@
         </w:tc>
         <w:tc>
           <w:tcPr>
-            <w:tcW w:type="dxa" w:w="1500"/>
-            <w:tcBorders>
-              <w:top w:val="single" w:color="999999" w:sz="4"/>
-              <w:left w:val="single" w:color="999999" w:sz="4"/>
-              <w:bottom w:val="single" w:color="999999" w:sz="4"/>
-              <w:right w:val="single" w:color="999999" w:sz="4"/>
-            </w:tcBorders>
-            <w:tcMar>
-              <w:top w:type="dxa" w:w="60"/>
-              <w:left w:type="dxa" w:w="80"/>
-              <w:bottom w:type="dxa" w:w="60"/>
-              <w:right w:type="dxa" w:w="80"/>
-            </w:tcMar>
-          </w:tcPr>
-          <w:p>
-            <w:r>
-              <w:rPr>
-                <w:rFonts w:ascii="Arial" w:cs="Arial" w:eastAsia="Arial" w:hAnsi="Arial"/>
-                <w:b w:val="false"/>
-                <w:bCs w:val="false"/>
-                <w:sz w:val="16"/>
-                <w:szCs w:val="16"/>
-              </w:rPr>
-              <w:t xml:space="preserve"/>
-            </w:r>
-          </w:p>
-        </w:tc>
-        <w:tc>
-          <w:tcPr>
-            <w:tcW w:type="dxa" w:w="7000"/>
+            <w:tcW w:type="dxa" w:w="5900"/>
+            <w:tcBorders>
+              <w:top w:val="single" w:color="999999" w:sz="4"/>
+              <w:left w:val="single" w:color="999999" w:sz="4"/>
+              <w:bottom w:val="single" w:color="999999" w:sz="4"/>
+              <w:right w:val="single" w:color="999999" w:sz="4"/>
+            </w:tcBorders>
+            <w:tcMar>
+              <w:top w:type="dxa" w:w="60"/>
+              <w:left w:type="dxa" w:w="80"/>
+              <w:bottom w:type="dxa" w:w="60"/>
+              <w:right w:type="dxa" w:w="80"/>
+            </w:tcMar>
+          </w:tcPr>
+          <w:p>
+            <w:r>
+              <w:rPr>
+                <w:rFonts w:ascii="Arial" w:cs="Arial" w:eastAsia="Arial" w:hAnsi="Arial"/>
+                <w:b w:val="false"/>
+                <w:bCs w:val="false"/>
+                <w:sz w:val="16"/>
+                <w:szCs w:val="16"/>
+              </w:rPr>
+              <w:t xml:space="preserve">Specjalista ds. cyberbezpieczeństwa zaprojektuje zabezpieczenia akwizycji i przechowywania danych: szyfrowanie danych sensorycznych w spoczynku i w transmisji, mechanizm kluczy dostępu do repozytorium oraz pseudonimizację danych wizyjnych i lokalizacyjnych w zbiorze. Zabezpieczenia są częścią metody akwizycji, ponieważ zbiór zawiera dane kierowców i bez nich nie można go zebrać ani przekazać do PRz. Czynności z zakresu zgodności z AI Act i RODO mają charakter przedwdrożeniowy i nie są objęte kosztem. Zakres stanowiska ma wyłącznie charakter badawczo-rozwojowy i nie obejmuje czynności zarządczych, kierowniczych, koordynacyjnych, administracyjnych ani nadzorczych.</w:t>
+            </w:r>
+          </w:p>
+        </w:tc>
+        <w:tc>
+          <w:tcPr>
+            <w:tcW w:type="dxa" w:w="5900"/>
             <w:tcBorders>
               <w:top w:val="single" w:color="999999" w:sz="4"/>
               <w:left w:val="single" w:color="999999" w:sz="4"/>
@@ -632,7 +632,7 @@
         </w:trPr>
         <w:tc>
           <w:tcPr>
-            <w:tcW w:type="dxa" w:w="900"/>
+            <w:tcW w:type="dxa" w:w="800"/>
             <w:tcBorders>
               <w:top w:val="single" w:color="999999" w:sz="4"/>
               <w:left w:val="single" w:color="999999" w:sz="4"/>
@@ -661,7 +661,7 @@
         </w:tc>
         <w:tc>
           <w:tcPr>
-            <w:tcW w:type="dxa" w:w="2600"/>
+            <w:tcW w:type="dxa" w:w="1700"/>
             <w:tcBorders>
               <w:top w:val="single" w:color="999999" w:sz="4"/>
               <w:left w:val="single" w:color="999999" w:sz="4"/>
@@ -690,7 +690,7 @@
         </w:tc>
         <w:tc>
           <w:tcPr>
-            <w:tcW w:type="dxa" w:w="1700"/>
+            <w:tcW w:type="dxa" w:w="1400"/>
             <w:tcBorders>
               <w:top w:val="single" w:color="999999" w:sz="4"/>
               <w:left w:val="single" w:color="999999" w:sz="4"/>
@@ -719,36 +719,36 @@
         </w:tc>
         <w:tc>
           <w:tcPr>
-            <w:tcW w:type="dxa" w:w="1500"/>
-            <w:tcBorders>
-              <w:top w:val="single" w:color="999999" w:sz="4"/>
-              <w:left w:val="single" w:color="999999" w:sz="4"/>
-              <w:bottom w:val="single" w:color="999999" w:sz="4"/>
-              <w:right w:val="single" w:color="999999" w:sz="4"/>
-            </w:tcBorders>
-            <w:tcMar>
-              <w:top w:type="dxa" w:w="60"/>
-              <w:left w:type="dxa" w:w="80"/>
-              <w:bottom w:type="dxa" w:w="60"/>
-              <w:right w:type="dxa" w:w="80"/>
-            </w:tcMar>
-          </w:tcPr>
-          <w:p>
-            <w:r>
-              <w:rPr>
-                <w:rFonts w:ascii="Arial" w:cs="Arial" w:eastAsia="Arial" w:hAnsi="Arial"/>
-                <w:b w:val="false"/>
-                <w:bCs w:val="false"/>
-                <w:sz w:val="16"/>
-                <w:szCs w:val="16"/>
-              </w:rPr>
-              <w:t xml:space="preserve"/>
-            </w:r>
-          </w:p>
-        </w:tc>
-        <w:tc>
-          <w:tcPr>
-            <w:tcW w:type="dxa" w:w="7000"/>
+            <w:tcW w:type="dxa" w:w="5900"/>
+            <w:tcBorders>
+              <w:top w:val="single" w:color="999999" w:sz="4"/>
+              <w:left w:val="single" w:color="999999" w:sz="4"/>
+              <w:bottom w:val="single" w:color="999999" w:sz="4"/>
+              <w:right w:val="single" w:color="999999" w:sz="4"/>
+            </w:tcBorders>
+            <w:tcMar>
+              <w:top w:type="dxa" w:w="60"/>
+              <w:left w:type="dxa" w:w="80"/>
+              <w:bottom w:type="dxa" w:w="60"/>
+              <w:right w:type="dxa" w:w="80"/>
+            </w:tcMar>
+          </w:tcPr>
+          <w:p>
+            <w:r>
+              <w:rPr>
+                <w:rFonts w:ascii="Arial" w:cs="Arial" w:eastAsia="Arial" w:hAnsi="Arial"/>
+                <w:b w:val="false"/>
+                <w:bCs w:val="false"/>
+                <w:sz w:val="16"/>
+                <w:szCs w:val="16"/>
+              </w:rPr>
+              <w:t xml:space="preserve">IT Specialist zbuduje infrastrukturę zapisu danych: ciągły zapis wszystkich strumieni na dysku NVMe, kompresję i rotację logów oraz odzyskiwanie po zaniku zasilania. Wykona potok strukturyzacji i wersjonowania zbioru: tagowanie sesji metadanymi (trasa, klasa ładunku, warunki pogodowe, identyfikator naczepy), walidację kompletności każdej sesji i eksport do repozytorium PRz z sumami kontrolnymi. Wdroży zdalny monitoring stanu zestawów sensorycznych w trakcie kampanii. Bez tej infrastruktury nie będzie możliwe wiarygodne zebranie co najmniej 500 godzin danych użytecznych. Zakres stanowiska ma wyłącznie charakter badawczo-rozwojowy i nie obejmuje czynności zarządczych, kierowniczych, koordynacyjnych, administracyjnych ani nadzorczych.</w:t>
+            </w:r>
+          </w:p>
+        </w:tc>
+        <w:tc>
+          <w:tcPr>
+            <w:tcW w:type="dxa" w:w="5900"/>
             <w:tcBorders>
               <w:top w:val="single" w:color="999999" w:sz="4"/>
               <w:left w:val="single" w:color="999999" w:sz="4"/>
@@ -782,7 +782,7 @@
         </w:trPr>
         <w:tc>
           <w:tcPr>
-            <w:tcW w:type="dxa" w:w="900"/>
+            <w:tcW w:type="dxa" w:w="800"/>
             <w:tcBorders>
               <w:top w:val="single" w:color="999999" w:sz="4"/>
               <w:left w:val="single" w:color="999999" w:sz="4"/>
@@ -811,7 +811,7 @@
         </w:tc>
         <w:tc>
           <w:tcPr>
-            <w:tcW w:type="dxa" w:w="2600"/>
+            <w:tcW w:type="dxa" w:w="1700"/>
             <w:tcBorders>
               <w:top w:val="single" w:color="999999" w:sz="4"/>
               <w:left w:val="single" w:color="999999" w:sz="4"/>
@@ -840,7 +840,7 @@
         </w:tc>
         <w:tc>
           <w:tcPr>
-            <w:tcW w:type="dxa" w:w="1700"/>
+            <w:tcW w:type="dxa" w:w="1400"/>
             <w:tcBorders>
               <w:top w:val="single" w:color="999999" w:sz="4"/>
               <w:left w:val="single" w:color="999999" w:sz="4"/>
@@ -869,36 +869,36 @@
         </w:tc>
         <w:tc>
           <w:tcPr>
-            <w:tcW w:type="dxa" w:w="1500"/>
-            <w:tcBorders>
-              <w:top w:val="single" w:color="999999" w:sz="4"/>
-              <w:left w:val="single" w:color="999999" w:sz="4"/>
-              <w:bottom w:val="single" w:color="999999" w:sz="4"/>
-              <w:right w:val="single" w:color="999999" w:sz="4"/>
-            </w:tcBorders>
-            <w:tcMar>
-              <w:top w:type="dxa" w:w="60"/>
-              <w:left w:type="dxa" w:w="80"/>
-              <w:bottom w:type="dxa" w:w="60"/>
-              <w:right w:type="dxa" w:w="80"/>
-            </w:tcMar>
-          </w:tcPr>
-          <w:p>
-            <w:r>
-              <w:rPr>
-                <w:rFonts w:ascii="Arial" w:cs="Arial" w:eastAsia="Arial" w:hAnsi="Arial"/>
-                <w:b w:val="false"/>
-                <w:bCs w:val="false"/>
-                <w:sz w:val="16"/>
-                <w:szCs w:val="16"/>
-              </w:rPr>
-              <w:t xml:space="preserve"/>
-            </w:r>
-          </w:p>
-        </w:tc>
-        <w:tc>
-          <w:tcPr>
-            <w:tcW w:type="dxa" w:w="7000"/>
+            <w:tcW w:type="dxa" w:w="5900"/>
+            <w:tcBorders>
+              <w:top w:val="single" w:color="999999" w:sz="4"/>
+              <w:left w:val="single" w:color="999999" w:sz="4"/>
+              <w:bottom w:val="single" w:color="999999" w:sz="4"/>
+              <w:right w:val="single" w:color="999999" w:sz="4"/>
+            </w:tcBorders>
+            <w:tcMar>
+              <w:top w:type="dxa" w:w="60"/>
+              <w:left w:type="dxa" w:w="80"/>
+              <w:bottom w:type="dxa" w:w="60"/>
+              <w:right w:type="dxa" w:w="80"/>
+            </w:tcMar>
+          </w:tcPr>
+          <w:p>
+            <w:r>
+              <w:rPr>
+                <w:rFonts w:ascii="Arial" w:cs="Arial" w:eastAsia="Arial" w:hAnsi="Arial"/>
+                <w:b w:val="false"/>
+                <w:bCs w:val="false"/>
+                <w:sz w:val="16"/>
+                <w:szCs w:val="16"/>
+              </w:rPr>
+              <w:t xml:space="preserve">IoT Specialist zaprojektuje warstwę sprzętową toru pomiarowego: dobierze i skonfiguruje czujniki MEMS i radar mmWave FMCW 77 GHz, zaprojektuje zasilanie z sieci pojazdu 12 i 24 V oraz iteracyjnie dobierze ekranowanie EMC ograniczające artefakty od metalowych ścian w widmie drgań od 5 do 150 Hz. Wykona odbiór techniczny montażu wykonanego przez podwykonawcę, uruchomi tor i przeprowadzi testy kalibracyjne: stacjonarny co najmniej 24 h i drogowy co najmniej 500 km. Montaż nie należy do tego stanowiska. Prace są warunkiem fizycznej poprawności toru pomiarowego. Zakres stanowiska ma wyłącznie charakter badawczo-rozwojowy i nie obejmuje czynności zarządczych, kierowniczych, koordynacyjnych, administracyjnych ani nadzorczych.</w:t>
+            </w:r>
+          </w:p>
+        </w:tc>
+        <w:tc>
+          <w:tcPr>
+            <w:tcW w:type="dxa" w:w="5900"/>
             <w:tcBorders>
               <w:top w:val="single" w:color="999999" w:sz="4"/>
               <w:left w:val="single" w:color="999999" w:sz="4"/>
@@ -932,7 +932,7 @@
         </w:trPr>
         <w:tc>
           <w:tcPr>
-            <w:tcW w:type="dxa" w:w="900"/>
+            <w:tcW w:type="dxa" w:w="800"/>
             <w:tcBorders>
               <w:top w:val="single" w:color="999999" w:sz="4"/>
               <w:left w:val="single" w:color="999999" w:sz="4"/>
@@ -961,7 +961,7 @@
         </w:tc>
         <w:tc>
           <w:tcPr>
-            <w:tcW w:type="dxa" w:w="2600"/>
+            <w:tcW w:type="dxa" w:w="1700"/>
             <w:tcBorders>
               <w:top w:val="single" w:color="999999" w:sz="4"/>
               <w:left w:val="single" w:color="999999" w:sz="4"/>
@@ -990,7 +990,7 @@
         </w:tc>
         <w:tc>
           <w:tcPr>
-            <w:tcW w:type="dxa" w:w="1700"/>
+            <w:tcW w:type="dxa" w:w="1400"/>
             <w:tcBorders>
               <w:top w:val="single" w:color="999999" w:sz="4"/>
               <w:left w:val="single" w:color="999999" w:sz="4"/>
@@ -1019,36 +1019,36 @@
         </w:tc>
         <w:tc>
           <w:tcPr>
-            <w:tcW w:type="dxa" w:w="1500"/>
-            <w:tcBorders>
-              <w:top w:val="single" w:color="999999" w:sz="4"/>
-              <w:left w:val="single" w:color="999999" w:sz="4"/>
-              <w:bottom w:val="single" w:color="999999" w:sz="4"/>
-              <w:right w:val="single" w:color="999999" w:sz="4"/>
-            </w:tcBorders>
-            <w:tcMar>
-              <w:top w:type="dxa" w:w="60"/>
-              <w:left w:type="dxa" w:w="80"/>
-              <w:bottom w:type="dxa" w:w="60"/>
-              <w:right w:type="dxa" w:w="80"/>
-            </w:tcMar>
-          </w:tcPr>
-          <w:p>
-            <w:r>
-              <w:rPr>
-                <w:rFonts w:ascii="Arial" w:cs="Arial" w:eastAsia="Arial" w:hAnsi="Arial"/>
-                <w:b w:val="false"/>
-                <w:bCs w:val="false"/>
-                <w:sz w:val="16"/>
-                <w:szCs w:val="16"/>
-              </w:rPr>
-              <w:t xml:space="preserve"/>
-            </w:r>
-          </w:p>
-        </w:tc>
-        <w:tc>
-          <w:tcPr>
-            <w:tcW w:type="dxa" w:w="7000"/>
+            <w:tcW w:type="dxa" w:w="5900"/>
+            <w:tcBorders>
+              <w:top w:val="single" w:color="999999" w:sz="4"/>
+              <w:left w:val="single" w:color="999999" w:sz="4"/>
+              <w:bottom w:val="single" w:color="999999" w:sz="4"/>
+              <w:right w:val="single" w:color="999999" w:sz="4"/>
+            </w:tcBorders>
+            <w:tcMar>
+              <w:top w:type="dxa" w:w="60"/>
+              <w:left w:type="dxa" w:w="80"/>
+              <w:bottom w:type="dxa" w:w="60"/>
+              <w:right w:type="dxa" w:w="80"/>
+            </w:tcMar>
+          </w:tcPr>
+          <w:p>
+            <w:r>
+              <w:rPr>
+                <w:rFonts w:ascii="Arial" w:cs="Arial" w:eastAsia="Arial" w:hAnsi="Arial"/>
+                <w:b w:val="false"/>
+                <w:bCs w:val="false"/>
+                <w:sz w:val="16"/>
+                <w:szCs w:val="16"/>
+              </w:rPr>
+              <w:t xml:space="preserve">Specjalista ds. logistyki TSL przekaże PRz wymagania operacyjne i uwagi domenowe do protokołu zbioru oraz taksonomii klas, a także zweryfikuje ich trafność na podstawie obserwacji z przewozów. Poprowadzi inspekcję fizyczną stanu ładunku przy załadunku i rozładunku według protokołu z zadania Z3, ze zdjęciami ze znacznikiem czasu i w trybie ślepym względem modelu, co tworzy warstwę ground truth zbioru. Zatwierdzi etykietę referencyjną przy rozbieżnościach anotatorów. Bez tej wiedzy domenowej etykiety byłyby niejednoznaczne. Zakres stanowiska ma wyłącznie charakter badawczo-rozwojowy i nie obejmuje czynności zarządczych, kierowniczych, koordynacyjnych, administracyjnych ani nadzorczych.</w:t>
+            </w:r>
+          </w:p>
+        </w:tc>
+        <w:tc>
+          <w:tcPr>
+            <w:tcW w:type="dxa" w:w="5900"/>
             <w:tcBorders>
               <w:top w:val="single" w:color="999999" w:sz="4"/>
               <w:left w:val="single" w:color="999999" w:sz="4"/>
@@ -1082,7 +1082,7 @@
         </w:trPr>
         <w:tc>
           <w:tcPr>
-            <w:tcW w:type="dxa" w:w="900"/>
+            <w:tcW w:type="dxa" w:w="800"/>
             <w:tcBorders>
               <w:top w:val="single" w:color="999999" w:sz="4"/>
               <w:left w:val="single" w:color="999999" w:sz="4"/>
@@ -1111,7 +1111,7 @@
         </w:tc>
         <w:tc>
           <w:tcPr>
-            <w:tcW w:type="dxa" w:w="2600"/>
+            <w:tcW w:type="dxa" w:w="1700"/>
             <w:tcBorders>
               <w:top w:val="single" w:color="999999" w:sz="4"/>
               <w:left w:val="single" w:color="999999" w:sz="4"/>
@@ -1140,7 +1140,7 @@
         </w:tc>
         <w:tc>
           <w:tcPr>
-            <w:tcW w:type="dxa" w:w="1700"/>
+            <w:tcW w:type="dxa" w:w="1400"/>
             <w:tcBorders>
               <w:top w:val="single" w:color="999999" w:sz="4"/>
               <w:left w:val="single" w:color="999999" w:sz="4"/>
@@ -1169,36 +1169,36 @@
         </w:tc>
         <w:tc>
           <w:tcPr>
-            <w:tcW w:type="dxa" w:w="1500"/>
-            <w:tcBorders>
-              <w:top w:val="single" w:color="999999" w:sz="4"/>
-              <w:left w:val="single" w:color="999999" w:sz="4"/>
-              <w:bottom w:val="single" w:color="999999" w:sz="4"/>
-              <w:right w:val="single" w:color="999999" w:sz="4"/>
-            </w:tcBorders>
-            <w:tcMar>
-              <w:top w:type="dxa" w:w="60"/>
-              <w:left w:type="dxa" w:w="80"/>
-              <w:bottom w:type="dxa" w:w="60"/>
-              <w:right w:type="dxa" w:w="80"/>
-            </w:tcMar>
-          </w:tcPr>
-          <w:p>
-            <w:r>
-              <w:rPr>
-                <w:rFonts w:ascii="Arial" w:cs="Arial" w:eastAsia="Arial" w:hAnsi="Arial"/>
-                <w:b w:val="false"/>
-                <w:bCs w:val="false"/>
-                <w:sz w:val="16"/>
-                <w:szCs w:val="16"/>
-              </w:rPr>
-              <w:t xml:space="preserve"/>
-            </w:r>
-          </w:p>
-        </w:tc>
-        <w:tc>
-          <w:tcPr>
-            <w:tcW w:type="dxa" w:w="7000"/>
+            <w:tcW w:type="dxa" w:w="5900"/>
+            <w:tcBorders>
+              <w:top w:val="single" w:color="999999" w:sz="4"/>
+              <w:left w:val="single" w:color="999999" w:sz="4"/>
+              <w:bottom w:val="single" w:color="999999" w:sz="4"/>
+              <w:right w:val="single" w:color="999999" w:sz="4"/>
+            </w:tcBorders>
+            <w:tcMar>
+              <w:top w:type="dxa" w:w="60"/>
+              <w:left w:type="dxa" w:w="80"/>
+              <w:bottom w:type="dxa" w:w="60"/>
+              <w:right w:type="dxa" w:w="80"/>
+            </w:tcMar>
+          </w:tcPr>
+          <w:p>
+            <w:r>
+              <w:rPr>
+                <w:rFonts w:ascii="Arial" w:cs="Arial" w:eastAsia="Arial" w:hAnsi="Arial"/>
+                <w:b w:val="false"/>
+                <w:bCs w:val="false"/>
+                <w:sz w:val="16"/>
+                <w:szCs w:val="16"/>
+              </w:rPr>
+              <w:t xml:space="preserve">Backend/Full-Stack Developer, w wymiarze 1,0 etatu w M13-M18, zaimplementuje warstwę programową potoku akwizycji: moduły zbierania i porządkowania strumieni z różnych sensorów, zapis i przesył danych według specyfikacji IT Specialist, który projektuje schemat metadanych i wersjonowanie zbioru. Zaangażowanie przypada na okres intensywnej akwizycji i porządkowania danych. Stanowisko jest niezbędne, aby utrzymać przepustowość i jakość potoku przy wielomiesięcznej kampanii na wielu pojazdach. Zakres stanowiska ma wyłącznie charakter badawczo-rozwojowy i nie obejmuje czynności zarządczych, kierowniczych, koordynacyjnych, administracyjnych ani nadzorczych.</w:t>
+            </w:r>
+          </w:p>
+        </w:tc>
+        <w:tc>
+          <w:tcPr>
+            <w:tcW w:type="dxa" w:w="5900"/>
             <w:tcBorders>
               <w:top w:val="single" w:color="999999" w:sz="4"/>
               <w:left w:val="single" w:color="999999" w:sz="4"/>
@@ -1232,7 +1232,7 @@
         </w:trPr>
         <w:tc>
           <w:tcPr>
-            <w:tcW w:type="dxa" w:w="900"/>
+            <w:tcW w:type="dxa" w:w="800"/>
             <w:tcBorders>
               <w:top w:val="single" w:color="999999" w:sz="4"/>
               <w:left w:val="single" w:color="999999" w:sz="4"/>
@@ -1261,7 +1261,7 @@
         </w:tc>
         <w:tc>
           <w:tcPr>
-            <w:tcW w:type="dxa" w:w="2600"/>
+            <w:tcW w:type="dxa" w:w="1700"/>
             <w:tcBorders>
               <w:top w:val="single" w:color="999999" w:sz="4"/>
               <w:left w:val="single" w:color="999999" w:sz="4"/>
@@ -1290,7 +1290,7 @@
         </w:tc>
         <w:tc>
           <w:tcPr>
-            <w:tcW w:type="dxa" w:w="1700"/>
+            <w:tcW w:type="dxa" w:w="1400"/>
             <w:tcBorders>
               <w:top w:val="single" w:color="999999" w:sz="4"/>
               <w:left w:val="single" w:color="999999" w:sz="4"/>
@@ -1319,36 +1319,36 @@
         </w:tc>
         <w:tc>
           <w:tcPr>
-            <w:tcW w:type="dxa" w:w="1500"/>
-            <w:tcBorders>
-              <w:top w:val="single" w:color="999999" w:sz="4"/>
-              <w:left w:val="single" w:color="999999" w:sz="4"/>
-              <w:bottom w:val="single" w:color="999999" w:sz="4"/>
-              <w:right w:val="single" w:color="999999" w:sz="4"/>
-            </w:tcBorders>
-            <w:tcMar>
-              <w:top w:type="dxa" w:w="60"/>
-              <w:left w:type="dxa" w:w="80"/>
-              <w:bottom w:type="dxa" w:w="60"/>
-              <w:right w:type="dxa" w:w="80"/>
-            </w:tcMar>
-          </w:tcPr>
-          <w:p>
-            <w:r>
-              <w:rPr>
-                <w:rFonts w:ascii="Arial" w:cs="Arial" w:eastAsia="Arial" w:hAnsi="Arial"/>
-                <w:b w:val="false"/>
-                <w:bCs w:val="false"/>
-                <w:sz w:val="16"/>
-                <w:szCs w:val="16"/>
-              </w:rPr>
-              <w:t xml:space="preserve"/>
-            </w:r>
-          </w:p>
-        </w:tc>
-        <w:tc>
-          <w:tcPr>
-            <w:tcW w:type="dxa" w:w="7000"/>
+            <w:tcW w:type="dxa" w:w="5900"/>
+            <w:tcBorders>
+              <w:top w:val="single" w:color="999999" w:sz="4"/>
+              <w:left w:val="single" w:color="999999" w:sz="4"/>
+              <w:bottom w:val="single" w:color="999999" w:sz="4"/>
+              <w:right w:val="single" w:color="999999" w:sz="4"/>
+            </w:tcBorders>
+            <w:tcMar>
+              <w:top w:type="dxa" w:w="60"/>
+              <w:left w:type="dxa" w:w="80"/>
+              <w:bottom w:type="dxa" w:w="60"/>
+              <w:right w:type="dxa" w:w="80"/>
+            </w:tcMar>
+          </w:tcPr>
+          <w:p>
+            <w:r>
+              <w:rPr>
+                <w:rFonts w:ascii="Arial" w:cs="Arial" w:eastAsia="Arial" w:hAnsi="Arial"/>
+                <w:b w:val="false"/>
+                <w:bCs w:val="false"/>
+                <w:sz w:val="16"/>
+                <w:szCs w:val="16"/>
+              </w:rPr>
+              <w:t xml:space="preserve">Trzech anotatorów, każdy w wymiarze 1,0 etatu przez 10 miesięcy, wykona anotację co najmniej 15 000 klatek RGB metodą segmentacji instancji w standardzie COCO według taksonomii TSL i kryteriów opracowanych przez zespół B+R Lidera. Przy gęstych scenach i okluzjach nakład wynosi około 11-12 minut na klatkę, do czego dochodzą reanotacja po kontroli jakości oraz niezależna anotacja próby co najmniej 10% klatek do pomiaru zgodności (współczynnik Cohena co najmniej 0,80). Anotatorzy zgłaszają przypadki niejednoznaczne, które są materiałem do walidacji taksonomii w zadaniu Z3. Ich praca jest bezpośrednim udziałem w badaniach, ponieważ wytwarza zbiór referencyjny i dane do pomiaru zgodności, a nie samą obróbkę techniczną. Zakres stanowiska ma wyłącznie charakter badawczo-rozwojowy i nie obejmuje czynności zarządczych, kierowniczych, koordynacyjnych, administracyjnych ani nadzorczych.</w:t>
+            </w:r>
+          </w:p>
+        </w:tc>
+        <w:tc>
+          <w:tcPr>
+            <w:tcW w:type="dxa" w:w="5900"/>
             <w:tcBorders>
               <w:top w:val="single" w:color="999999" w:sz="4"/>
               <w:left w:val="single" w:color="999999" w:sz="4"/>
@@ -1382,7 +1382,7 @@
         </w:trPr>
         <w:tc>
           <w:tcPr>
-            <w:tcW w:type="dxa" w:w="900"/>
+            <w:tcW w:type="dxa" w:w="800"/>
             <w:tcBorders>
               <w:top w:val="single" w:color="999999" w:sz="4"/>
               <w:left w:val="single" w:color="999999" w:sz="4"/>
@@ -1411,7 +1411,7 @@
         </w:tc>
         <w:tc>
           <w:tcPr>
-            <w:tcW w:type="dxa" w:w="2600"/>
+            <w:tcW w:type="dxa" w:w="1700"/>
             <w:tcBorders>
               <w:top w:val="single" w:color="999999" w:sz="4"/>
               <w:left w:val="single" w:color="999999" w:sz="4"/>
@@ -1440,7 +1440,7 @@
         </w:tc>
         <w:tc>
           <w:tcPr>
-            <w:tcW w:type="dxa" w:w="1700"/>
+            <w:tcW w:type="dxa" w:w="1400"/>
             <w:tcBorders>
               <w:top w:val="single" w:color="999999" w:sz="4"/>
               <w:left w:val="single" w:color="999999" w:sz="4"/>
@@ -1469,36 +1469,36 @@
         </w:tc>
         <w:tc>
           <w:tcPr>
-            <w:tcW w:type="dxa" w:w="1500"/>
-            <w:tcBorders>
-              <w:top w:val="single" w:color="999999" w:sz="4"/>
-              <w:left w:val="single" w:color="999999" w:sz="4"/>
-              <w:bottom w:val="single" w:color="999999" w:sz="4"/>
-              <w:right w:val="single" w:color="999999" w:sz="4"/>
-            </w:tcBorders>
-            <w:tcMar>
-              <w:top w:type="dxa" w:w="60"/>
-              <w:left w:type="dxa" w:w="80"/>
-              <w:bottom w:type="dxa" w:w="60"/>
-              <w:right w:type="dxa" w:w="80"/>
-            </w:tcMar>
-          </w:tcPr>
-          <w:p>
-            <w:r>
-              <w:rPr>
-                <w:rFonts w:ascii="Arial" w:cs="Arial" w:eastAsia="Arial" w:hAnsi="Arial"/>
-                <w:b w:val="false"/>
-                <w:bCs w:val="false"/>
-                <w:sz w:val="16"/>
-                <w:szCs w:val="16"/>
-              </w:rPr>
-              <w:t xml:space="preserve"/>
-            </w:r>
-          </w:p>
-        </w:tc>
-        <w:tc>
-          <w:tcPr>
-            <w:tcW w:type="dxa" w:w="7000"/>
+            <w:tcW w:type="dxa" w:w="5900"/>
+            <w:tcBorders>
+              <w:top w:val="single" w:color="999999" w:sz="4"/>
+              <w:left w:val="single" w:color="999999" w:sz="4"/>
+              <w:bottom w:val="single" w:color="999999" w:sz="4"/>
+              <w:right w:val="single" w:color="999999" w:sz="4"/>
+            </w:tcBorders>
+            <w:tcMar>
+              <w:top w:type="dxa" w:w="60"/>
+              <w:left w:type="dxa" w:w="80"/>
+              <w:bottom w:type="dxa" w:w="60"/>
+              <w:right w:type="dxa" w:w="80"/>
+            </w:tcMar>
+          </w:tcPr>
+          <w:p>
+            <w:r>
+              <w:rPr>
+                <w:rFonts w:ascii="Arial" w:cs="Arial" w:eastAsia="Arial" w:hAnsi="Arial"/>
+                <w:b w:val="false"/>
+                <w:bCs w:val="false"/>
+                <w:sz w:val="16"/>
+                <w:szCs w:val="16"/>
+              </w:rPr>
+              <w:t xml:space="preserve">AI Lead zaprojektuje architekturę pipeline'u generacji dokumentów PoL i PoC: przepływ danych od modeli AI do generatora, logikę fuzji źródeł (model 3D z zadania Z5, raport CV z zadania Z8, historia sygnałów MEMS, raport ML z zadania Z4) oraz format wyjściowy z podpisem kryptograficznym. Zoptymalizuje czas generowania PoC do 30 s: sprofiluje poszczególne etapy, wskaże wąskie gardła i wdroży przetwarzanie przyrostowe. Niepewność dotyczy utrzymania 30 s przy jednoczesnej fuzji wielu różnych źródeł. Zakres stanowiska ma wyłącznie charakter badawczo-rozwojowy i nie obejmuje czynności zarządczych, kierowniczych, koordynacyjnych, administracyjnych ani nadzorczych.</w:t>
+            </w:r>
+          </w:p>
+        </w:tc>
+        <w:tc>
+          <w:tcPr>
+            <w:tcW w:type="dxa" w:w="5900"/>
             <w:tcBorders>
               <w:top w:val="single" w:color="999999" w:sz="4"/>
               <w:left w:val="single" w:color="999999" w:sz="4"/>
@@ -1532,7 +1532,7 @@
         </w:trPr>
         <w:tc>
           <w:tcPr>
-            <w:tcW w:type="dxa" w:w="900"/>
+            <w:tcW w:type="dxa" w:w="800"/>
             <w:tcBorders>
               <w:top w:val="single" w:color="999999" w:sz="4"/>
               <w:left w:val="single" w:color="999999" w:sz="4"/>
@@ -1561,7 +1561,7 @@
         </w:tc>
         <w:tc>
           <w:tcPr>
-            <w:tcW w:type="dxa" w:w="2600"/>
+            <w:tcW w:type="dxa" w:w="1700"/>
             <w:tcBorders>
               <w:top w:val="single" w:color="999999" w:sz="4"/>
               <w:left w:val="single" w:color="999999" w:sz="4"/>
@@ -1590,7 +1590,7 @@
         </w:tc>
         <w:tc>
           <w:tcPr>
-            <w:tcW w:type="dxa" w:w="1700"/>
+            <w:tcW w:type="dxa" w:w="1400"/>
             <w:tcBorders>
               <w:top w:val="single" w:color="999999" w:sz="4"/>
               <w:left w:val="single" w:color="999999" w:sz="4"/>
@@ -1619,36 +1619,36 @@
         </w:tc>
         <w:tc>
           <w:tcPr>
-            <w:tcW w:type="dxa" w:w="1500"/>
-            <w:tcBorders>
-              <w:top w:val="single" w:color="999999" w:sz="4"/>
-              <w:left w:val="single" w:color="999999" w:sz="4"/>
-              <w:bottom w:val="single" w:color="999999" w:sz="4"/>
-              <w:right w:val="single" w:color="999999" w:sz="4"/>
-            </w:tcBorders>
-            <w:tcMar>
-              <w:top w:type="dxa" w:w="60"/>
-              <w:left w:type="dxa" w:w="80"/>
-              <w:bottom w:type="dxa" w:w="60"/>
-              <w:right w:type="dxa" w:w="80"/>
-            </w:tcMar>
-          </w:tcPr>
-          <w:p>
-            <w:r>
-              <w:rPr>
-                <w:rFonts w:ascii="Arial" w:cs="Arial" w:eastAsia="Arial" w:hAnsi="Arial"/>
-                <w:b w:val="false"/>
-                <w:bCs w:val="false"/>
-                <w:sz w:val="16"/>
-                <w:szCs w:val="16"/>
-              </w:rPr>
-              <w:t xml:space="preserve"/>
-            </w:r>
-          </w:p>
-        </w:tc>
-        <w:tc>
-          <w:tcPr>
-            <w:tcW w:type="dxa" w:w="7000"/>
+            <w:tcW w:type="dxa" w:w="5900"/>
+            <w:tcBorders>
+              <w:top w:val="single" w:color="999999" w:sz="4"/>
+              <w:left w:val="single" w:color="999999" w:sz="4"/>
+              <w:bottom w:val="single" w:color="999999" w:sz="4"/>
+              <w:right w:val="single" w:color="999999" w:sz="4"/>
+            </w:tcBorders>
+            <w:tcMar>
+              <w:top w:type="dxa" w:w="60"/>
+              <w:left w:type="dxa" w:w="80"/>
+              <w:bottom w:type="dxa" w:w="60"/>
+              <w:right w:type="dxa" w:w="80"/>
+            </w:tcMar>
+          </w:tcPr>
+          <w:p>
+            <w:r>
+              <w:rPr>
+                <w:rFonts w:ascii="Arial" w:cs="Arial" w:eastAsia="Arial" w:hAnsi="Arial"/>
+                <w:b w:val="false"/>
+                <w:bCs w:val="false"/>
+                <w:sz w:val="16"/>
+                <w:szCs w:val="16"/>
+              </w:rPr>
+              <w:t xml:space="preserve">AI Senior Engineer zaimplementuje integrację modułu change detection z zadania Z8 w pipeline PoC: porównanie stanu 3D przy załadunku i rozładunku, mapę anomalii z prawdopodobieństwem uszkodzenia dla każdej pozycji ładunkowej oraz wizualizację 3D. Zaimplementuje generator raportu klasyfikatora ML: oś czasu narażenia, podsumowanie dla każdej klasy i wyjaśnienia SHAP (5 najważniejszych cech dla zdarzenia). Zakres stanowiska ma wyłącznie charakter badawczo-rozwojowy i nie obejmuje czynności zarządczych, kierowniczych, koordynacyjnych, administracyjnych ani nadzorczych.</w:t>
+            </w:r>
+          </w:p>
+        </w:tc>
+        <w:tc>
+          <w:tcPr>
+            <w:tcW w:type="dxa" w:w="5900"/>
             <w:tcBorders>
               <w:top w:val="single" w:color="999999" w:sz="4"/>
               <w:left w:val="single" w:color="999999" w:sz="4"/>
@@ -1682,7 +1682,7 @@
         </w:trPr>
         <w:tc>
           <w:tcPr>
-            <w:tcW w:type="dxa" w:w="900"/>
+            <w:tcW w:type="dxa" w:w="800"/>
             <w:tcBorders>
               <w:top w:val="single" w:color="999999" w:sz="4"/>
               <w:left w:val="single" w:color="999999" w:sz="4"/>
@@ -1711,7 +1711,7 @@
         </w:tc>
         <w:tc>
           <w:tcPr>
-            <w:tcW w:type="dxa" w:w="2600"/>
+            <w:tcW w:type="dxa" w:w="1700"/>
             <w:tcBorders>
               <w:top w:val="single" w:color="999999" w:sz="4"/>
               <w:left w:val="single" w:color="999999" w:sz="4"/>
@@ -1740,7 +1740,7 @@
         </w:tc>
         <w:tc>
           <w:tcPr>
-            <w:tcW w:type="dxa" w:w="1700"/>
+            <w:tcW w:type="dxa" w:w="1400"/>
             <w:tcBorders>
               <w:top w:val="single" w:color="999999" w:sz="4"/>
               <w:left w:val="single" w:color="999999" w:sz="4"/>
@@ -1769,36 +1769,36 @@
         </w:tc>
         <w:tc>
           <w:tcPr>
-            <w:tcW w:type="dxa" w:w="1500"/>
-            <w:tcBorders>
-              <w:top w:val="single" w:color="999999" w:sz="4"/>
-              <w:left w:val="single" w:color="999999" w:sz="4"/>
-              <w:bottom w:val="single" w:color="999999" w:sz="4"/>
-              <w:right w:val="single" w:color="999999" w:sz="4"/>
-            </w:tcBorders>
-            <w:tcMar>
-              <w:top w:type="dxa" w:w="60"/>
-              <w:left w:type="dxa" w:w="80"/>
-              <w:bottom w:type="dxa" w:w="60"/>
-              <w:right w:type="dxa" w:w="80"/>
-            </w:tcMar>
-          </w:tcPr>
-          <w:p>
-            <w:r>
-              <w:rPr>
-                <w:rFonts w:ascii="Arial" w:cs="Arial" w:eastAsia="Arial" w:hAnsi="Arial"/>
-                <w:b w:val="false"/>
-                <w:bCs w:val="false"/>
-                <w:sz w:val="16"/>
-                <w:szCs w:val="16"/>
-              </w:rPr>
-              <w:t xml:space="preserve"/>
-            </w:r>
-          </w:p>
-        </w:tc>
-        <w:tc>
-          <w:tcPr>
-            <w:tcW w:type="dxa" w:w="7000"/>
+            <w:tcW w:type="dxa" w:w="5900"/>
+            <w:tcBorders>
+              <w:top w:val="single" w:color="999999" w:sz="4"/>
+              <w:left w:val="single" w:color="999999" w:sz="4"/>
+              <w:bottom w:val="single" w:color="999999" w:sz="4"/>
+              <w:right w:val="single" w:color="999999" w:sz="4"/>
+            </w:tcBorders>
+            <w:tcMar>
+              <w:top w:type="dxa" w:w="60"/>
+              <w:left w:type="dxa" w:w="80"/>
+              <w:bottom w:type="dxa" w:w="60"/>
+              <w:right w:type="dxa" w:w="80"/>
+            </w:tcMar>
+          </w:tcPr>
+          <w:p>
+            <w:r>
+              <w:rPr>
+                <w:rFonts w:ascii="Arial" w:cs="Arial" w:eastAsia="Arial" w:hAnsi="Arial"/>
+                <w:b w:val="false"/>
+                <w:bCs w:val="false"/>
+                <w:sz w:val="16"/>
+                <w:szCs w:val="16"/>
+              </w:rPr>
+              <w:t xml:space="preserve">Specjalista ds. cyberbezpieczeństwa zaimplementuje podpis kryptograficzny dokumentów PoL i PoC ze znacznikiem czasu oraz łańcuch integralności danych od sensora do dokumentu, a następnie zbada jego odporność na utratę łączności. Prace są częścią niepewności technicznej zadania, czyli zachowania wartości dowodowej dokumentu. Polityka ochrony danych i dokumentacja zgodności z AI Act są czynnościami przedwdrożeniowymi i nie są objęte kosztem. Zakres stanowiska ma wyłącznie charakter badawczo-rozwojowy i nie obejmuje czynności zarządczych, kierowniczych, koordynacyjnych, administracyjnych ani nadzorczych.</w:t>
+            </w:r>
+          </w:p>
+        </w:tc>
+        <w:tc>
+          <w:tcPr>
+            <w:tcW w:type="dxa" w:w="5900"/>
             <w:tcBorders>
               <w:top w:val="single" w:color="999999" w:sz="4"/>
               <w:left w:val="single" w:color="999999" w:sz="4"/>
@@ -1832,7 +1832,7 @@
         </w:trPr>
         <w:tc>
           <w:tcPr>
-            <w:tcW w:type="dxa" w:w="900"/>
+            <w:tcW w:type="dxa" w:w="800"/>
             <w:tcBorders>
               <w:top w:val="single" w:color="999999" w:sz="4"/>
               <w:left w:val="single" w:color="999999" w:sz="4"/>
@@ -1861,7 +1861,7 @@
         </w:tc>
         <w:tc>
           <w:tcPr>
-            <w:tcW w:type="dxa" w:w="2600"/>
+            <w:tcW w:type="dxa" w:w="1700"/>
             <w:tcBorders>
               <w:top w:val="single" w:color="999999" w:sz="4"/>
               <w:left w:val="single" w:color="999999" w:sz="4"/>
@@ -1890,7 +1890,7 @@
         </w:tc>
         <w:tc>
           <w:tcPr>
-            <w:tcW w:type="dxa" w:w="1700"/>
+            <w:tcW w:type="dxa" w:w="1400"/>
             <w:tcBorders>
               <w:top w:val="single" w:color="999999" w:sz="4"/>
               <w:left w:val="single" w:color="999999" w:sz="4"/>
@@ -1919,36 +1919,36 @@
         </w:tc>
         <w:tc>
           <w:tcPr>
-            <w:tcW w:type="dxa" w:w="1500"/>
-            <w:tcBorders>
-              <w:top w:val="single" w:color="999999" w:sz="4"/>
-              <w:left w:val="single" w:color="999999" w:sz="4"/>
-              <w:bottom w:val="single" w:color="999999" w:sz="4"/>
-              <w:right w:val="single" w:color="999999" w:sz="4"/>
-            </w:tcBorders>
-            <w:tcMar>
-              <w:top w:type="dxa" w:w="60"/>
-              <w:left w:type="dxa" w:w="80"/>
-              <w:bottom w:type="dxa" w:w="60"/>
-              <w:right w:type="dxa" w:w="80"/>
-            </w:tcMar>
-          </w:tcPr>
-          <w:p>
-            <w:r>
-              <w:rPr>
-                <w:rFonts w:ascii="Arial" w:cs="Arial" w:eastAsia="Arial" w:hAnsi="Arial"/>
-                <w:b w:val="false"/>
-                <w:bCs w:val="false"/>
-                <w:sz w:val="16"/>
-                <w:szCs w:val="16"/>
-              </w:rPr>
-              <w:t xml:space="preserve"/>
-            </w:r>
-          </w:p>
-        </w:tc>
-        <w:tc>
-          <w:tcPr>
-            <w:tcW w:type="dxa" w:w="7000"/>
+            <w:tcW w:type="dxa" w:w="5900"/>
+            <w:tcBorders>
+              <w:top w:val="single" w:color="999999" w:sz="4"/>
+              <w:left w:val="single" w:color="999999" w:sz="4"/>
+              <w:bottom w:val="single" w:color="999999" w:sz="4"/>
+              <w:right w:val="single" w:color="999999" w:sz="4"/>
+            </w:tcBorders>
+            <w:tcMar>
+              <w:top w:type="dxa" w:w="60"/>
+              <w:left w:type="dxa" w:w="80"/>
+              <w:bottom w:type="dxa" w:w="60"/>
+              <w:right w:type="dxa" w:w="80"/>
+            </w:tcMar>
+          </w:tcPr>
+          <w:p>
+            <w:r>
+              <w:rPr>
+                <w:rFonts w:ascii="Arial" w:cs="Arial" w:eastAsia="Arial" w:hAnsi="Arial"/>
+                <w:b w:val="false"/>
+                <w:bCs w:val="false"/>
+                <w:sz w:val="16"/>
+                <w:szCs w:val="16"/>
+              </w:rPr>
+              <w:t xml:space="preserve">IT Specialist zaprojektuje kontrakty API dla Backend/Full-Stack Developera i zaimplementuje pipeline PoL i PoC oraz generator dokumentów eFTI w formacie XML i JSON według reguł przekształcania zdarzeń z sensorów w pola eFTI. Wykona walidację schematem XSD oraz dwukierunkowe API z TMS i prototypowe integracje z Trans.eu, TimoCom i e-CMR w środowisku testowym, z wykorzystaniem istniejących interfejsów Everest11. Czynności integracyjne są techniczne i pomocnicze, wykonywane wyłącznie w zakresie niezbędnym do pomiaru czasu i opóźnień oraz do sprawdzenia przyjmowania dokumentów eFTI w testach na co najmniej 50 cyklach załadunek-rozładunek (cel: mediana do 30 s, opóźnienie do 2 s). Wdrożenie produkcyjne i utrzymanie nie są objęte kosztem. Zakres stanowiska ma wyłącznie charakter badawczo-rozwojowy i nie obejmuje czynności zarządczych, kierowniczych, koordynacyjnych, administracyjnych ani nadzorczych.</w:t>
+            </w:r>
+          </w:p>
+        </w:tc>
+        <w:tc>
+          <w:tcPr>
+            <w:tcW w:type="dxa" w:w="5900"/>
             <w:tcBorders>
               <w:top w:val="single" w:color="999999" w:sz="4"/>
               <w:left w:val="single" w:color="999999" w:sz="4"/>
@@ -1982,7 +1982,7 @@
         </w:trPr>
         <w:tc>
           <w:tcPr>
-            <w:tcW w:type="dxa" w:w="900"/>
+            <w:tcW w:type="dxa" w:w="800"/>
             <w:tcBorders>
               <w:top w:val="single" w:color="999999" w:sz="4"/>
               <w:left w:val="single" w:color="999999" w:sz="4"/>
@@ -2011,7 +2011,7 @@
         </w:tc>
         <w:tc>
           <w:tcPr>
-            <w:tcW w:type="dxa" w:w="2600"/>
+            <w:tcW w:type="dxa" w:w="1700"/>
             <w:tcBorders>
               <w:top w:val="single" w:color="999999" w:sz="4"/>
               <w:left w:val="single" w:color="999999" w:sz="4"/>
@@ -2040,7 +2040,7 @@
         </w:tc>
         <w:tc>
           <w:tcPr>
-            <w:tcW w:type="dxa" w:w="1700"/>
+            <w:tcW w:type="dxa" w:w="1400"/>
             <w:tcBorders>
               <w:top w:val="single" w:color="999999" w:sz="4"/>
               <w:left w:val="single" w:color="999999" w:sz="4"/>
@@ -2069,36 +2069,36 @@
         </w:tc>
         <w:tc>
           <w:tcPr>
-            <w:tcW w:type="dxa" w:w="1500"/>
-            <w:tcBorders>
-              <w:top w:val="single" w:color="999999" w:sz="4"/>
-              <w:left w:val="single" w:color="999999" w:sz="4"/>
-              <w:bottom w:val="single" w:color="999999" w:sz="4"/>
-              <w:right w:val="single" w:color="999999" w:sz="4"/>
-            </w:tcBorders>
-            <w:tcMar>
-              <w:top w:type="dxa" w:w="60"/>
-              <w:left w:type="dxa" w:w="80"/>
-              <w:bottom w:type="dxa" w:w="60"/>
-              <w:right w:type="dxa" w:w="80"/>
-            </w:tcMar>
-          </w:tcPr>
-          <w:p>
-            <w:r>
-              <w:rPr>
-                <w:rFonts w:ascii="Arial" w:cs="Arial" w:eastAsia="Arial" w:hAnsi="Arial"/>
-                <w:b w:val="false"/>
-                <w:bCs w:val="false"/>
-                <w:sz w:val="16"/>
-                <w:szCs w:val="16"/>
-              </w:rPr>
-              <w:t xml:space="preserve"/>
-            </w:r>
-          </w:p>
-        </w:tc>
-        <w:tc>
-          <w:tcPr>
-            <w:tcW w:type="dxa" w:w="7000"/>
+            <w:tcW w:type="dxa" w:w="5900"/>
+            <w:tcBorders>
+              <w:top w:val="single" w:color="999999" w:sz="4"/>
+              <w:left w:val="single" w:color="999999" w:sz="4"/>
+              <w:bottom w:val="single" w:color="999999" w:sz="4"/>
+              <w:right w:val="single" w:color="999999" w:sz="4"/>
+            </w:tcBorders>
+            <w:tcMar>
+              <w:top w:type="dxa" w:w="60"/>
+              <w:left w:type="dxa" w:w="80"/>
+              <w:bottom w:type="dxa" w:w="60"/>
+              <w:right w:type="dxa" w:w="80"/>
+            </w:tcMar>
+          </w:tcPr>
+          <w:p>
+            <w:r>
+              <w:rPr>
+                <w:rFonts w:ascii="Arial" w:cs="Arial" w:eastAsia="Arial" w:hAnsi="Arial"/>
+                <w:b w:val="false"/>
+                <w:bCs w:val="false"/>
+                <w:sz w:val="16"/>
+                <w:szCs w:val="16"/>
+              </w:rPr>
+              <w:t xml:space="preserve">IoT Specialist zintegruje sygnał czujnika drzwi jako wyzwalacz generowania PoL i PoC, zsynchronizuje znaczniki czasu GPS z zegarem systemu embedded oraz zaimplementuje moduł agregacji historii sygnałów środowiskowych z trasy (profil drgań, temperatura, wilgotność) w formacie przekazywanym do pipeline'u. Prace są warunkiem poprawnej fuzji danych i wiarygodności znacznika czasu dokumentu. Zakres stanowiska ma wyłącznie charakter badawczo-rozwojowy i nie obejmuje czynności zarządczych, kierowniczych, koordynacyjnych, administracyjnych ani nadzorczych.</w:t>
+            </w:r>
+          </w:p>
+        </w:tc>
+        <w:tc>
+          <w:tcPr>
+            <w:tcW w:type="dxa" w:w="5900"/>
             <w:tcBorders>
               <w:top w:val="single" w:color="999999" w:sz="4"/>
               <w:left w:val="single" w:color="999999" w:sz="4"/>
@@ -2132,7 +2132,7 @@
         </w:trPr>
         <w:tc>
           <w:tcPr>
-            <w:tcW w:type="dxa" w:w="900"/>
+            <w:tcW w:type="dxa" w:w="800"/>
             <w:tcBorders>
               <w:top w:val="single" w:color="999999" w:sz="4"/>
               <w:left w:val="single" w:color="999999" w:sz="4"/>
@@ -2161,7 +2161,7 @@
         </w:tc>
         <w:tc>
           <w:tcPr>
-            <w:tcW w:type="dxa" w:w="2600"/>
+            <w:tcW w:type="dxa" w:w="1700"/>
             <w:tcBorders>
               <w:top w:val="single" w:color="999999" w:sz="4"/>
               <w:left w:val="single" w:color="999999" w:sz="4"/>
@@ -2190,7 +2190,7 @@
         </w:tc>
         <w:tc>
           <w:tcPr>
-            <w:tcW w:type="dxa" w:w="1700"/>
+            <w:tcW w:type="dxa" w:w="1400"/>
             <w:tcBorders>
               <w:top w:val="single" w:color="999999" w:sz="4"/>
               <w:left w:val="single" w:color="999999" w:sz="4"/>
@@ -2219,36 +2219,36 @@
         </w:tc>
         <w:tc>
           <w:tcPr>
-            <w:tcW w:type="dxa" w:w="1500"/>
-            <w:tcBorders>
-              <w:top w:val="single" w:color="999999" w:sz="4"/>
-              <w:left w:val="single" w:color="999999" w:sz="4"/>
-              <w:bottom w:val="single" w:color="999999" w:sz="4"/>
-              <w:right w:val="single" w:color="999999" w:sz="4"/>
-            </w:tcBorders>
-            <w:tcMar>
-              <w:top w:type="dxa" w:w="60"/>
-              <w:left w:type="dxa" w:w="80"/>
-              <w:bottom w:type="dxa" w:w="60"/>
-              <w:right w:type="dxa" w:w="80"/>
-            </w:tcMar>
-          </w:tcPr>
-          <w:p>
-            <w:r>
-              <w:rPr>
-                <w:rFonts w:ascii="Arial" w:cs="Arial" w:eastAsia="Arial" w:hAnsi="Arial"/>
-                <w:b w:val="false"/>
-                <w:bCs w:val="false"/>
-                <w:sz w:val="16"/>
-                <w:szCs w:val="16"/>
-              </w:rPr>
-              <w:t xml:space="preserve"/>
-            </w:r>
-          </w:p>
-        </w:tc>
-        <w:tc>
-          <w:tcPr>
-            <w:tcW w:type="dxa" w:w="7000"/>
+            <w:tcW w:type="dxa" w:w="5900"/>
+            <w:tcBorders>
+              <w:top w:val="single" w:color="999999" w:sz="4"/>
+              <w:left w:val="single" w:color="999999" w:sz="4"/>
+              <w:bottom w:val="single" w:color="999999" w:sz="4"/>
+              <w:right w:val="single" w:color="999999" w:sz="4"/>
+            </w:tcBorders>
+            <w:tcMar>
+              <w:top w:type="dxa" w:w="60"/>
+              <w:left w:type="dxa" w:w="80"/>
+              <w:bottom w:type="dxa" w:w="60"/>
+              <w:right w:type="dxa" w:w="80"/>
+            </w:tcMar>
+          </w:tcPr>
+          <w:p>
+            <w:r>
+              <w:rPr>
+                <w:rFonts w:ascii="Arial" w:cs="Arial" w:eastAsia="Arial" w:hAnsi="Arial"/>
+                <w:b w:val="false"/>
+                <w:bCs w:val="false"/>
+                <w:sz w:val="16"/>
+                <w:szCs w:val="16"/>
+              </w:rPr>
+              <w:t xml:space="preserve">Specjalista ds. logistyki TSL zinterpretuje operacyjnie pola eFTI przy opracowywaniu reguł przekształcania zdarzeń. Oceni treść PoL i PoC pod kątem przydatności w obronie reklamacji, zgodności z wymaganiami ubezpieczyciela i czytelności. Przetestuje pipeline na scenariuszach załadunku mieszanego, ADR i LTL oraz wskaże przypadki brzegowe, które posłużą do dostrajania pipeline'u. Zakres stanowiska ma wyłącznie charakter badawczo-rozwojowy i nie obejmuje czynności zarządczych, kierowniczych, koordynacyjnych, administracyjnych ani nadzorczych.</w:t>
+            </w:r>
+          </w:p>
+        </w:tc>
+        <w:tc>
+          <w:tcPr>
+            <w:tcW w:type="dxa" w:w="5900"/>
             <w:tcBorders>
               <w:top w:val="single" w:color="999999" w:sz="4"/>
               <w:left w:val="single" w:color="999999" w:sz="4"/>
@@ -2282,7 +2282,7 @@
         </w:trPr>
         <w:tc>
           <w:tcPr>
-            <w:tcW w:type="dxa" w:w="900"/>
+            <w:tcW w:type="dxa" w:w="800"/>
             <w:tcBorders>
               <w:top w:val="single" w:color="999999" w:sz="4"/>
               <w:left w:val="single" w:color="999999" w:sz="4"/>
@@ -2311,7 +2311,7 @@
         </w:tc>
         <w:tc>
           <w:tcPr>
-            <w:tcW w:type="dxa" w:w="2600"/>
+            <w:tcW w:type="dxa" w:w="1700"/>
             <w:tcBorders>
               <w:top w:val="single" w:color="999999" w:sz="4"/>
               <w:left w:val="single" w:color="999999" w:sz="4"/>
@@ -2340,7 +2340,7 @@
         </w:tc>
         <w:tc>
           <w:tcPr>
-            <w:tcW w:type="dxa" w:w="1700"/>
+            <w:tcW w:type="dxa" w:w="1400"/>
             <w:tcBorders>
               <w:top w:val="single" w:color="999999" w:sz="4"/>
               <w:left w:val="single" w:color="999999" w:sz="4"/>
@@ -2369,36 +2369,36 @@
         </w:tc>
         <w:tc>
           <w:tcPr>
-            <w:tcW w:type="dxa" w:w="1500"/>
-            <w:tcBorders>
-              <w:top w:val="single" w:color="999999" w:sz="4"/>
-              <w:left w:val="single" w:color="999999" w:sz="4"/>
-              <w:bottom w:val="single" w:color="999999" w:sz="4"/>
-              <w:right w:val="single" w:color="999999" w:sz="4"/>
-            </w:tcBorders>
-            <w:tcMar>
-              <w:top w:type="dxa" w:w="60"/>
-              <w:left w:type="dxa" w:w="80"/>
-              <w:bottom w:type="dxa" w:w="60"/>
-              <w:right w:type="dxa" w:w="80"/>
-            </w:tcMar>
-          </w:tcPr>
-          <w:p>
-            <w:r>
-              <w:rPr>
-                <w:rFonts w:ascii="Arial" w:cs="Arial" w:eastAsia="Arial" w:hAnsi="Arial"/>
-                <w:b w:val="false"/>
-                <w:bCs w:val="false"/>
-                <w:sz w:val="16"/>
-                <w:szCs w:val="16"/>
-              </w:rPr>
-              <w:t xml:space="preserve"/>
-            </w:r>
-          </w:p>
-        </w:tc>
-        <w:tc>
-          <w:tcPr>
-            <w:tcW w:type="dxa" w:w="7000"/>
+            <w:tcW w:type="dxa" w:w="5900"/>
+            <w:tcBorders>
+              <w:top w:val="single" w:color="999999" w:sz="4"/>
+              <w:left w:val="single" w:color="999999" w:sz="4"/>
+              <w:bottom w:val="single" w:color="999999" w:sz="4"/>
+              <w:right w:val="single" w:color="999999" w:sz="4"/>
+            </w:tcBorders>
+            <w:tcMar>
+              <w:top w:type="dxa" w:w="60"/>
+              <w:left w:type="dxa" w:w="80"/>
+              <w:bottom w:type="dxa" w:w="60"/>
+              <w:right w:type="dxa" w:w="80"/>
+            </w:tcMar>
+          </w:tcPr>
+          <w:p>
+            <w:r>
+              <w:rPr>
+                <w:rFonts w:ascii="Arial" w:cs="Arial" w:eastAsia="Arial" w:hAnsi="Arial"/>
+                <w:b w:val="false"/>
+                <w:bCs w:val="false"/>
+                <w:sz w:val="16"/>
+                <w:szCs w:val="16"/>
+              </w:rPr>
+              <w:t xml:space="preserve">Backend/Full-Stack Developer, w wymiarze 1,0 etatu przez 9 miesięcy od M19 do M27, zbuduje strumieniowy potok danych z urządzenia embedded do pipeline'u PoL i PoC, kolejkowanie i mechanizmy zachowania spójności danych przy utracie łączności oraz przepływ danych z potoku akwizycji z zadania Z2, według kontraktów API zaprojektowanych przez IT Specialist. Wykona test zgodności wygenerowanych dokumentów eFTI z implementacją referencyjną Komisji Europejskiej i wesprze integracje testowe z TMS i platformami zewnętrznymi. Ciągłość kompetencji z zadania Z2 zapewnia spójność warstwy danych między akwizycją a generacją dokumentów. Utrzymanie integracji i wdrożenie produkcyjne nie są objęte kosztem. Zakres stanowiska ma wyłącznie charakter badawczo-rozwojowy i nie obejmuje czynności zarządczych, kierowniczych, koordynacyjnych, administracyjnych ani nadzorczych.</w:t>
+            </w:r>
+          </w:p>
+        </w:tc>
+        <w:tc>
+          <w:tcPr>
+            <w:tcW w:type="dxa" w:w="5900"/>
             <w:tcBorders>
               <w:top w:val="single" w:color="999999" w:sz="4"/>
               <w:left w:val="single" w:color="999999" w:sz="4"/>
@@ -2432,7 +2432,7 @@
         </w:trPr>
         <w:tc>
           <w:tcPr>
-            <w:tcW w:type="dxa" w:w="900"/>
+            <w:tcW w:type="dxa" w:w="800"/>
             <w:tcBorders>
               <w:top w:val="single" w:color="999999" w:sz="4"/>
               <w:left w:val="single" w:color="999999" w:sz="4"/>
@@ -2461,7 +2461,7 @@
         </w:tc>
         <w:tc>
           <w:tcPr>
-            <w:tcW w:type="dxa" w:w="2600"/>
+            <w:tcW w:type="dxa" w:w="1700"/>
             <w:tcBorders>
               <w:top w:val="single" w:color="999999" w:sz="4"/>
               <w:left w:val="single" w:color="999999" w:sz="4"/>
@@ -2490,7 +2490,7 @@
         </w:tc>
         <w:tc>
           <w:tcPr>
-            <w:tcW w:type="dxa" w:w="1700"/>
+            <w:tcW w:type="dxa" w:w="1400"/>
             <w:tcBorders>
               <w:top w:val="single" w:color="999999" w:sz="4"/>
               <w:left w:val="single" w:color="999999" w:sz="4"/>
@@ -2519,36 +2519,36 @@
         </w:tc>
         <w:tc>
           <w:tcPr>
-            <w:tcW w:type="dxa" w:w="1500"/>
-            <w:tcBorders>
-              <w:top w:val="single" w:color="999999" w:sz="4"/>
-              <w:left w:val="single" w:color="999999" w:sz="4"/>
-              <w:bottom w:val="single" w:color="999999" w:sz="4"/>
-              <w:right w:val="single" w:color="999999" w:sz="4"/>
-            </w:tcBorders>
-            <w:tcMar>
-              <w:top w:type="dxa" w:w="60"/>
-              <w:left w:type="dxa" w:w="80"/>
-              <w:bottom w:type="dxa" w:w="60"/>
-              <w:right w:type="dxa" w:w="80"/>
-            </w:tcMar>
-          </w:tcPr>
-          <w:p>
-            <w:r>
-              <w:rPr>
-                <w:rFonts w:ascii="Arial" w:cs="Arial" w:eastAsia="Arial" w:hAnsi="Arial"/>
-                <w:b w:val="false"/>
-                <w:bCs w:val="false"/>
-                <w:sz w:val="16"/>
-                <w:szCs w:val="16"/>
-              </w:rPr>
-              <w:t xml:space="preserve"/>
-            </w:r>
-          </w:p>
-        </w:tc>
-        <w:tc>
-          <w:tcPr>
-            <w:tcW w:type="dxa" w:w="7000"/>
+            <w:tcW w:type="dxa" w:w="5900"/>
+            <w:tcBorders>
+              <w:top w:val="single" w:color="999999" w:sz="4"/>
+              <w:left w:val="single" w:color="999999" w:sz="4"/>
+              <w:bottom w:val="single" w:color="999999" w:sz="4"/>
+              <w:right w:val="single" w:color="999999" w:sz="4"/>
+            </w:tcBorders>
+            <w:tcMar>
+              <w:top w:type="dxa" w:w="60"/>
+              <w:left w:type="dxa" w:w="80"/>
+              <w:bottom w:type="dxa" w:w="60"/>
+              <w:right w:type="dxa" w:w="80"/>
+            </w:tcMar>
+          </w:tcPr>
+          <w:p>
+            <w:r>
+              <w:rPr>
+                <w:rFonts w:ascii="Arial" w:cs="Arial" w:eastAsia="Arial" w:hAnsi="Arial"/>
+                <w:b w:val="false"/>
+                <w:bCs w:val="false"/>
+                <w:sz w:val="16"/>
+                <w:szCs w:val="16"/>
+              </w:rPr>
+              <w:t xml:space="preserve">AI Lead wyznaczy strategię kompresji dla każdego modelu (INT8, trening z uwzględnieniem kwantyzacji, mieszana precyzja warstw) i budżet degradacji dokładności nie większy niż 3 punkty procentowe. Zaprojektuje wieloetapowy proces kompresji w kolejności: kwantyzacja, przycinanie, destylacja, z pomiarami po każdym etapie. Zwaliduje dokładność modeli skompresowanych na zbiorach testowych z zadań Z4 i Z8, porównując FP32 i INT8 dla AUC-ROC i mAP, oraz zintegruje modele PRz w wersjach release candidate. Prace mają rozstrzygnąć niepewność, czy opóźnienie alertu do 1 s da się pogodzić z degradacją do 3 punktów procentowych na docelowej platformie. Zakres stanowiska ma wyłącznie charakter badawczo-rozwojowy i nie obejmuje czynności zarządczych, kierowniczych, koordynacyjnych, administracyjnych ani nadzorczych.</w:t>
+            </w:r>
+          </w:p>
+        </w:tc>
+        <w:tc>
+          <w:tcPr>
+            <w:tcW w:type="dxa" w:w="5900"/>
             <w:tcBorders>
               <w:top w:val="single" w:color="999999" w:sz="4"/>
               <w:left w:val="single" w:color="999999" w:sz="4"/>
@@ -2582,7 +2582,7 @@
         </w:trPr>
         <w:tc>
           <w:tcPr>
-            <w:tcW w:type="dxa" w:w="900"/>
+            <w:tcW w:type="dxa" w:w="800"/>
             <w:tcBorders>
               <w:top w:val="single" w:color="999999" w:sz="4"/>
               <w:left w:val="single" w:color="999999" w:sz="4"/>
@@ -2611,7 +2611,7 @@
         </w:tc>
         <w:tc>
           <w:tcPr>
-            <w:tcW w:type="dxa" w:w="2600"/>
+            <w:tcW w:type="dxa" w:w="1700"/>
             <w:tcBorders>
               <w:top w:val="single" w:color="999999" w:sz="4"/>
               <w:left w:val="single" w:color="999999" w:sz="4"/>
@@ -2640,7 +2640,7 @@
         </w:tc>
         <w:tc>
           <w:tcPr>
-            <w:tcW w:type="dxa" w:w="1700"/>
+            <w:tcW w:type="dxa" w:w="1400"/>
             <w:tcBorders>
               <w:top w:val="single" w:color="999999" w:sz="4"/>
               <w:left w:val="single" w:color="999999" w:sz="4"/>
@@ -2669,36 +2669,36 @@
         </w:tc>
         <w:tc>
           <w:tcPr>
-            <w:tcW w:type="dxa" w:w="1500"/>
-            <w:tcBorders>
-              <w:top w:val="single" w:color="999999" w:sz="4"/>
-              <w:left w:val="single" w:color="999999" w:sz="4"/>
-              <w:bottom w:val="single" w:color="999999" w:sz="4"/>
-              <w:right w:val="single" w:color="999999" w:sz="4"/>
-            </w:tcBorders>
-            <w:tcMar>
-              <w:top w:type="dxa" w:w="60"/>
-              <w:left w:type="dxa" w:w="80"/>
-              <w:bottom w:type="dxa" w:w="60"/>
-              <w:right w:type="dxa" w:w="80"/>
-            </w:tcMar>
-          </w:tcPr>
-          <w:p>
-            <w:r>
-              <w:rPr>
-                <w:rFonts w:ascii="Arial" w:cs="Arial" w:eastAsia="Arial" w:hAnsi="Arial"/>
-                <w:b w:val="false"/>
-                <w:bCs w:val="false"/>
-                <w:sz w:val="16"/>
-                <w:szCs w:val="16"/>
-              </w:rPr>
-              <w:t xml:space="preserve"/>
-            </w:r>
-          </w:p>
-        </w:tc>
-        <w:tc>
-          <w:tcPr>
-            <w:tcW w:type="dxa" w:w="7000"/>
+            <w:tcW w:type="dxa" w:w="5900"/>
+            <w:tcBorders>
+              <w:top w:val="single" w:color="999999" w:sz="4"/>
+              <w:left w:val="single" w:color="999999" w:sz="4"/>
+              <w:bottom w:val="single" w:color="999999" w:sz="4"/>
+              <w:right w:val="single" w:color="999999" w:sz="4"/>
+            </w:tcBorders>
+            <w:tcMar>
+              <w:top w:type="dxa" w:w="60"/>
+              <w:left w:type="dxa" w:w="80"/>
+              <w:bottom w:type="dxa" w:w="60"/>
+              <w:right w:type="dxa" w:w="80"/>
+            </w:tcMar>
+          </w:tcPr>
+          <w:p>
+            <w:r>
+              <w:rPr>
+                <w:rFonts w:ascii="Arial" w:cs="Arial" w:eastAsia="Arial" w:hAnsi="Arial"/>
+                <w:b w:val="false"/>
+                <w:bCs w:val="false"/>
+                <w:sz w:val="16"/>
+                <w:szCs w:val="16"/>
+              </w:rPr>
+              <w:t xml:space="preserve">AI Senior Engineer zaimplementuje kompresję modeli: kwantyzację INT8 z profilowaniem warstw, trening z uwzględnieniem kwantyzacji dla modeli CV wrażliwych na kwantyzację, przycinanie strukturalne według macierzy informacji Fishera oraz destylację wiedzy z projektem sieci typu student pod platformę embedded. Zaimplementuje potok inferencji brzegowej (modele 3D z zadania Z5, CV z zadania Z8, ML ryzyka z zadania Z4) i zoptymalizuje opóźnienie przez profilowanie modułów, batching i TensorRT. Zmierzy opóźnienie (mediana, percentyl 95) na co najmniej 1000 przebiegach. Zakres stanowiska ma wyłącznie charakter badawczo-rozwojowy i nie obejmuje czynności zarządczych, kierowniczych, koordynacyjnych, administracyjnych ani nadzorczych.</w:t>
+            </w:r>
+          </w:p>
+        </w:tc>
+        <w:tc>
+          <w:tcPr>
+            <w:tcW w:type="dxa" w:w="5900"/>
             <w:tcBorders>
               <w:top w:val="single" w:color="999999" w:sz="4"/>
               <w:left w:val="single" w:color="999999" w:sz="4"/>
@@ -2732,7 +2732,7 @@
         </w:trPr>
         <w:tc>
           <w:tcPr>
-            <w:tcW w:type="dxa" w:w="900"/>
+            <w:tcW w:type="dxa" w:w="800"/>
             <w:tcBorders>
               <w:top w:val="single" w:color="999999" w:sz="4"/>
               <w:left w:val="single" w:color="999999" w:sz="4"/>
@@ -2761,7 +2761,7 @@
         </w:tc>
         <w:tc>
           <w:tcPr>
-            <w:tcW w:type="dxa" w:w="2600"/>
+            <w:tcW w:type="dxa" w:w="1700"/>
             <w:tcBorders>
               <w:top w:val="single" w:color="999999" w:sz="4"/>
               <w:left w:val="single" w:color="999999" w:sz="4"/>
@@ -2790,7 +2790,7 @@
         </w:tc>
         <w:tc>
           <w:tcPr>
-            <w:tcW w:type="dxa" w:w="1700"/>
+            <w:tcW w:type="dxa" w:w="1400"/>
             <w:tcBorders>
               <w:top w:val="single" w:color="999999" w:sz="4"/>
               <w:left w:val="single" w:color="999999" w:sz="4"/>
@@ -2819,36 +2819,36 @@
         </w:tc>
         <w:tc>
           <w:tcPr>
-            <w:tcW w:type="dxa" w:w="1500"/>
-            <w:tcBorders>
-              <w:top w:val="single" w:color="999999" w:sz="4"/>
-              <w:left w:val="single" w:color="999999" w:sz="4"/>
-              <w:bottom w:val="single" w:color="999999" w:sz="4"/>
-              <w:right w:val="single" w:color="999999" w:sz="4"/>
-            </w:tcBorders>
-            <w:tcMar>
-              <w:top w:type="dxa" w:w="60"/>
-              <w:left w:type="dxa" w:w="80"/>
-              <w:bottom w:type="dxa" w:w="60"/>
-              <w:right w:type="dxa" w:w="80"/>
-            </w:tcMar>
-          </w:tcPr>
-          <w:p>
-            <w:r>
-              <w:rPr>
-                <w:rFonts w:ascii="Arial" w:cs="Arial" w:eastAsia="Arial" w:hAnsi="Arial"/>
-                <w:b w:val="false"/>
-                <w:bCs w:val="false"/>
-                <w:sz w:val="16"/>
-                <w:szCs w:val="16"/>
-              </w:rPr>
-              <w:t xml:space="preserve"/>
-            </w:r>
-          </w:p>
-        </w:tc>
-        <w:tc>
-          <w:tcPr>
-            <w:tcW w:type="dxa" w:w="7000"/>
+            <w:tcW w:type="dxa" w:w="5900"/>
+            <w:tcBorders>
+              <w:top w:val="single" w:color="999999" w:sz="4"/>
+              <w:left w:val="single" w:color="999999" w:sz="4"/>
+              <w:bottom w:val="single" w:color="999999" w:sz="4"/>
+              <w:right w:val="single" w:color="999999" w:sz="4"/>
+            </w:tcBorders>
+            <w:tcMar>
+              <w:top w:type="dxa" w:w="60"/>
+              <w:left w:type="dxa" w:w="80"/>
+              <w:bottom w:type="dxa" w:w="60"/>
+              <w:right w:type="dxa" w:w="80"/>
+            </w:tcMar>
+          </w:tcPr>
+          <w:p>
+            <w:r>
+              <w:rPr>
+                <w:rFonts w:ascii="Arial" w:cs="Arial" w:eastAsia="Arial" w:hAnsi="Arial"/>
+                <w:b w:val="false"/>
+                <w:bCs w:val="false"/>
+                <w:sz w:val="16"/>
+                <w:szCs w:val="16"/>
+              </w:rPr>
+              <w:t xml:space="preserve">Specjalista ds. cyberbezpieczeństwa zaprojektuje i zaimplementuje bezpieczny rozruch (ochrona firmware), szyfrowanie danych w buforze lokalnym, podpisywanie aktualizacji OTA oraz szyfrowanie transmisji z urządzenia do TMS. Zabezpieczenia są częścią architektury systemu embedded, ponieważ system pracuje bez nadzoru w pojeździe i musi zachować integralność danych dowodowych. Karta transparentności, ocena ryzyka systemu AI i inne czynności z zakresu zgodności z AI Act mają charakter przedwdrożeniowy i nie są objęte kosztem. Zakres stanowiska ma wyłącznie charakter badawczo-rozwojowy i nie obejmuje czynności zarządczych, kierowniczych, koordynacyjnych, administracyjnych ani nadzorczych.</w:t>
+            </w:r>
+          </w:p>
+        </w:tc>
+        <w:tc>
+          <w:tcPr>
+            <w:tcW w:type="dxa" w:w="5900"/>
             <w:tcBorders>
               <w:top w:val="single" w:color="999999" w:sz="4"/>
               <w:left w:val="single" w:color="999999" w:sz="4"/>
@@ -2882,7 +2882,7 @@
         </w:trPr>
         <w:tc>
           <w:tcPr>
-            <w:tcW w:type="dxa" w:w="900"/>
+            <w:tcW w:type="dxa" w:w="800"/>
             <w:tcBorders>
               <w:top w:val="single" w:color="999999" w:sz="4"/>
               <w:left w:val="single" w:color="999999" w:sz="4"/>
@@ -2911,7 +2911,7 @@
         </w:tc>
         <w:tc>
           <w:tcPr>
-            <w:tcW w:type="dxa" w:w="2600"/>
+            <w:tcW w:type="dxa" w:w="1700"/>
             <w:tcBorders>
               <w:top w:val="single" w:color="999999" w:sz="4"/>
               <w:left w:val="single" w:color="999999" w:sz="4"/>
@@ -2940,7 +2940,7 @@
         </w:tc>
         <w:tc>
           <w:tcPr>
-            <w:tcW w:type="dxa" w:w="1700"/>
+            <w:tcW w:type="dxa" w:w="1400"/>
             <w:tcBorders>
               <w:top w:val="single" w:color="999999" w:sz="4"/>
               <w:left w:val="single" w:color="999999" w:sz="4"/>
@@ -2969,36 +2969,36 @@
         </w:tc>
         <w:tc>
           <w:tcPr>
-            <w:tcW w:type="dxa" w:w="1500"/>
-            <w:tcBorders>
-              <w:top w:val="single" w:color="999999" w:sz="4"/>
-              <w:left w:val="single" w:color="999999" w:sz="4"/>
-              <w:bottom w:val="single" w:color="999999" w:sz="4"/>
-              <w:right w:val="single" w:color="999999" w:sz="4"/>
-            </w:tcBorders>
-            <w:tcMar>
-              <w:top w:type="dxa" w:w="60"/>
-              <w:left w:type="dxa" w:w="80"/>
-              <w:bottom w:type="dxa" w:w="60"/>
-              <w:right w:type="dxa" w:w="80"/>
-            </w:tcMar>
-          </w:tcPr>
-          <w:p>
-            <w:r>
-              <w:rPr>
-                <w:rFonts w:ascii="Arial" w:cs="Arial" w:eastAsia="Arial" w:hAnsi="Arial"/>
-                <w:b w:val="false"/>
-                <w:bCs w:val="false"/>
-                <w:sz w:val="16"/>
-                <w:szCs w:val="16"/>
-              </w:rPr>
-              <w:t xml:space="preserve"/>
-            </w:r>
-          </w:p>
-        </w:tc>
-        <w:tc>
-          <w:tcPr>
-            <w:tcW w:type="dxa" w:w="7000"/>
+            <w:tcW w:type="dxa" w:w="5900"/>
+            <w:tcBorders>
+              <w:top w:val="single" w:color="999999" w:sz="4"/>
+              <w:left w:val="single" w:color="999999" w:sz="4"/>
+              <w:bottom w:val="single" w:color="999999" w:sz="4"/>
+              <w:right w:val="single" w:color="999999" w:sz="4"/>
+            </w:tcBorders>
+            <w:tcMar>
+              <w:top w:type="dxa" w:w="60"/>
+              <w:left w:type="dxa" w:w="80"/>
+              <w:bottom w:type="dxa" w:w="60"/>
+              <w:right w:type="dxa" w:w="80"/>
+            </w:tcMar>
+          </w:tcPr>
+          <w:p>
+            <w:r>
+              <w:rPr>
+                <w:rFonts w:ascii="Arial" w:cs="Arial" w:eastAsia="Arial" w:hAnsi="Arial"/>
+                <w:b w:val="false"/>
+                <w:bCs w:val="false"/>
+                <w:sz w:val="16"/>
+                <w:szCs w:val="16"/>
+              </w:rPr>
+              <w:t xml:space="preserve">IT Specialist zaimplementuje oprogramowanie embedded: system czasu rzeczywistego, sterowniki sensorów, moduł buforowania danych do transmisji GSM (autonomia do 72 h), mechanizm aktualizacji OTA, generator alertu lokalnego (3 poziomy ryzyka, logika eskalacji, zapis zdarzeń w buforze) oraz moduł komunikacji z TMS (protokół transmisji, priorytetyzacja alertów względem danych historycznych, ponawianie). Prace są częścią eksperymentalnego rozwoju systemu pracującego w czasie rzeczywistym bez łączności. Zakres stanowiska ma wyłącznie charakter badawczo-rozwojowy i nie obejmuje czynności zarządczych, kierowniczych, koordynacyjnych, administracyjnych ani nadzorczych.</w:t>
+            </w:r>
+          </w:p>
+        </w:tc>
+        <w:tc>
+          <w:tcPr>
+            <w:tcW w:type="dxa" w:w="5900"/>
             <w:tcBorders>
               <w:top w:val="single" w:color="999999" w:sz="4"/>
               <w:left w:val="single" w:color="999999" w:sz="4"/>
@@ -3032,7 +3032,7 @@
         </w:trPr>
         <w:tc>
           <w:tcPr>
-            <w:tcW w:type="dxa" w:w="900"/>
+            <w:tcW w:type="dxa" w:w="800"/>
             <w:tcBorders>
               <w:top w:val="single" w:color="999999" w:sz="4"/>
               <w:left w:val="single" w:color="999999" w:sz="4"/>
@@ -3061,7 +3061,7 @@
         </w:tc>
         <w:tc>
           <w:tcPr>
-            <w:tcW w:type="dxa" w:w="2600"/>
+            <w:tcW w:type="dxa" w:w="1700"/>
             <w:tcBorders>
               <w:top w:val="single" w:color="999999" w:sz="4"/>
               <w:left w:val="single" w:color="999999" w:sz="4"/>
@@ -3090,7 +3090,7 @@
         </w:tc>
         <w:tc>
           <w:tcPr>
-            <w:tcW w:type="dxa" w:w="1700"/>
+            <w:tcW w:type="dxa" w:w="1400"/>
             <w:tcBorders>
               <w:top w:val="single" w:color="999999" w:sz="4"/>
               <w:left w:val="single" w:color="999999" w:sz="4"/>
@@ -3119,36 +3119,36 @@
         </w:tc>
         <w:tc>
           <w:tcPr>
-            <w:tcW w:type="dxa" w:w="1500"/>
-            <w:tcBorders>
-              <w:top w:val="single" w:color="999999" w:sz="4"/>
-              <w:left w:val="single" w:color="999999" w:sz="4"/>
-              <w:bottom w:val="single" w:color="999999" w:sz="4"/>
-              <w:right w:val="single" w:color="999999" w:sz="4"/>
-            </w:tcBorders>
-            <w:tcMar>
-              <w:top w:type="dxa" w:w="60"/>
-              <w:left w:type="dxa" w:w="80"/>
-              <w:bottom w:type="dxa" w:w="60"/>
-              <w:right w:type="dxa" w:w="80"/>
-            </w:tcMar>
-          </w:tcPr>
-          <w:p>
-            <w:r>
-              <w:rPr>
-                <w:rFonts w:ascii="Arial" w:cs="Arial" w:eastAsia="Arial" w:hAnsi="Arial"/>
-                <w:b w:val="false"/>
-                <w:bCs w:val="false"/>
-                <w:sz w:val="16"/>
-                <w:szCs w:val="16"/>
-              </w:rPr>
-              <w:t xml:space="preserve"/>
-            </w:r>
-          </w:p>
-        </w:tc>
-        <w:tc>
-          <w:tcPr>
-            <w:tcW w:type="dxa" w:w="7000"/>
+            <w:tcW w:type="dxa" w:w="5900"/>
+            <w:tcBorders>
+              <w:top w:val="single" w:color="999999" w:sz="4"/>
+              <w:left w:val="single" w:color="999999" w:sz="4"/>
+              <w:bottom w:val="single" w:color="999999" w:sz="4"/>
+              <w:right w:val="single" w:color="999999" w:sz="4"/>
+            </w:tcBorders>
+            <w:tcMar>
+              <w:top w:type="dxa" w:w="60"/>
+              <w:left w:type="dxa" w:w="80"/>
+              <w:bottom w:type="dxa" w:w="60"/>
+              <w:right w:type="dxa" w:w="80"/>
+            </w:tcMar>
+          </w:tcPr>
+          <w:p>
+            <w:r>
+              <w:rPr>
+                <w:rFonts w:ascii="Arial" w:cs="Arial" w:eastAsia="Arial" w:hAnsi="Arial"/>
+                <w:b w:val="false"/>
+                <w:bCs w:val="false"/>
+                <w:sz w:val="16"/>
+                <w:szCs w:val="16"/>
+              </w:rPr>
+              <w:t xml:space="preserve">IoT Specialist zaprojektuje architekturę sprzętową embedded: integrację jednostki AI o wydajności co najmniej 40 TOPS w INT8 z sensorami (USB3, MIPI, SPI, UART, I2C) oraz zasilanie 12 i 24 V DC z buforem UPS co najmniej 1800 s. Zaprojektuje obudowę IP67 (dobór materiałów dla temperatury od -25 do +70 °C, chłodzenie pasywne, mocowanie odporne na drgania ISO 8608 klasy D). Przeprowadzi testy środowiskowe na infrastrukturze PRz: rig wibracyjny (co najmniej 14 400 s), komorę termiczną (cykl 24 h) i testy EMC, a także zmierzy opóźnienie alertu. Montaż w pojazdach nie należy do tego zadania. Zakres stanowiska ma wyłącznie charakter badawczo-rozwojowy i nie obejmuje czynności zarządczych, kierowniczych, koordynacyjnych, administracyjnych ani nadzorczych.</w:t>
+            </w:r>
+          </w:p>
+        </w:tc>
+        <w:tc>
+          <w:tcPr>
+            <w:tcW w:type="dxa" w:w="5900"/>
             <w:tcBorders>
               <w:top w:val="single" w:color="999999" w:sz="4"/>
               <w:left w:val="single" w:color="999999" w:sz="4"/>
@@ -3182,7 +3182,7 @@
         </w:trPr>
         <w:tc>
           <w:tcPr>
-            <w:tcW w:type="dxa" w:w="900"/>
+            <w:tcW w:type="dxa" w:w="800"/>
             <w:tcBorders>
               <w:top w:val="single" w:color="999999" w:sz="4"/>
               <w:left w:val="single" w:color="999999" w:sz="4"/>
@@ -3211,7 +3211,7 @@
         </w:tc>
         <w:tc>
           <w:tcPr>
-            <w:tcW w:type="dxa" w:w="2600"/>
+            <w:tcW w:type="dxa" w:w="1700"/>
             <w:tcBorders>
               <w:top w:val="single" w:color="999999" w:sz="4"/>
               <w:left w:val="single" w:color="999999" w:sz="4"/>
@@ -3240,7 +3240,7 @@
         </w:tc>
         <w:tc>
           <w:tcPr>
-            <w:tcW w:type="dxa" w:w="1700"/>
+            <w:tcW w:type="dxa" w:w="1400"/>
             <w:tcBorders>
               <w:top w:val="single" w:color="999999" w:sz="4"/>
               <w:left w:val="single" w:color="999999" w:sz="4"/>
@@ -3269,36 +3269,36 @@
         </w:tc>
         <w:tc>
           <w:tcPr>
-            <w:tcW w:type="dxa" w:w="1500"/>
-            <w:tcBorders>
-              <w:top w:val="single" w:color="999999" w:sz="4"/>
-              <w:left w:val="single" w:color="999999" w:sz="4"/>
-              <w:bottom w:val="single" w:color="999999" w:sz="4"/>
-              <w:right w:val="single" w:color="999999" w:sz="4"/>
-            </w:tcBorders>
-            <w:tcMar>
-              <w:top w:type="dxa" w:w="60"/>
-              <w:left w:type="dxa" w:w="80"/>
-              <w:bottom w:type="dxa" w:w="60"/>
-              <w:right w:type="dxa" w:w="80"/>
-            </w:tcMar>
-          </w:tcPr>
-          <w:p>
-            <w:r>
-              <w:rPr>
-                <w:rFonts w:ascii="Arial" w:cs="Arial" w:eastAsia="Arial" w:hAnsi="Arial"/>
-                <w:b w:val="false"/>
-                <w:bCs w:val="false"/>
-                <w:sz w:val="16"/>
-                <w:szCs w:val="16"/>
-              </w:rPr>
-              <w:t xml:space="preserve"/>
-            </w:r>
-          </w:p>
-        </w:tc>
-        <w:tc>
-          <w:tcPr>
-            <w:tcW w:type="dxa" w:w="7000"/>
+            <w:tcW w:type="dxa" w:w="5900"/>
+            <w:tcBorders>
+              <w:top w:val="single" w:color="999999" w:sz="4"/>
+              <w:left w:val="single" w:color="999999" w:sz="4"/>
+              <w:bottom w:val="single" w:color="999999" w:sz="4"/>
+              <w:right w:val="single" w:color="999999" w:sz="4"/>
+            </w:tcBorders>
+            <w:tcMar>
+              <w:top w:type="dxa" w:w="60"/>
+              <w:left w:type="dxa" w:w="80"/>
+              <w:bottom w:type="dxa" w:w="60"/>
+              <w:right w:type="dxa" w:w="80"/>
+            </w:tcMar>
+          </w:tcPr>
+          <w:p>
+            <w:r>
+              <w:rPr>
+                <w:rFonts w:ascii="Arial" w:cs="Arial" w:eastAsia="Arial" w:hAnsi="Arial"/>
+                <w:b w:val="false"/>
+                <w:bCs w:val="false"/>
+                <w:sz w:val="16"/>
+                <w:szCs w:val="16"/>
+              </w:rPr>
+              <w:t xml:space="preserve">Specjalista ds. logistyki TSL zdefiniuje scenariusze walidacji alertów z perspektywy operacyjnej oraz progi ryzyka niski, średni i wysoki dla każdej klasy ładunku, sprawdzając, czy progi modelu odpowiadają rzeczywistym ryzykom. Oceni użyteczność alertu dźwiękowego w warunkach kabiny i to, czy system nie zakłóca załadunku i rozładunku, jako uczestnik testów środowiskowych. Prace dostarczają kryteriów, według których walidowany jest alert lokalny. Zakres stanowiska ma wyłącznie charakter badawczo-rozwojowy i nie obejmuje czynności zarządczych, kierowniczych, koordynacyjnych, administracyjnych ani nadzorczych.</w:t>
+            </w:r>
+          </w:p>
+        </w:tc>
+        <w:tc>
+          <w:tcPr>
+            <w:tcW w:type="dxa" w:w="5900"/>
             <w:tcBorders>
               <w:top w:val="single" w:color="999999" w:sz="4"/>
               <w:left w:val="single" w:color="999999" w:sz="4"/>
@@ -3332,7 +3332,7 @@
         </w:trPr>
         <w:tc>
           <w:tcPr>
-            <w:tcW w:type="dxa" w:w="900"/>
+            <w:tcW w:type="dxa" w:w="800"/>
             <w:tcBorders>
               <w:top w:val="single" w:color="999999" w:sz="4"/>
               <w:left w:val="single" w:color="999999" w:sz="4"/>
@@ -3361,7 +3361,7 @@
         </w:tc>
         <w:tc>
           <w:tcPr>
-            <w:tcW w:type="dxa" w:w="2600"/>
+            <w:tcW w:type="dxa" w:w="1700"/>
             <w:tcBorders>
               <w:top w:val="single" w:color="999999" w:sz="4"/>
               <w:left w:val="single" w:color="999999" w:sz="4"/>
@@ -3390,7 +3390,7 @@
         </w:tc>
         <w:tc>
           <w:tcPr>
-            <w:tcW w:type="dxa" w:w="1700"/>
+            <w:tcW w:type="dxa" w:w="1400"/>
             <w:tcBorders>
               <w:top w:val="single" w:color="999999" w:sz="4"/>
               <w:left w:val="single" w:color="999999" w:sz="4"/>
@@ -3419,36 +3419,36 @@
         </w:tc>
         <w:tc>
           <w:tcPr>
-            <w:tcW w:type="dxa" w:w="1500"/>
-            <w:tcBorders>
-              <w:top w:val="single" w:color="999999" w:sz="4"/>
-              <w:left w:val="single" w:color="999999" w:sz="4"/>
-              <w:bottom w:val="single" w:color="999999" w:sz="4"/>
-              <w:right w:val="single" w:color="999999" w:sz="4"/>
-            </w:tcBorders>
-            <w:tcMar>
-              <w:top w:type="dxa" w:w="60"/>
-              <w:left w:type="dxa" w:w="80"/>
-              <w:bottom w:type="dxa" w:w="60"/>
-              <w:right w:type="dxa" w:w="80"/>
-            </w:tcMar>
-          </w:tcPr>
-          <w:p>
-            <w:r>
-              <w:rPr>
-                <w:rFonts w:ascii="Arial" w:cs="Arial" w:eastAsia="Arial" w:hAnsi="Arial"/>
-                <w:b w:val="false"/>
-                <w:bCs w:val="false"/>
-                <w:sz w:val="16"/>
-                <w:szCs w:val="16"/>
-              </w:rPr>
-              <w:t xml:space="preserve"/>
-            </w:r>
-          </w:p>
-        </w:tc>
-        <w:tc>
-          <w:tcPr>
-            <w:tcW w:type="dxa" w:w="7000"/>
+            <w:tcW w:type="dxa" w:w="5900"/>
+            <w:tcBorders>
+              <w:top w:val="single" w:color="999999" w:sz="4"/>
+              <w:left w:val="single" w:color="999999" w:sz="4"/>
+              <w:bottom w:val="single" w:color="999999" w:sz="4"/>
+              <w:right w:val="single" w:color="999999" w:sz="4"/>
+            </w:tcBorders>
+            <w:tcMar>
+              <w:top w:type="dxa" w:w="60"/>
+              <w:left w:type="dxa" w:w="80"/>
+              <w:bottom w:type="dxa" w:w="60"/>
+              <w:right w:type="dxa" w:w="80"/>
+            </w:tcMar>
+          </w:tcPr>
+          <w:p>
+            <w:r>
+              <w:rPr>
+                <w:rFonts w:ascii="Arial" w:cs="Arial" w:eastAsia="Arial" w:hAnsi="Arial"/>
+                <w:b w:val="false"/>
+                <w:bCs w:val="false"/>
+                <w:sz w:val="16"/>
+                <w:szCs w:val="16"/>
+              </w:rPr>
+              <w:t xml:space="preserve">AI Lead opracuje protokół walidacji KPI modeli AI (co najmniej 180 kursów dla AUC-ROC, co najmniej 200 obrazów dla mAP), zbierze i uporządkuje dane terenowe oraz obliczy metryki dla każdej klasy. Przy stwierdzeniu przesunięcia domeny (domain shift) przeprowadzi adaptację domenową: douczenie, rekalibrację progów i ponowną walidację w oknie korekt w M30. Niepewność dotyczy utrzymania wskaźników laboratoryjnych w rzeczywistej eksploatacji. Czynności związane z ochroną własności przemysłowej i zgłoszeniem patentowym nie są objęte kosztem; należą do zadania Z11. Zakres stanowiska ma wyłącznie charakter badawczo-rozwojowy i nie obejmuje czynności zarządczych, kierowniczych, koordynacyjnych, administracyjnych ani nadzorczych.</w:t>
+            </w:r>
+          </w:p>
+        </w:tc>
+        <w:tc>
+          <w:tcPr>
+            <w:tcW w:type="dxa" w:w="5900"/>
             <w:tcBorders>
               <w:top w:val="single" w:color="999999" w:sz="4"/>
               <w:left w:val="single" w:color="999999" w:sz="4"/>
@@ -3482,7 +3482,7 @@
         </w:trPr>
         <w:tc>
           <w:tcPr>
-            <w:tcW w:type="dxa" w:w="900"/>
+            <w:tcW w:type="dxa" w:w="800"/>
             <w:tcBorders>
               <w:top w:val="single" w:color="999999" w:sz="4"/>
               <w:left w:val="single" w:color="999999" w:sz="4"/>
@@ -3511,7 +3511,7 @@
         </w:tc>
         <w:tc>
           <w:tcPr>
-            <w:tcW w:type="dxa" w:w="2600"/>
+            <w:tcW w:type="dxa" w:w="1700"/>
             <w:tcBorders>
               <w:top w:val="single" w:color="999999" w:sz="4"/>
               <w:left w:val="single" w:color="999999" w:sz="4"/>
@@ -3540,7 +3540,7 @@
         </w:tc>
         <w:tc>
           <w:tcPr>
-            <w:tcW w:type="dxa" w:w="1700"/>
+            <w:tcW w:type="dxa" w:w="1400"/>
             <w:tcBorders>
               <w:top w:val="single" w:color="999999" w:sz="4"/>
               <w:left w:val="single" w:color="999999" w:sz="4"/>
@@ -3569,36 +3569,36 @@
         </w:tc>
         <w:tc>
           <w:tcPr>
-            <w:tcW w:type="dxa" w:w="1500"/>
-            <w:tcBorders>
-              <w:top w:val="single" w:color="999999" w:sz="4"/>
-              <w:left w:val="single" w:color="999999" w:sz="4"/>
-              <w:bottom w:val="single" w:color="999999" w:sz="4"/>
-              <w:right w:val="single" w:color="999999" w:sz="4"/>
-            </w:tcBorders>
-            <w:tcMar>
-              <w:top w:type="dxa" w:w="60"/>
-              <w:left w:type="dxa" w:w="80"/>
-              <w:bottom w:type="dxa" w:w="60"/>
-              <w:right w:type="dxa" w:w="80"/>
-            </w:tcMar>
-          </w:tcPr>
-          <w:p>
-            <w:r>
-              <w:rPr>
-                <w:rFonts w:ascii="Arial" w:cs="Arial" w:eastAsia="Arial" w:hAnsi="Arial"/>
-                <w:b w:val="false"/>
-                <w:bCs w:val="false"/>
-                <w:sz w:val="16"/>
-                <w:szCs w:val="16"/>
-              </w:rPr>
-              <w:t xml:space="preserve"/>
-            </w:r>
-          </w:p>
-        </w:tc>
-        <w:tc>
-          <w:tcPr>
-            <w:tcW w:type="dxa" w:w="7000"/>
+            <w:tcW w:type="dxa" w:w="5900"/>
+            <w:tcBorders>
+              <w:top w:val="single" w:color="999999" w:sz="4"/>
+              <w:left w:val="single" w:color="999999" w:sz="4"/>
+              <w:bottom w:val="single" w:color="999999" w:sz="4"/>
+              <w:right w:val="single" w:color="999999" w:sz="4"/>
+            </w:tcBorders>
+            <w:tcMar>
+              <w:top w:type="dxa" w:w="60"/>
+              <w:left w:type="dxa" w:w="80"/>
+              <w:bottom w:type="dxa" w:w="60"/>
+              <w:right w:type="dxa" w:w="80"/>
+            </w:tcMar>
+          </w:tcPr>
+          <w:p>
+            <w:r>
+              <w:rPr>
+                <w:rFonts w:ascii="Arial" w:cs="Arial" w:eastAsia="Arial" w:hAnsi="Arial"/>
+                <w:b w:val="false"/>
+                <w:bCs w:val="false"/>
+                <w:sz w:val="16"/>
+                <w:szCs w:val="16"/>
+              </w:rPr>
+              <w:t xml:space="preserve">AI Senior Engineer zoptymalizuje modele na platformie w warunkach terenowych, wskaże scenariusze o obniżonej dokładności, zdiagnozuje przyczyny (przesunięcie domeny, nowe ładunki, oświetlenie) i wdroży korekty: douczenie, augmentację terenową i rekalibrację. Przygotuje anotację próbki co najmniej 200 obrazów terenowych jako ground truth dla mAP, weryfikowaną przez specjalistę ds. logistyki TSL. Opracuje raport KPI (krzywe ROC, macierze pomyłek, analiza błędów) oraz przeprowadzi badanie akceptacji użytkowników (kierowcy, dyspozytorzy) według scenariuszy specjalisty TSL. Zakres stanowiska ma wyłącznie charakter badawczo-rozwojowy i nie obejmuje czynności zarządczych, kierowniczych, koordynacyjnych, administracyjnych ani nadzorczych.</w:t>
+            </w:r>
+          </w:p>
+        </w:tc>
+        <w:tc>
+          <w:tcPr>
+            <w:tcW w:type="dxa" w:w="5900"/>
             <w:tcBorders>
               <w:top w:val="single" w:color="999999" w:sz="4"/>
               <w:left w:val="single" w:color="999999" w:sz="4"/>
@@ -3632,7 +3632,7 @@
         </w:trPr>
         <w:tc>
           <w:tcPr>
-            <w:tcW w:type="dxa" w:w="900"/>
+            <w:tcW w:type="dxa" w:w="800"/>
             <w:tcBorders>
               <w:top w:val="single" w:color="999999" w:sz="4"/>
               <w:left w:val="single" w:color="999999" w:sz="4"/>
@@ -3661,7 +3661,7 @@
         </w:tc>
         <w:tc>
           <w:tcPr>
-            <w:tcW w:type="dxa" w:w="2600"/>
+            <w:tcW w:type="dxa" w:w="1700"/>
             <w:tcBorders>
               <w:top w:val="single" w:color="999999" w:sz="4"/>
               <w:left w:val="single" w:color="999999" w:sz="4"/>
@@ -3690,7 +3690,7 @@
         </w:tc>
         <w:tc>
           <w:tcPr>
-            <w:tcW w:type="dxa" w:w="1700"/>
+            <w:tcW w:type="dxa" w:w="1400"/>
             <w:tcBorders>
               <w:top w:val="single" w:color="999999" w:sz="4"/>
               <w:left w:val="single" w:color="999999" w:sz="4"/>
@@ -3719,36 +3719,36 @@
         </w:tc>
         <w:tc>
           <w:tcPr>
-            <w:tcW w:type="dxa" w:w="1500"/>
-            <w:tcBorders>
-              <w:top w:val="single" w:color="999999" w:sz="4"/>
-              <w:left w:val="single" w:color="999999" w:sz="4"/>
-              <w:bottom w:val="single" w:color="999999" w:sz="4"/>
-              <w:right w:val="single" w:color="999999" w:sz="4"/>
-            </w:tcBorders>
-            <w:tcMar>
-              <w:top w:type="dxa" w:w="60"/>
-              <w:left w:type="dxa" w:w="80"/>
-              <w:bottom w:type="dxa" w:w="60"/>
-              <w:right w:type="dxa" w:w="80"/>
-            </w:tcMar>
-          </w:tcPr>
-          <w:p>
-            <w:r>
-              <w:rPr>
-                <w:rFonts w:ascii="Arial" w:cs="Arial" w:eastAsia="Arial" w:hAnsi="Arial"/>
-                <w:b w:val="false"/>
-                <w:bCs w:val="false"/>
-                <w:sz w:val="16"/>
-                <w:szCs w:val="16"/>
-              </w:rPr>
-              <w:t xml:space="preserve"/>
-            </w:r>
-          </w:p>
-        </w:tc>
-        <w:tc>
-          <w:tcPr>
-            <w:tcW w:type="dxa" w:w="7000"/>
+            <w:tcW w:type="dxa" w:w="5900"/>
+            <w:tcBorders>
+              <w:top w:val="single" w:color="999999" w:sz="4"/>
+              <w:left w:val="single" w:color="999999" w:sz="4"/>
+              <w:bottom w:val="single" w:color="999999" w:sz="4"/>
+              <w:right w:val="single" w:color="999999" w:sz="4"/>
+            </w:tcBorders>
+            <w:tcMar>
+              <w:top w:type="dxa" w:w="60"/>
+              <w:left w:type="dxa" w:w="80"/>
+              <w:bottom w:type="dxa" w:w="60"/>
+              <w:right w:type="dxa" w:w="80"/>
+            </w:tcMar>
+          </w:tcPr>
+          <w:p>
+            <w:r>
+              <w:rPr>
+                <w:rFonts w:ascii="Arial" w:cs="Arial" w:eastAsia="Arial" w:hAnsi="Arial"/>
+                <w:b w:val="false"/>
+                <w:bCs w:val="false"/>
+                <w:sz w:val="16"/>
+                <w:szCs w:val="16"/>
+              </w:rPr>
+              <w:t xml:space="preserve">Specjalista ds. cyberbezpieczeństwa wykona testy bezpieczeństwa prototypu w terenie, w tym weryfikację integralności kryptograficznej dokumentów PoL i PoC oraz bezpieczeństwa transmisji. Uruchomi zamrożony skrypt ewaluacyjny jako niezależny ewaluator: nie ma powiązań z partnerem testowym ani udziału w modelowaniu, a wyniki powstają automatycznie ze skryptu, na danych z logu niemodyfikowalnego. Aktualizacja dokumentacji AI Act, przegląd stanu techniki patentowej i analiza swobody wdrożenia nie są objęte kosztem. Zakres stanowiska ma wyłącznie charakter badawczo-rozwojowy i nie obejmuje czynności zarządczych, kierowniczych, koordynacyjnych, administracyjnych ani nadzorczych.</w:t>
+            </w:r>
+          </w:p>
+        </w:tc>
+        <w:tc>
+          <w:tcPr>
+            <w:tcW w:type="dxa" w:w="5900"/>
             <w:tcBorders>
               <w:top w:val="single" w:color="999999" w:sz="4"/>
               <w:left w:val="single" w:color="999999" w:sz="4"/>
@@ -3782,7 +3782,7 @@
         </w:trPr>
         <w:tc>
           <w:tcPr>
-            <w:tcW w:type="dxa" w:w="900"/>
+            <w:tcW w:type="dxa" w:w="800"/>
             <w:tcBorders>
               <w:top w:val="single" w:color="999999" w:sz="4"/>
               <w:left w:val="single" w:color="999999" w:sz="4"/>
@@ -3811,7 +3811,7 @@
         </w:tc>
         <w:tc>
           <w:tcPr>
-            <w:tcW w:type="dxa" w:w="2600"/>
+            <w:tcW w:type="dxa" w:w="1700"/>
             <w:tcBorders>
               <w:top w:val="single" w:color="999999" w:sz="4"/>
               <w:left w:val="single" w:color="999999" w:sz="4"/>
@@ -3840,7 +3840,7 @@
         </w:tc>
         <w:tc>
           <w:tcPr>
-            <w:tcW w:type="dxa" w:w="1700"/>
+            <w:tcW w:type="dxa" w:w="1400"/>
             <w:tcBorders>
               <w:top w:val="single" w:color="999999" w:sz="4"/>
               <w:left w:val="single" w:color="999999" w:sz="4"/>
@@ -3869,36 +3869,36 @@
         </w:tc>
         <w:tc>
           <w:tcPr>
-            <w:tcW w:type="dxa" w:w="1500"/>
-            <w:tcBorders>
-              <w:top w:val="single" w:color="999999" w:sz="4"/>
-              <w:left w:val="single" w:color="999999" w:sz="4"/>
-              <w:bottom w:val="single" w:color="999999" w:sz="4"/>
-              <w:right w:val="single" w:color="999999" w:sz="4"/>
-            </w:tcBorders>
-            <w:tcMar>
-              <w:top w:type="dxa" w:w="60"/>
-              <w:left w:type="dxa" w:w="80"/>
-              <w:bottom w:type="dxa" w:w="60"/>
-              <w:right w:type="dxa" w:w="80"/>
-            </w:tcMar>
-          </w:tcPr>
-          <w:p>
-            <w:r>
-              <w:rPr>
-                <w:rFonts w:ascii="Arial" w:cs="Arial" w:eastAsia="Arial" w:hAnsi="Arial"/>
-                <w:b w:val="false"/>
-                <w:bCs w:val="false"/>
-                <w:sz w:val="16"/>
-                <w:szCs w:val="16"/>
-              </w:rPr>
-              <w:t xml:space="preserve"/>
-            </w:r>
-          </w:p>
-        </w:tc>
-        <w:tc>
-          <w:tcPr>
-            <w:tcW w:type="dxa" w:w="7000"/>
+            <w:tcW w:type="dxa" w:w="5900"/>
+            <w:tcBorders>
+              <w:top w:val="single" w:color="999999" w:sz="4"/>
+              <w:left w:val="single" w:color="999999" w:sz="4"/>
+              <w:bottom w:val="single" w:color="999999" w:sz="4"/>
+              <w:right w:val="single" w:color="999999" w:sz="4"/>
+            </w:tcBorders>
+            <w:tcMar>
+              <w:top w:type="dxa" w:w="60"/>
+              <w:left w:type="dxa" w:w="80"/>
+              <w:bottom w:type="dxa" w:w="60"/>
+              <w:right w:type="dxa" w:w="80"/>
+            </w:tcMar>
+          </w:tcPr>
+          <w:p>
+            <w:r>
+              <w:rPr>
+                <w:rFonts w:ascii="Arial" w:cs="Arial" w:eastAsia="Arial" w:hAnsi="Arial"/>
+                <w:b w:val="false"/>
+                <w:bCs w:val="false"/>
+                <w:sz w:val="16"/>
+                <w:szCs w:val="16"/>
+              </w:rPr>
+              <w:t xml:space="preserve">IT Specialist zbierze i uporządkuje logi terenowe (dostępność, status GSM, bufor), wykona pomiar czasu generowania PoC na co najmniej 200 cyklach (cel: mediana do 30 s) i opóźnienia transmisji oraz przygotuje dane do raportu KPI. Poprawki oprogramowania wprowadzi wyłącznie w oknie korekt w M30, na podstawie wyników walidacji. Bieżące utrzymanie systemu i środowiska integracyjnego nie jest objęte kosztem. Zakres stanowiska ma wyłącznie charakter badawczo-rozwojowy i nie obejmuje czynności zarządczych, kierowniczych, koordynacyjnych, administracyjnych ani nadzorczych.</w:t>
+            </w:r>
+          </w:p>
+        </w:tc>
+        <w:tc>
+          <w:tcPr>
+            <w:tcW w:type="dxa" w:w="5900"/>
             <w:tcBorders>
               <w:top w:val="single" w:color="999999" w:sz="4"/>
               <w:left w:val="single" w:color="999999" w:sz="4"/>
@@ -3932,7 +3932,7 @@
         </w:trPr>
         <w:tc>
           <w:tcPr>
-            <w:tcW w:type="dxa" w:w="900"/>
+            <w:tcW w:type="dxa" w:w="800"/>
             <w:tcBorders>
               <w:top w:val="single" w:color="999999" w:sz="4"/>
               <w:left w:val="single" w:color="999999" w:sz="4"/>
@@ -3961,7 +3961,7 @@
         </w:tc>
         <w:tc>
           <w:tcPr>
-            <w:tcW w:type="dxa" w:w="2600"/>
+            <w:tcW w:type="dxa" w:w="1700"/>
             <w:tcBorders>
               <w:top w:val="single" w:color="999999" w:sz="4"/>
               <w:left w:val="single" w:color="999999" w:sz="4"/>
@@ -3990,7 +3990,7 @@
         </w:tc>
         <w:tc>
           <w:tcPr>
-            <w:tcW w:type="dxa" w:w="1700"/>
+            <w:tcW w:type="dxa" w:w="1400"/>
             <w:tcBorders>
               <w:top w:val="single" w:color="999999" w:sz="4"/>
               <w:left w:val="single" w:color="999999" w:sz="4"/>
@@ -4019,36 +4019,36 @@
         </w:tc>
         <w:tc>
           <w:tcPr>
-            <w:tcW w:type="dxa" w:w="1500"/>
-            <w:tcBorders>
-              <w:top w:val="single" w:color="999999" w:sz="4"/>
-              <w:left w:val="single" w:color="999999" w:sz="4"/>
-              <w:bottom w:val="single" w:color="999999" w:sz="4"/>
-              <w:right w:val="single" w:color="999999" w:sz="4"/>
-            </w:tcBorders>
-            <w:tcMar>
-              <w:top w:type="dxa" w:w="60"/>
-              <w:left w:type="dxa" w:w="80"/>
-              <w:bottom w:type="dxa" w:w="60"/>
-              <w:right w:type="dxa" w:w="80"/>
-            </w:tcMar>
-          </w:tcPr>
-          <w:p>
-            <w:r>
-              <w:rPr>
-                <w:rFonts w:ascii="Arial" w:cs="Arial" w:eastAsia="Arial" w:hAnsi="Arial"/>
-                <w:b w:val="false"/>
-                <w:bCs w:val="false"/>
-                <w:sz w:val="16"/>
-                <w:szCs w:val="16"/>
-              </w:rPr>
-              <w:t xml:space="preserve"/>
-            </w:r>
-          </w:p>
-        </w:tc>
-        <w:tc>
-          <w:tcPr>
-            <w:tcW w:type="dxa" w:w="7000"/>
+            <w:tcW w:type="dxa" w:w="5900"/>
+            <w:tcBorders>
+              <w:top w:val="single" w:color="999999" w:sz="4"/>
+              <w:left w:val="single" w:color="999999" w:sz="4"/>
+              <w:bottom w:val="single" w:color="999999" w:sz="4"/>
+              <w:right w:val="single" w:color="999999" w:sz="4"/>
+            </w:tcBorders>
+            <w:tcMar>
+              <w:top w:type="dxa" w:w="60"/>
+              <w:left w:type="dxa" w:w="80"/>
+              <w:bottom w:type="dxa" w:w="60"/>
+              <w:right w:type="dxa" w:w="80"/>
+            </w:tcMar>
+          </w:tcPr>
+          <w:p>
+            <w:r>
+              <w:rPr>
+                <w:rFonts w:ascii="Arial" w:cs="Arial" w:eastAsia="Arial" w:hAnsi="Arial"/>
+                <w:b w:val="false"/>
+                <w:bCs w:val="false"/>
+                <w:sz w:val="16"/>
+                <w:szCs w:val="16"/>
+              </w:rPr>
+              <w:t xml:space="preserve">IoT Specialist wykona projekt techniczny instalacji, konfigurację i kalibrację kamer i radaru w warunkach rzeczywistych oraz odbiór techniczny zestawów po montażu na co najmniej 3 pojazdach floty testowej. Montaż i demontaż wykonuje podwykonawca. Zarejestruje parametry niezawodności sprzętu (dostępność co najmniej 95%, temperatura modułów, status sensorów, degradacja połączeń) i zmierzy opóźnienie alertu na co najmniej 500 zdarzeniach bez GSM (cel: percentyl 95 do 1 s). Serwis i naprawy awarii nie są objęte kosztem. Zakres stanowiska ma wyłącznie charakter badawczo-rozwojowy i nie obejmuje czynności zarządczych, kierowniczych, koordynacyjnych, administracyjnych ani nadzorczych.</w:t>
+            </w:r>
+          </w:p>
+        </w:tc>
+        <w:tc>
+          <w:tcPr>
+            <w:tcW w:type="dxa" w:w="5900"/>
             <w:tcBorders>
               <w:top w:val="single" w:color="999999" w:sz="4"/>
               <w:left w:val="single" w:color="999999" w:sz="4"/>
@@ -4082,7 +4082,7 @@
         </w:trPr>
         <w:tc>
           <w:tcPr>
-            <w:tcW w:type="dxa" w:w="900"/>
+            <w:tcW w:type="dxa" w:w="800"/>
             <w:tcBorders>
               <w:top w:val="single" w:color="999999" w:sz="4"/>
               <w:left w:val="single" w:color="999999" w:sz="4"/>
@@ -4111,7 +4111,7 @@
         </w:tc>
         <w:tc>
           <w:tcPr>
-            <w:tcW w:type="dxa" w:w="2600"/>
+            <w:tcW w:type="dxa" w:w="1700"/>
             <w:tcBorders>
               <w:top w:val="single" w:color="999999" w:sz="4"/>
               <w:left w:val="single" w:color="999999" w:sz="4"/>
@@ -4140,7 +4140,7 @@
         </w:tc>
         <w:tc>
           <w:tcPr>
-            <w:tcW w:type="dxa" w:w="1700"/>
+            <w:tcW w:type="dxa" w:w="1400"/>
             <w:tcBorders>
               <w:top w:val="single" w:color="999999" w:sz="4"/>
               <w:left w:val="single" w:color="999999" w:sz="4"/>
@@ -4169,36 +4169,36 @@
         </w:tc>
         <w:tc>
           <w:tcPr>
-            <w:tcW w:type="dxa" w:w="1500"/>
-            <w:tcBorders>
-              <w:top w:val="single" w:color="999999" w:sz="4"/>
-              <w:left w:val="single" w:color="999999" w:sz="4"/>
-              <w:bottom w:val="single" w:color="999999" w:sz="4"/>
-              <w:right w:val="single" w:color="999999" w:sz="4"/>
-            </w:tcBorders>
-            <w:tcMar>
-              <w:top w:type="dxa" w:w="60"/>
-              <w:left w:type="dxa" w:w="80"/>
-              <w:bottom w:type="dxa" w:w="60"/>
-              <w:right w:type="dxa" w:w="80"/>
-            </w:tcMar>
-          </w:tcPr>
-          <w:p>
-            <w:r>
-              <w:rPr>
-                <w:rFonts w:ascii="Arial" w:cs="Arial" w:eastAsia="Arial" w:hAnsi="Arial"/>
-                <w:b w:val="false"/>
-                <w:bCs w:val="false"/>
-                <w:sz w:val="16"/>
-                <w:szCs w:val="16"/>
-              </w:rPr>
-              <w:t xml:space="preserve"/>
-            </w:r>
-          </w:p>
-        </w:tc>
-        <w:tc>
-          <w:tcPr>
-            <w:tcW w:type="dxa" w:w="7000"/>
+            <w:tcW w:type="dxa" w:w="5900"/>
+            <w:tcBorders>
+              <w:top w:val="single" w:color="999999" w:sz="4"/>
+              <w:left w:val="single" w:color="999999" w:sz="4"/>
+              <w:bottom w:val="single" w:color="999999" w:sz="4"/>
+              <w:right w:val="single" w:color="999999" w:sz="4"/>
+            </w:tcBorders>
+            <w:tcMar>
+              <w:top w:type="dxa" w:w="60"/>
+              <w:left w:type="dxa" w:w="80"/>
+              <w:bottom w:type="dxa" w:w="60"/>
+              <w:right w:type="dxa" w:w="80"/>
+            </w:tcMar>
+          </w:tcPr>
+          <w:p>
+            <w:r>
+              <w:rPr>
+                <w:rFonts w:ascii="Arial" w:cs="Arial" w:eastAsia="Arial" w:hAnsi="Arial"/>
+                <w:b w:val="false"/>
+                <w:bCs w:val="false"/>
+                <w:sz w:val="16"/>
+                <w:szCs w:val="16"/>
+              </w:rPr>
+              <w:t xml:space="preserve">Specjalista ds. logistyki TSL poprowadzi inspekcje stanu ładunku na co najmniej 180 kursach (dokumentacja fotograficzna ze znacznikiem czasu, oznaczanie zdarzeń) w trybie ślepym względem predykcji, według protokołu z zadania Z3, tworząc ground truth dla AUC-ROC. Zweryfikuje anotację próbki obrazów terenowych i przygotuje scenariusze badania akceptacji użytkowników. Nie ocenia trafności alertów i nie podpisuje protokołu odbioru, a co najmniej 10% jego inspekcji jest powtórnie weryfikowane przez drugą osobę Everest11 na podstawie zdjęć. Zakres stanowiska ma wyłącznie charakter badawczo-rozwojowy i nie obejmuje czynności zarządczych, kierowniczych, koordynacyjnych, administracyjnych ani nadzorczych.</w:t>
+            </w:r>
+          </w:p>
+        </w:tc>
+        <w:tc>
+          <w:tcPr>
+            <w:tcW w:type="dxa" w:w="5900"/>
             <w:tcBorders>
               <w:top w:val="single" w:color="999999" w:sz="4"/>
               <w:left w:val="single" w:color="999999" w:sz="4"/>
@@ -4232,7 +4232,7 @@
         </w:trPr>
         <w:tc>
           <w:tcPr>
-            <w:tcW w:type="dxa" w:w="900"/>
+            <w:tcW w:type="dxa" w:w="800"/>
             <w:tcBorders>
               <w:top w:val="single" w:color="999999" w:sz="4"/>
               <w:left w:val="single" w:color="999999" w:sz="4"/>
@@ -4261,7 +4261,7 @@
         </w:tc>
         <w:tc>
           <w:tcPr>
-            <w:tcW w:type="dxa" w:w="2600"/>
+            <w:tcW w:type="dxa" w:w="1700"/>
             <w:tcBorders>
               <w:top w:val="single" w:color="999999" w:sz="4"/>
               <w:left w:val="single" w:color="999999" w:sz="4"/>
@@ -4290,7 +4290,7 @@
         </w:tc>
         <w:tc>
           <w:tcPr>
-            <w:tcW w:type="dxa" w:w="1700"/>
+            <w:tcW w:type="dxa" w:w="1400"/>
             <w:tcBorders>
               <w:top w:val="single" w:color="999999" w:sz="4"/>
               <w:left w:val="single" w:color="999999" w:sz="4"/>
@@ -4319,36 +4319,36 @@
         </w:tc>
         <w:tc>
           <w:tcPr>
-            <w:tcW w:type="dxa" w:w="1500"/>
-            <w:tcBorders>
-              <w:top w:val="single" w:color="999999" w:sz="4"/>
-              <w:left w:val="single" w:color="999999" w:sz="4"/>
-              <w:bottom w:val="single" w:color="999999" w:sz="4"/>
-              <w:right w:val="single" w:color="999999" w:sz="4"/>
-            </w:tcBorders>
-            <w:tcMar>
-              <w:top w:type="dxa" w:w="60"/>
-              <w:left w:type="dxa" w:w="80"/>
-              <w:bottom w:type="dxa" w:w="60"/>
-              <w:right w:type="dxa" w:w="80"/>
-            </w:tcMar>
-          </w:tcPr>
-          <w:p>
-            <w:r>
-              <w:rPr>
-                <w:rFonts w:ascii="Arial" w:cs="Arial" w:eastAsia="Arial" w:hAnsi="Arial"/>
-                <w:b w:val="false"/>
-                <w:bCs w:val="false"/>
-                <w:sz w:val="16"/>
-                <w:szCs w:val="16"/>
-              </w:rPr>
-              <w:t xml:space="preserve"/>
-            </w:r>
-          </w:p>
-        </w:tc>
-        <w:tc>
-          <w:tcPr>
-            <w:tcW w:type="dxa" w:w="7000"/>
+            <w:tcW w:type="dxa" w:w="5900"/>
+            <w:tcBorders>
+              <w:top w:val="single" w:color="999999" w:sz="4"/>
+              <w:left w:val="single" w:color="999999" w:sz="4"/>
+              <w:bottom w:val="single" w:color="999999" w:sz="4"/>
+              <w:right w:val="single" w:color="999999" w:sz="4"/>
+            </w:tcBorders>
+            <w:tcMar>
+              <w:top w:type="dxa" w:w="60"/>
+              <w:left w:type="dxa" w:w="80"/>
+              <w:bottom w:type="dxa" w:w="60"/>
+              <w:right w:type="dxa" w:w="80"/>
+            </w:tcMar>
+          </w:tcPr>
+          <w:p>
+            <w:r>
+              <w:rPr>
+                <w:rFonts w:ascii="Arial" w:cs="Arial" w:eastAsia="Arial" w:hAnsi="Arial"/>
+                <w:b w:val="false"/>
+                <w:bCs w:val="false"/>
+                <w:sz w:val="16"/>
+                <w:szCs w:val="16"/>
+              </w:rPr>
+              <w:t xml:space="preserve">Backend/Full-Stack Developer, w wymiarze 1,0 etatu przez 3 miesiące od M28 do M30, obsłuży walidację PoC i zgodności eFTI w terenie na co najmniej 200 cyklach, przeanalizuje błędy i dostroi warstwę danych w oknie korekt. Prace kontynuują zadanie Z6 i są niezbędne do potwierdzenia czasu generowania PoC i pokrycia pól eFTI w eksploatacji. Bieżące utrzymanie integracji nie jest objęte kosztem. Zakres stanowiska ma wyłącznie charakter badawczo-rozwojowy i nie obejmuje czynności zarządczych, kierowniczych, koordynacyjnych, administracyjnych ani nadzorczych.</w:t>
+            </w:r>
+          </w:p>
+        </w:tc>
+        <w:tc>
+          <w:tcPr>
+            <w:tcW w:type="dxa" w:w="5900"/>
             <w:tcBorders>
               <w:top w:val="single" w:color="999999" w:sz="4"/>
               <w:left w:val="single" w:color="999999" w:sz="4"/>

</xml_diff>

<commit_message>
Dodaj kolumnę Dofinansowanie (60%) dla zadań Z6, Z7, Z9
Co-Authored-By: Claude Sonnet 5.5 <noreply@anthropic.com>
Claude-Session: https://claude.ai/code/session_01KN7DvfDj9VhKkqEBm66mEf
</commit_message>
<xml_diff>
--- a/Wynagrodzenia_do_generatora.docx
+++ b/Wynagrodzenia_do_generatora.docx
@@ -16,10 +16,11 @@
       </w:tblPr>
       <w:tblGrid>
         <w:gridCol w:w="800"/>
-        <w:gridCol w:w="1700"/>
+        <w:gridCol w:w="1600"/>
+        <w:gridCol w:w="1300"/>
         <w:gridCol w:w="1400"/>
-        <w:gridCol w:w="5900"/>
-        <w:gridCol w:w="5900"/>
+        <w:gridCol w:w="5300"/>
+        <w:gridCol w:w="5300"/>
       </w:tblGrid>
       <w:tr>
         <w:trPr>
@@ -57,7 +58,7 @@
         </w:tc>
         <w:tc>
           <w:tcPr>
-            <w:tcW w:type="dxa" w:w="1700"/>
+            <w:tcW w:type="dxa" w:w="1600"/>
             <w:tcBorders>
               <w:top w:val="single" w:color="999999" w:sz="4"/>
               <w:left w:val="single" w:color="999999" w:sz="4"/>
@@ -87,7 +88,7 @@
         </w:tc>
         <w:tc>
           <w:tcPr>
-            <w:tcW w:type="dxa" w:w="1400"/>
+            <w:tcW w:type="dxa" w:w="1300"/>
             <w:tcBorders>
               <w:top w:val="single" w:color="999999" w:sz="4"/>
               <w:left w:val="single" w:color="999999" w:sz="4"/>
@@ -117,7 +118,7 @@
         </w:tc>
         <w:tc>
           <w:tcPr>
-            <w:tcW w:type="dxa" w:w="5900"/>
+            <w:tcW w:type="dxa" w:w="1400"/>
             <w:tcBorders>
               <w:top w:val="single" w:color="999999" w:sz="4"/>
               <w:left w:val="single" w:color="999999" w:sz="4"/>
@@ -141,13 +142,43 @@
                 <w:sz w:val="18"/>
                 <w:szCs w:val="18"/>
               </w:rPr>
+              <w:t xml:space="preserve">Dofinansowanie</w:t>
+            </w:r>
+          </w:p>
+        </w:tc>
+        <w:tc>
+          <w:tcPr>
+            <w:tcW w:type="dxa" w:w="5300"/>
+            <w:tcBorders>
+              <w:top w:val="single" w:color="999999" w:sz="4"/>
+              <w:left w:val="single" w:color="999999" w:sz="4"/>
+              <w:bottom w:val="single" w:color="999999" w:sz="4"/>
+              <w:right w:val="single" w:color="999999" w:sz="4"/>
+            </w:tcBorders>
+            <w:shd w:fill="D9E2F3" w:color="auto" w:val="clear"/>
+            <w:tcMar>
+              <w:top w:type="dxa" w:w="60"/>
+              <w:left w:type="dxa" w:w="80"/>
+              <w:bottom w:type="dxa" w:w="60"/>
+              <w:right w:type="dxa" w:w="80"/>
+            </w:tcMar>
+          </w:tcPr>
+          <w:p>
+            <w:r>
+              <w:rPr>
+                <w:rFonts w:ascii="Arial" w:cs="Arial" w:eastAsia="Arial" w:hAnsi="Arial"/>
+                <w:b/>
+                <w:bCs/>
+                <w:sz w:val="18"/>
+                <w:szCs w:val="18"/>
+              </w:rPr>
               <w:t xml:space="preserve">Uzasadnienie</w:t>
             </w:r>
           </w:p>
         </w:tc>
         <w:tc>
           <w:tcPr>
-            <w:tcW w:type="dxa" w:w="5900"/>
+            <w:tcW w:type="dxa" w:w="5300"/>
             <w:tcBorders>
               <w:top w:val="single" w:color="999999" w:sz="4"/>
               <w:left w:val="single" w:color="999999" w:sz="4"/>
@@ -211,7 +242,7 @@
         </w:tc>
         <w:tc>
           <w:tcPr>
-            <w:tcW w:type="dxa" w:w="1700"/>
+            <w:tcW w:type="dxa" w:w="1600"/>
             <w:tcBorders>
               <w:top w:val="single" w:color="999999" w:sz="4"/>
               <w:left w:val="single" w:color="999999" w:sz="4"/>
@@ -240,6 +271,35 @@
         </w:tc>
         <w:tc>
           <w:tcPr>
+            <w:tcW w:type="dxa" w:w="1300"/>
+            <w:tcBorders>
+              <w:top w:val="single" w:color="999999" w:sz="4"/>
+              <w:left w:val="single" w:color="999999" w:sz="4"/>
+              <w:bottom w:val="single" w:color="999999" w:sz="4"/>
+              <w:right w:val="single" w:color="999999" w:sz="4"/>
+            </w:tcBorders>
+            <w:tcMar>
+              <w:top w:type="dxa" w:w="60"/>
+              <w:left w:type="dxa" w:w="80"/>
+              <w:bottom w:type="dxa" w:w="60"/>
+              <w:right w:type="dxa" w:w="80"/>
+            </w:tcMar>
+          </w:tcPr>
+          <w:p>
+            <w:r>
+              <w:rPr>
+                <w:rFonts w:ascii="Arial" w:cs="Arial" w:eastAsia="Arial" w:hAnsi="Arial"/>
+                <w:b w:val="false"/>
+                <w:bCs w:val="false"/>
+                <w:sz w:val="16"/>
+                <w:szCs w:val="16"/>
+              </w:rPr>
+              <w:t xml:space="preserve">374152.50</w:t>
+            </w:r>
+          </w:p>
+        </w:tc>
+        <w:tc>
+          <w:tcPr>
             <w:tcW w:type="dxa" w:w="1400"/>
             <w:tcBorders>
               <w:top w:val="single" w:color="999999" w:sz="4"/>
@@ -263,13 +323,13 @@
                 <w:sz w:val="16"/>
                 <w:szCs w:val="16"/>
               </w:rPr>
-              <w:t xml:space="preserve">374152.50</w:t>
-            </w:r>
-          </w:p>
-        </w:tc>
-        <w:tc>
-          <w:tcPr>
-            <w:tcW w:type="dxa" w:w="5900"/>
+              <w:t xml:space="preserve"/>
+            </w:r>
+          </w:p>
+        </w:tc>
+        <w:tc>
+          <w:tcPr>
+            <w:tcW w:type="dxa" w:w="5300"/>
             <w:tcBorders>
               <w:top w:val="single" w:color="999999" w:sz="4"/>
               <w:left w:val="single" w:color="999999" w:sz="4"/>
@@ -298,7 +358,7 @@
         </w:tc>
         <w:tc>
           <w:tcPr>
-            <w:tcW w:type="dxa" w:w="5900"/>
+            <w:tcW w:type="dxa" w:w="5300"/>
             <w:tcBorders>
               <w:top w:val="single" w:color="999999" w:sz="4"/>
               <w:left w:val="single" w:color="999999" w:sz="4"/>
@@ -361,7 +421,7 @@
         </w:tc>
         <w:tc>
           <w:tcPr>
-            <w:tcW w:type="dxa" w:w="1700"/>
+            <w:tcW w:type="dxa" w:w="1600"/>
             <w:tcBorders>
               <w:top w:val="single" w:color="999999" w:sz="4"/>
               <w:left w:val="single" w:color="999999" w:sz="4"/>
@@ -390,6 +450,35 @@
         </w:tc>
         <w:tc>
           <w:tcPr>
+            <w:tcW w:type="dxa" w:w="1300"/>
+            <w:tcBorders>
+              <w:top w:val="single" w:color="999999" w:sz="4"/>
+              <w:left w:val="single" w:color="999999" w:sz="4"/>
+              <w:bottom w:val="single" w:color="999999" w:sz="4"/>
+              <w:right w:val="single" w:color="999999" w:sz="4"/>
+            </w:tcBorders>
+            <w:tcMar>
+              <w:top w:type="dxa" w:w="60"/>
+              <w:left w:type="dxa" w:w="80"/>
+              <w:bottom w:type="dxa" w:w="60"/>
+              <w:right w:type="dxa" w:w="80"/>
+            </w:tcMar>
+          </w:tcPr>
+          <w:p>
+            <w:r>
+              <w:rPr>
+                <w:rFonts w:ascii="Arial" w:cs="Arial" w:eastAsia="Arial" w:hAnsi="Arial"/>
+                <w:b w:val="false"/>
+                <w:bCs w:val="false"/>
+                <w:sz w:val="16"/>
+                <w:szCs w:val="16"/>
+              </w:rPr>
+              <w:t xml:space="preserve">268413.75</w:t>
+            </w:r>
+          </w:p>
+        </w:tc>
+        <w:tc>
+          <w:tcPr>
             <w:tcW w:type="dxa" w:w="1400"/>
             <w:tcBorders>
               <w:top w:val="single" w:color="999999" w:sz="4"/>
@@ -413,13 +502,13 @@
                 <w:sz w:val="16"/>
                 <w:szCs w:val="16"/>
               </w:rPr>
-              <w:t xml:space="preserve">268413.75</w:t>
-            </w:r>
-          </w:p>
-        </w:tc>
-        <w:tc>
-          <w:tcPr>
-            <w:tcW w:type="dxa" w:w="5900"/>
+              <w:t xml:space="preserve"/>
+            </w:r>
+          </w:p>
+        </w:tc>
+        <w:tc>
+          <w:tcPr>
+            <w:tcW w:type="dxa" w:w="5300"/>
             <w:tcBorders>
               <w:top w:val="single" w:color="999999" w:sz="4"/>
               <w:left w:val="single" w:color="999999" w:sz="4"/>
@@ -448,7 +537,7 @@
         </w:tc>
         <w:tc>
           <w:tcPr>
-            <w:tcW w:type="dxa" w:w="5900"/>
+            <w:tcW w:type="dxa" w:w="5300"/>
             <w:tcBorders>
               <w:top w:val="single" w:color="999999" w:sz="4"/>
               <w:left w:val="single" w:color="999999" w:sz="4"/>
@@ -511,7 +600,7 @@
         </w:tc>
         <w:tc>
           <w:tcPr>
-            <w:tcW w:type="dxa" w:w="1700"/>
+            <w:tcW w:type="dxa" w:w="1600"/>
             <w:tcBorders>
               <w:top w:val="single" w:color="999999" w:sz="4"/>
               <w:left w:val="single" w:color="999999" w:sz="4"/>
@@ -540,6 +629,35 @@
         </w:tc>
         <w:tc>
           <w:tcPr>
+            <w:tcW w:type="dxa" w:w="1300"/>
+            <w:tcBorders>
+              <w:top w:val="single" w:color="999999" w:sz="4"/>
+              <w:left w:val="single" w:color="999999" w:sz="4"/>
+              <w:bottom w:val="single" w:color="999999" w:sz="4"/>
+              <w:right w:val="single" w:color="999999" w:sz="4"/>
+            </w:tcBorders>
+            <w:tcMar>
+              <w:top w:type="dxa" w:w="60"/>
+              <w:left w:type="dxa" w:w="80"/>
+              <w:bottom w:type="dxa" w:w="60"/>
+              <w:right w:type="dxa" w:w="80"/>
+            </w:tcMar>
+          </w:tcPr>
+          <w:p>
+            <w:r>
+              <w:rPr>
+                <w:rFonts w:ascii="Arial" w:cs="Arial" w:eastAsia="Arial" w:hAnsi="Arial"/>
+                <w:b w:val="false"/>
+                <w:bCs w:val="false"/>
+                <w:sz w:val="16"/>
+                <w:szCs w:val="16"/>
+              </w:rPr>
+              <w:t xml:space="preserve">113872.50</w:t>
+            </w:r>
+          </w:p>
+        </w:tc>
+        <w:tc>
+          <w:tcPr>
             <w:tcW w:type="dxa" w:w="1400"/>
             <w:tcBorders>
               <w:top w:val="single" w:color="999999" w:sz="4"/>
@@ -563,13 +681,13 @@
                 <w:sz w:val="16"/>
                 <w:szCs w:val="16"/>
               </w:rPr>
-              <w:t xml:space="preserve">113872.50</w:t>
-            </w:r>
-          </w:p>
-        </w:tc>
-        <w:tc>
-          <w:tcPr>
-            <w:tcW w:type="dxa" w:w="5900"/>
+              <w:t xml:space="preserve"/>
+            </w:r>
+          </w:p>
+        </w:tc>
+        <w:tc>
+          <w:tcPr>
+            <w:tcW w:type="dxa" w:w="5300"/>
             <w:tcBorders>
               <w:top w:val="single" w:color="999999" w:sz="4"/>
               <w:left w:val="single" w:color="999999" w:sz="4"/>
@@ -598,7 +716,7 @@
         </w:tc>
         <w:tc>
           <w:tcPr>
-            <w:tcW w:type="dxa" w:w="5900"/>
+            <w:tcW w:type="dxa" w:w="5300"/>
             <w:tcBorders>
               <w:top w:val="single" w:color="999999" w:sz="4"/>
               <w:left w:val="single" w:color="999999" w:sz="4"/>
@@ -661,7 +779,7 @@
         </w:tc>
         <w:tc>
           <w:tcPr>
-            <w:tcW w:type="dxa" w:w="1700"/>
+            <w:tcW w:type="dxa" w:w="1600"/>
             <w:tcBorders>
               <w:top w:val="single" w:color="999999" w:sz="4"/>
               <w:left w:val="single" w:color="999999" w:sz="4"/>
@@ -690,6 +808,35 @@
         </w:tc>
         <w:tc>
           <w:tcPr>
+            <w:tcW w:type="dxa" w:w="1300"/>
+            <w:tcBorders>
+              <w:top w:val="single" w:color="999999" w:sz="4"/>
+              <w:left w:val="single" w:color="999999" w:sz="4"/>
+              <w:bottom w:val="single" w:color="999999" w:sz="4"/>
+              <w:right w:val="single" w:color="999999" w:sz="4"/>
+            </w:tcBorders>
+            <w:tcMar>
+              <w:top w:type="dxa" w:w="60"/>
+              <w:left w:type="dxa" w:w="80"/>
+              <w:bottom w:type="dxa" w:w="60"/>
+              <w:right w:type="dxa" w:w="80"/>
+            </w:tcMar>
+          </w:tcPr>
+          <w:p>
+            <w:r>
+              <w:rPr>
+                <w:rFonts w:ascii="Arial" w:cs="Arial" w:eastAsia="Arial" w:hAnsi="Arial"/>
+                <w:b w:val="false"/>
+                <w:bCs w:val="false"/>
+                <w:sz w:val="16"/>
+                <w:szCs w:val="16"/>
+              </w:rPr>
+              <w:t xml:space="preserve">412110.00</w:t>
+            </w:r>
+          </w:p>
+        </w:tc>
+        <w:tc>
+          <w:tcPr>
             <w:tcW w:type="dxa" w:w="1400"/>
             <w:tcBorders>
               <w:top w:val="single" w:color="999999" w:sz="4"/>
@@ -713,13 +860,13 @@
                 <w:sz w:val="16"/>
                 <w:szCs w:val="16"/>
               </w:rPr>
-              <w:t xml:space="preserve">412110.00</w:t>
-            </w:r>
-          </w:p>
-        </w:tc>
-        <w:tc>
-          <w:tcPr>
-            <w:tcW w:type="dxa" w:w="5900"/>
+              <w:t xml:space="preserve"/>
+            </w:r>
+          </w:p>
+        </w:tc>
+        <w:tc>
+          <w:tcPr>
+            <w:tcW w:type="dxa" w:w="5300"/>
             <w:tcBorders>
               <w:top w:val="single" w:color="999999" w:sz="4"/>
               <w:left w:val="single" w:color="999999" w:sz="4"/>
@@ -748,7 +895,7 @@
         </w:tc>
         <w:tc>
           <w:tcPr>
-            <w:tcW w:type="dxa" w:w="5900"/>
+            <w:tcW w:type="dxa" w:w="5300"/>
             <w:tcBorders>
               <w:top w:val="single" w:color="999999" w:sz="4"/>
               <w:left w:val="single" w:color="999999" w:sz="4"/>
@@ -811,7 +958,7 @@
         </w:tc>
         <w:tc>
           <w:tcPr>
-            <w:tcW w:type="dxa" w:w="1700"/>
+            <w:tcW w:type="dxa" w:w="1600"/>
             <w:tcBorders>
               <w:top w:val="single" w:color="999999" w:sz="4"/>
               <w:left w:val="single" w:color="999999" w:sz="4"/>
@@ -840,6 +987,35 @@
         </w:tc>
         <w:tc>
           <w:tcPr>
+            <w:tcW w:type="dxa" w:w="1300"/>
+            <w:tcBorders>
+              <w:top w:val="single" w:color="999999" w:sz="4"/>
+              <w:left w:val="single" w:color="999999" w:sz="4"/>
+              <w:bottom w:val="single" w:color="999999" w:sz="4"/>
+              <w:right w:val="single" w:color="999999" w:sz="4"/>
+            </w:tcBorders>
+            <w:tcMar>
+              <w:top w:type="dxa" w:w="60"/>
+              <w:left w:type="dxa" w:w="80"/>
+              <w:bottom w:type="dxa" w:w="60"/>
+              <w:right w:type="dxa" w:w="80"/>
+            </w:tcMar>
+          </w:tcPr>
+          <w:p>
+            <w:r>
+              <w:rPr>
+                <w:rFonts w:ascii="Arial" w:cs="Arial" w:eastAsia="Arial" w:hAnsi="Arial"/>
+                <w:b w:val="false"/>
+                <w:bCs w:val="false"/>
+                <w:sz w:val="16"/>
+                <w:szCs w:val="16"/>
+              </w:rPr>
+              <w:t xml:space="preserve">162675.00</w:t>
+            </w:r>
+          </w:p>
+        </w:tc>
+        <w:tc>
+          <w:tcPr>
             <w:tcW w:type="dxa" w:w="1400"/>
             <w:tcBorders>
               <w:top w:val="single" w:color="999999" w:sz="4"/>
@@ -863,13 +1039,13 @@
                 <w:sz w:val="16"/>
                 <w:szCs w:val="16"/>
               </w:rPr>
-              <w:t xml:space="preserve">162675.00</w:t>
-            </w:r>
-          </w:p>
-        </w:tc>
-        <w:tc>
-          <w:tcPr>
-            <w:tcW w:type="dxa" w:w="5900"/>
+              <w:t xml:space="preserve"/>
+            </w:r>
+          </w:p>
+        </w:tc>
+        <w:tc>
+          <w:tcPr>
+            <w:tcW w:type="dxa" w:w="5300"/>
             <w:tcBorders>
               <w:top w:val="single" w:color="999999" w:sz="4"/>
               <w:left w:val="single" w:color="999999" w:sz="4"/>
@@ -898,7 +1074,7 @@
         </w:tc>
         <w:tc>
           <w:tcPr>
-            <w:tcW w:type="dxa" w:w="5900"/>
+            <w:tcW w:type="dxa" w:w="5300"/>
             <w:tcBorders>
               <w:top w:val="single" w:color="999999" w:sz="4"/>
               <w:left w:val="single" w:color="999999" w:sz="4"/>
@@ -961,7 +1137,7 @@
         </w:tc>
         <w:tc>
           <w:tcPr>
-            <w:tcW w:type="dxa" w:w="1700"/>
+            <w:tcW w:type="dxa" w:w="1600"/>
             <w:tcBorders>
               <w:top w:val="single" w:color="999999" w:sz="4"/>
               <w:left w:val="single" w:color="999999" w:sz="4"/>
@@ -990,6 +1166,35 @@
         </w:tc>
         <w:tc>
           <w:tcPr>
+            <w:tcW w:type="dxa" w:w="1300"/>
+            <w:tcBorders>
+              <w:top w:val="single" w:color="999999" w:sz="4"/>
+              <w:left w:val="single" w:color="999999" w:sz="4"/>
+              <w:bottom w:val="single" w:color="999999" w:sz="4"/>
+              <w:right w:val="single" w:color="999999" w:sz="4"/>
+            </w:tcBorders>
+            <w:tcMar>
+              <w:top w:type="dxa" w:w="60"/>
+              <w:left w:type="dxa" w:w="80"/>
+              <w:bottom w:type="dxa" w:w="60"/>
+              <w:right w:type="dxa" w:w="80"/>
+            </w:tcMar>
+          </w:tcPr>
+          <w:p>
+            <w:r>
+              <w:rPr>
+                <w:rFonts w:ascii="Arial" w:cs="Arial" w:eastAsia="Arial" w:hAnsi="Arial"/>
+                <w:b w:val="false"/>
+                <w:bCs w:val="false"/>
+                <w:sz w:val="16"/>
+                <w:szCs w:val="16"/>
+              </w:rPr>
+              <w:t xml:space="preserve">108450.00</w:t>
+            </w:r>
+          </w:p>
+        </w:tc>
+        <w:tc>
+          <w:tcPr>
             <w:tcW w:type="dxa" w:w="1400"/>
             <w:tcBorders>
               <w:top w:val="single" w:color="999999" w:sz="4"/>
@@ -1013,13 +1218,13 @@
                 <w:sz w:val="16"/>
                 <w:szCs w:val="16"/>
               </w:rPr>
-              <w:t xml:space="preserve">108450.00</w:t>
-            </w:r>
-          </w:p>
-        </w:tc>
-        <w:tc>
-          <w:tcPr>
-            <w:tcW w:type="dxa" w:w="5900"/>
+              <w:t xml:space="preserve"/>
+            </w:r>
+          </w:p>
+        </w:tc>
+        <w:tc>
+          <w:tcPr>
+            <w:tcW w:type="dxa" w:w="5300"/>
             <w:tcBorders>
               <w:top w:val="single" w:color="999999" w:sz="4"/>
               <w:left w:val="single" w:color="999999" w:sz="4"/>
@@ -1048,7 +1253,7 @@
         </w:tc>
         <w:tc>
           <w:tcPr>
-            <w:tcW w:type="dxa" w:w="5900"/>
+            <w:tcW w:type="dxa" w:w="5300"/>
             <w:tcBorders>
               <w:top w:val="single" w:color="999999" w:sz="4"/>
               <w:left w:val="single" w:color="999999" w:sz="4"/>
@@ -1111,7 +1316,7 @@
         </w:tc>
         <w:tc>
           <w:tcPr>
-            <w:tcW w:type="dxa" w:w="1700"/>
+            <w:tcW w:type="dxa" w:w="1600"/>
             <w:tcBorders>
               <w:top w:val="single" w:color="999999" w:sz="4"/>
               <w:left w:val="single" w:color="999999" w:sz="4"/>
@@ -1140,6 +1345,35 @@
         </w:tc>
         <w:tc>
           <w:tcPr>
+            <w:tcW w:type="dxa" w:w="1300"/>
+            <w:tcBorders>
+              <w:top w:val="single" w:color="999999" w:sz="4"/>
+              <w:left w:val="single" w:color="999999" w:sz="4"/>
+              <w:bottom w:val="single" w:color="999999" w:sz="4"/>
+              <w:right w:val="single" w:color="999999" w:sz="4"/>
+            </w:tcBorders>
+            <w:tcMar>
+              <w:top w:type="dxa" w:w="60"/>
+              <w:left w:type="dxa" w:w="80"/>
+              <w:bottom w:type="dxa" w:w="60"/>
+              <w:right w:type="dxa" w:w="80"/>
+            </w:tcMar>
+          </w:tcPr>
+          <w:p>
+            <w:r>
+              <w:rPr>
+                <w:rFonts w:ascii="Arial" w:cs="Arial" w:eastAsia="Arial" w:hAnsi="Arial"/>
+                <w:b w:val="false"/>
+                <w:bCs w:val="false"/>
+                <w:sz w:val="16"/>
+                <w:szCs w:val="16"/>
+              </w:rPr>
+              <w:t xml:space="preserve">130140.00</w:t>
+            </w:r>
+          </w:p>
+        </w:tc>
+        <w:tc>
+          <w:tcPr>
             <w:tcW w:type="dxa" w:w="1400"/>
             <w:tcBorders>
               <w:top w:val="single" w:color="999999" w:sz="4"/>
@@ -1163,13 +1397,13 @@
                 <w:sz w:val="16"/>
                 <w:szCs w:val="16"/>
               </w:rPr>
-              <w:t xml:space="preserve">130140.00</w:t>
-            </w:r>
-          </w:p>
-        </w:tc>
-        <w:tc>
-          <w:tcPr>
-            <w:tcW w:type="dxa" w:w="5900"/>
+              <w:t xml:space="preserve"/>
+            </w:r>
+          </w:p>
+        </w:tc>
+        <w:tc>
+          <w:tcPr>
+            <w:tcW w:type="dxa" w:w="5300"/>
             <w:tcBorders>
               <w:top w:val="single" w:color="999999" w:sz="4"/>
               <w:left w:val="single" w:color="999999" w:sz="4"/>
@@ -1198,7 +1432,7 @@
         </w:tc>
         <w:tc>
           <w:tcPr>
-            <w:tcW w:type="dxa" w:w="5900"/>
+            <w:tcW w:type="dxa" w:w="5300"/>
             <w:tcBorders>
               <w:top w:val="single" w:color="999999" w:sz="4"/>
               <w:left w:val="single" w:color="999999" w:sz="4"/>
@@ -1261,7 +1495,7 @@
         </w:tc>
         <w:tc>
           <w:tcPr>
-            <w:tcW w:type="dxa" w:w="1700"/>
+            <w:tcW w:type="dxa" w:w="1600"/>
             <w:tcBorders>
               <w:top w:val="single" w:color="999999" w:sz="4"/>
               <w:left w:val="single" w:color="999999" w:sz="4"/>
@@ -1290,6 +1524,35 @@
         </w:tc>
         <w:tc>
           <w:tcPr>
+            <w:tcW w:type="dxa" w:w="1300"/>
+            <w:tcBorders>
+              <w:top w:val="single" w:color="999999" w:sz="4"/>
+              <w:left w:val="single" w:color="999999" w:sz="4"/>
+              <w:bottom w:val="single" w:color="999999" w:sz="4"/>
+              <w:right w:val="single" w:color="999999" w:sz="4"/>
+            </w:tcBorders>
+            <w:tcMar>
+              <w:top w:type="dxa" w:w="60"/>
+              <w:left w:type="dxa" w:w="80"/>
+              <w:bottom w:type="dxa" w:w="60"/>
+              <w:right w:type="dxa" w:w="80"/>
+            </w:tcMar>
+          </w:tcPr>
+          <w:p>
+            <w:r>
+              <w:rPr>
+                <w:rFonts w:ascii="Arial" w:cs="Arial" w:eastAsia="Arial" w:hAnsi="Arial"/>
+                <w:b w:val="false"/>
+                <w:bCs w:val="false"/>
+                <w:sz w:val="16"/>
+                <w:szCs w:val="16"/>
+              </w:rPr>
+              <w:t xml:space="preserve">216900.00</w:t>
+            </w:r>
+          </w:p>
+        </w:tc>
+        <w:tc>
+          <w:tcPr>
             <w:tcW w:type="dxa" w:w="1400"/>
             <w:tcBorders>
               <w:top w:val="single" w:color="999999" w:sz="4"/>
@@ -1313,13 +1576,13 @@
                 <w:sz w:val="16"/>
                 <w:szCs w:val="16"/>
               </w:rPr>
-              <w:t xml:space="preserve">216900.00</w:t>
-            </w:r>
-          </w:p>
-        </w:tc>
-        <w:tc>
-          <w:tcPr>
-            <w:tcW w:type="dxa" w:w="5900"/>
+              <w:t xml:space="preserve"/>
+            </w:r>
+          </w:p>
+        </w:tc>
+        <w:tc>
+          <w:tcPr>
+            <w:tcW w:type="dxa" w:w="5300"/>
             <w:tcBorders>
               <w:top w:val="single" w:color="999999" w:sz="4"/>
               <w:left w:val="single" w:color="999999" w:sz="4"/>
@@ -1348,7 +1611,7 @@
         </w:tc>
         <w:tc>
           <w:tcPr>
-            <w:tcW w:type="dxa" w:w="5900"/>
+            <w:tcW w:type="dxa" w:w="5300"/>
             <w:tcBorders>
               <w:top w:val="single" w:color="999999" w:sz="4"/>
               <w:left w:val="single" w:color="999999" w:sz="4"/>
@@ -1411,7 +1674,7 @@
         </w:tc>
         <w:tc>
           <w:tcPr>
-            <w:tcW w:type="dxa" w:w="1700"/>
+            <w:tcW w:type="dxa" w:w="1600"/>
             <w:tcBorders>
               <w:top w:val="single" w:color="999999" w:sz="4"/>
               <w:left w:val="single" w:color="999999" w:sz="4"/>
@@ -1440,6 +1703,35 @@
         </w:tc>
         <w:tc>
           <w:tcPr>
+            <w:tcW w:type="dxa" w:w="1300"/>
+            <w:tcBorders>
+              <w:top w:val="single" w:color="999999" w:sz="4"/>
+              <w:left w:val="single" w:color="999999" w:sz="4"/>
+              <w:bottom w:val="single" w:color="999999" w:sz="4"/>
+              <w:right w:val="single" w:color="999999" w:sz="4"/>
+            </w:tcBorders>
+            <w:tcMar>
+              <w:top w:type="dxa" w:w="60"/>
+              <w:left w:type="dxa" w:w="80"/>
+              <w:bottom w:type="dxa" w:w="60"/>
+              <w:right w:type="dxa" w:w="80"/>
+            </w:tcMar>
+          </w:tcPr>
+          <w:p>
+            <w:r>
+              <w:rPr>
+                <w:rFonts w:ascii="Arial" w:cs="Arial" w:eastAsia="Arial" w:hAnsi="Arial"/>
+                <w:b w:val="false"/>
+                <w:bCs w:val="false"/>
+                <w:sz w:val="16"/>
+                <w:szCs w:val="16"/>
+              </w:rPr>
+              <w:t xml:space="preserve">66516.00</w:t>
+            </w:r>
+          </w:p>
+        </w:tc>
+        <w:tc>
+          <w:tcPr>
             <w:tcW w:type="dxa" w:w="1400"/>
             <w:tcBorders>
               <w:top w:val="single" w:color="999999" w:sz="4"/>
@@ -1463,13 +1755,13 @@
                 <w:sz w:val="16"/>
                 <w:szCs w:val="16"/>
               </w:rPr>
-              <w:t xml:space="preserve">66516.00</w:t>
-            </w:r>
-          </w:p>
-        </w:tc>
-        <w:tc>
-          <w:tcPr>
-            <w:tcW w:type="dxa" w:w="5900"/>
+              <w:t xml:space="preserve">39909.60</w:t>
+            </w:r>
+          </w:p>
+        </w:tc>
+        <w:tc>
+          <w:tcPr>
+            <w:tcW w:type="dxa" w:w="5300"/>
             <w:tcBorders>
               <w:top w:val="single" w:color="999999" w:sz="4"/>
               <w:left w:val="single" w:color="999999" w:sz="4"/>
@@ -1498,7 +1790,7 @@
         </w:tc>
         <w:tc>
           <w:tcPr>
-            <w:tcW w:type="dxa" w:w="5900"/>
+            <w:tcW w:type="dxa" w:w="5300"/>
             <w:tcBorders>
               <w:top w:val="single" w:color="999999" w:sz="4"/>
               <w:left w:val="single" w:color="999999" w:sz="4"/>
@@ -1561,7 +1853,7 @@
         </w:tc>
         <w:tc>
           <w:tcPr>
-            <w:tcW w:type="dxa" w:w="1700"/>
+            <w:tcW w:type="dxa" w:w="1600"/>
             <w:tcBorders>
               <w:top w:val="single" w:color="999999" w:sz="4"/>
               <w:left w:val="single" w:color="999999" w:sz="4"/>
@@ -1590,6 +1882,35 @@
         </w:tc>
         <w:tc>
           <w:tcPr>
+            <w:tcW w:type="dxa" w:w="1300"/>
+            <w:tcBorders>
+              <w:top w:val="single" w:color="999999" w:sz="4"/>
+              <w:left w:val="single" w:color="999999" w:sz="4"/>
+              <w:bottom w:val="single" w:color="999999" w:sz="4"/>
+              <w:right w:val="single" w:color="999999" w:sz="4"/>
+            </w:tcBorders>
+            <w:tcMar>
+              <w:top w:type="dxa" w:w="60"/>
+              <w:left w:type="dxa" w:w="80"/>
+              <w:bottom w:type="dxa" w:w="60"/>
+              <w:right w:type="dxa" w:w="80"/>
+            </w:tcMar>
+          </w:tcPr>
+          <w:p>
+            <w:r>
+              <w:rPr>
+                <w:rFonts w:ascii="Arial" w:cs="Arial" w:eastAsia="Arial" w:hAnsi="Arial"/>
+                <w:b w:val="false"/>
+                <w:bCs w:val="false"/>
+                <w:sz w:val="16"/>
+                <w:szCs w:val="16"/>
+              </w:rPr>
+              <w:t xml:space="preserve">47718.00</w:t>
+            </w:r>
+          </w:p>
+        </w:tc>
+        <w:tc>
+          <w:tcPr>
             <w:tcW w:type="dxa" w:w="1400"/>
             <w:tcBorders>
               <w:top w:val="single" w:color="999999" w:sz="4"/>
@@ -1613,13 +1934,13 @@
                 <w:sz w:val="16"/>
                 <w:szCs w:val="16"/>
               </w:rPr>
-              <w:t xml:space="preserve">47718.00</w:t>
-            </w:r>
-          </w:p>
-        </w:tc>
-        <w:tc>
-          <w:tcPr>
-            <w:tcW w:type="dxa" w:w="5900"/>
+              <w:t xml:space="preserve">28630.80</w:t>
+            </w:r>
+          </w:p>
+        </w:tc>
+        <w:tc>
+          <w:tcPr>
+            <w:tcW w:type="dxa" w:w="5300"/>
             <w:tcBorders>
               <w:top w:val="single" w:color="999999" w:sz="4"/>
               <w:left w:val="single" w:color="999999" w:sz="4"/>
@@ -1648,7 +1969,7 @@
         </w:tc>
         <w:tc>
           <w:tcPr>
-            <w:tcW w:type="dxa" w:w="5900"/>
+            <w:tcW w:type="dxa" w:w="5300"/>
             <w:tcBorders>
               <w:top w:val="single" w:color="999999" w:sz="4"/>
               <w:left w:val="single" w:color="999999" w:sz="4"/>
@@ -1711,7 +2032,7 @@
         </w:tc>
         <w:tc>
           <w:tcPr>
-            <w:tcW w:type="dxa" w:w="1700"/>
+            <w:tcW w:type="dxa" w:w="1600"/>
             <w:tcBorders>
               <w:top w:val="single" w:color="999999" w:sz="4"/>
               <w:left w:val="single" w:color="999999" w:sz="4"/>
@@ -1740,6 +2061,35 @@
         </w:tc>
         <w:tc>
           <w:tcPr>
+            <w:tcW w:type="dxa" w:w="1300"/>
+            <w:tcBorders>
+              <w:top w:val="single" w:color="999999" w:sz="4"/>
+              <w:left w:val="single" w:color="999999" w:sz="4"/>
+              <w:bottom w:val="single" w:color="999999" w:sz="4"/>
+              <w:right w:val="single" w:color="999999" w:sz="4"/>
+            </w:tcBorders>
+            <w:tcMar>
+              <w:top w:type="dxa" w:w="60"/>
+              <w:left w:type="dxa" w:w="80"/>
+              <w:bottom w:type="dxa" w:w="60"/>
+              <w:right w:type="dxa" w:w="80"/>
+            </w:tcMar>
+          </w:tcPr>
+          <w:p>
+            <w:r>
+              <w:rPr>
+                <w:rFonts w:ascii="Arial" w:cs="Arial" w:eastAsia="Arial" w:hAnsi="Arial"/>
+                <w:b w:val="false"/>
+                <w:bCs w:val="false"/>
+                <w:sz w:val="16"/>
+                <w:szCs w:val="16"/>
+              </w:rPr>
+              <w:t xml:space="preserve">15183.00</w:t>
+            </w:r>
+          </w:p>
+        </w:tc>
+        <w:tc>
+          <w:tcPr>
             <w:tcW w:type="dxa" w:w="1400"/>
             <w:tcBorders>
               <w:top w:val="single" w:color="999999" w:sz="4"/>
@@ -1763,13 +2113,13 @@
                 <w:sz w:val="16"/>
                 <w:szCs w:val="16"/>
               </w:rPr>
-              <w:t xml:space="preserve">15183.00</w:t>
-            </w:r>
-          </w:p>
-        </w:tc>
-        <w:tc>
-          <w:tcPr>
-            <w:tcW w:type="dxa" w:w="5900"/>
+              <w:t xml:space="preserve">9109.80</w:t>
+            </w:r>
+          </w:p>
+        </w:tc>
+        <w:tc>
+          <w:tcPr>
+            <w:tcW w:type="dxa" w:w="5300"/>
             <w:tcBorders>
               <w:top w:val="single" w:color="999999" w:sz="4"/>
               <w:left w:val="single" w:color="999999" w:sz="4"/>
@@ -1798,7 +2148,7 @@
         </w:tc>
         <w:tc>
           <w:tcPr>
-            <w:tcW w:type="dxa" w:w="5900"/>
+            <w:tcW w:type="dxa" w:w="5300"/>
             <w:tcBorders>
               <w:top w:val="single" w:color="999999" w:sz="4"/>
               <w:left w:val="single" w:color="999999" w:sz="4"/>
@@ -1861,7 +2211,7 @@
         </w:tc>
         <w:tc>
           <w:tcPr>
-            <w:tcW w:type="dxa" w:w="1700"/>
+            <w:tcW w:type="dxa" w:w="1600"/>
             <w:tcBorders>
               <w:top w:val="single" w:color="999999" w:sz="4"/>
               <w:left w:val="single" w:color="999999" w:sz="4"/>
@@ -1890,6 +2240,35 @@
         </w:tc>
         <w:tc>
           <w:tcPr>
+            <w:tcW w:type="dxa" w:w="1300"/>
+            <w:tcBorders>
+              <w:top w:val="single" w:color="999999" w:sz="4"/>
+              <w:left w:val="single" w:color="999999" w:sz="4"/>
+              <w:bottom w:val="single" w:color="999999" w:sz="4"/>
+              <w:right w:val="single" w:color="999999" w:sz="4"/>
+            </w:tcBorders>
+            <w:tcMar>
+              <w:top w:type="dxa" w:w="60"/>
+              <w:left w:type="dxa" w:w="80"/>
+              <w:bottom w:type="dxa" w:w="60"/>
+              <w:right w:type="dxa" w:w="80"/>
+            </w:tcMar>
+          </w:tcPr>
+          <w:p>
+            <w:r>
+              <w:rPr>
+                <w:rFonts w:ascii="Arial" w:cs="Arial" w:eastAsia="Arial" w:hAnsi="Arial"/>
+                <w:b w:val="false"/>
+                <w:bCs w:val="false"/>
+                <w:sz w:val="16"/>
+                <w:szCs w:val="16"/>
+              </w:rPr>
+              <w:t xml:space="preserve">73264.00</w:t>
+            </w:r>
+          </w:p>
+        </w:tc>
+        <w:tc>
+          <w:tcPr>
             <w:tcW w:type="dxa" w:w="1400"/>
             <w:tcBorders>
               <w:top w:val="single" w:color="999999" w:sz="4"/>
@@ -1913,13 +2292,13 @@
                 <w:sz w:val="16"/>
                 <w:szCs w:val="16"/>
               </w:rPr>
-              <w:t xml:space="preserve">73264.00</w:t>
-            </w:r>
-          </w:p>
-        </w:tc>
-        <w:tc>
-          <w:tcPr>
-            <w:tcW w:type="dxa" w:w="5900"/>
+              <w:t xml:space="preserve">43958.40</w:t>
+            </w:r>
+          </w:p>
+        </w:tc>
+        <w:tc>
+          <w:tcPr>
+            <w:tcW w:type="dxa" w:w="5300"/>
             <w:tcBorders>
               <w:top w:val="single" w:color="999999" w:sz="4"/>
               <w:left w:val="single" w:color="999999" w:sz="4"/>
@@ -1948,7 +2327,7 @@
         </w:tc>
         <w:tc>
           <w:tcPr>
-            <w:tcW w:type="dxa" w:w="5900"/>
+            <w:tcW w:type="dxa" w:w="5300"/>
             <w:tcBorders>
               <w:top w:val="single" w:color="999999" w:sz="4"/>
               <w:left w:val="single" w:color="999999" w:sz="4"/>
@@ -2011,7 +2390,7 @@
         </w:tc>
         <w:tc>
           <w:tcPr>
-            <w:tcW w:type="dxa" w:w="1700"/>
+            <w:tcW w:type="dxa" w:w="1600"/>
             <w:tcBorders>
               <w:top w:val="single" w:color="999999" w:sz="4"/>
               <w:left w:val="single" w:color="999999" w:sz="4"/>
@@ -2040,6 +2419,35 @@
         </w:tc>
         <w:tc>
           <w:tcPr>
+            <w:tcW w:type="dxa" w:w="1300"/>
+            <w:tcBorders>
+              <w:top w:val="single" w:color="999999" w:sz="4"/>
+              <w:left w:val="single" w:color="999999" w:sz="4"/>
+              <w:bottom w:val="single" w:color="999999" w:sz="4"/>
+              <w:right w:val="single" w:color="999999" w:sz="4"/>
+            </w:tcBorders>
+            <w:tcMar>
+              <w:top w:type="dxa" w:w="60"/>
+              <w:left w:type="dxa" w:w="80"/>
+              <w:bottom w:type="dxa" w:w="60"/>
+              <w:right w:type="dxa" w:w="80"/>
+            </w:tcMar>
+          </w:tcPr>
+          <w:p>
+            <w:r>
+              <w:rPr>
+                <w:rFonts w:ascii="Arial" w:cs="Arial" w:eastAsia="Arial" w:hAnsi="Arial"/>
+                <w:b w:val="false"/>
+                <w:bCs w:val="false"/>
+                <w:sz w:val="16"/>
+                <w:szCs w:val="16"/>
+              </w:rPr>
+              <w:t xml:space="preserve">21690.00</w:t>
+            </w:r>
+          </w:p>
+        </w:tc>
+        <w:tc>
+          <w:tcPr>
             <w:tcW w:type="dxa" w:w="1400"/>
             <w:tcBorders>
               <w:top w:val="single" w:color="999999" w:sz="4"/>
@@ -2063,13 +2471,13 @@
                 <w:sz w:val="16"/>
                 <w:szCs w:val="16"/>
               </w:rPr>
-              <w:t xml:space="preserve">21690.00</w:t>
-            </w:r>
-          </w:p>
-        </w:tc>
-        <w:tc>
-          <w:tcPr>
-            <w:tcW w:type="dxa" w:w="5900"/>
+              <w:t xml:space="preserve">13014.00</w:t>
+            </w:r>
+          </w:p>
+        </w:tc>
+        <w:tc>
+          <w:tcPr>
+            <w:tcW w:type="dxa" w:w="5300"/>
             <w:tcBorders>
               <w:top w:val="single" w:color="999999" w:sz="4"/>
               <w:left w:val="single" w:color="999999" w:sz="4"/>
@@ -2098,7 +2506,7 @@
         </w:tc>
         <w:tc>
           <w:tcPr>
-            <w:tcW w:type="dxa" w:w="5900"/>
+            <w:tcW w:type="dxa" w:w="5300"/>
             <w:tcBorders>
               <w:top w:val="single" w:color="999999" w:sz="4"/>
               <w:left w:val="single" w:color="999999" w:sz="4"/>
@@ -2161,7 +2569,7 @@
         </w:tc>
         <w:tc>
           <w:tcPr>
-            <w:tcW w:type="dxa" w:w="1700"/>
+            <w:tcW w:type="dxa" w:w="1600"/>
             <w:tcBorders>
               <w:top w:val="single" w:color="999999" w:sz="4"/>
               <w:left w:val="single" w:color="999999" w:sz="4"/>
@@ -2190,6 +2598,35 @@
         </w:tc>
         <w:tc>
           <w:tcPr>
+            <w:tcW w:type="dxa" w:w="1300"/>
+            <w:tcBorders>
+              <w:top w:val="single" w:color="999999" w:sz="4"/>
+              <w:left w:val="single" w:color="999999" w:sz="4"/>
+              <w:bottom w:val="single" w:color="999999" w:sz="4"/>
+              <w:right w:val="single" w:color="999999" w:sz="4"/>
+            </w:tcBorders>
+            <w:tcMar>
+              <w:top w:type="dxa" w:w="60"/>
+              <w:left w:type="dxa" w:w="80"/>
+              <w:bottom w:type="dxa" w:w="60"/>
+              <w:right w:type="dxa" w:w="80"/>
+            </w:tcMar>
+          </w:tcPr>
+          <w:p>
+            <w:r>
+              <w:rPr>
+                <w:rFonts w:ascii="Arial" w:cs="Arial" w:eastAsia="Arial" w:hAnsi="Arial"/>
+                <w:b w:val="false"/>
+                <w:bCs w:val="false"/>
+                <w:sz w:val="16"/>
+                <w:szCs w:val="16"/>
+              </w:rPr>
+              <w:t xml:space="preserve">14460.00</w:t>
+            </w:r>
+          </w:p>
+        </w:tc>
+        <w:tc>
+          <w:tcPr>
             <w:tcW w:type="dxa" w:w="1400"/>
             <w:tcBorders>
               <w:top w:val="single" w:color="999999" w:sz="4"/>
@@ -2213,13 +2650,13 @@
                 <w:sz w:val="16"/>
                 <w:szCs w:val="16"/>
               </w:rPr>
-              <w:t xml:space="preserve">14460.00</w:t>
-            </w:r>
-          </w:p>
-        </w:tc>
-        <w:tc>
-          <w:tcPr>
-            <w:tcW w:type="dxa" w:w="5900"/>
+              <w:t xml:space="preserve">8676.00</w:t>
+            </w:r>
+          </w:p>
+        </w:tc>
+        <w:tc>
+          <w:tcPr>
+            <w:tcW w:type="dxa" w:w="5300"/>
             <w:tcBorders>
               <w:top w:val="single" w:color="999999" w:sz="4"/>
               <w:left w:val="single" w:color="999999" w:sz="4"/>
@@ -2248,7 +2685,7 @@
         </w:tc>
         <w:tc>
           <w:tcPr>
-            <w:tcW w:type="dxa" w:w="5900"/>
+            <w:tcW w:type="dxa" w:w="5300"/>
             <w:tcBorders>
               <w:top w:val="single" w:color="999999" w:sz="4"/>
               <w:left w:val="single" w:color="999999" w:sz="4"/>
@@ -2311,7 +2748,7 @@
         </w:tc>
         <w:tc>
           <w:tcPr>
-            <w:tcW w:type="dxa" w:w="1700"/>
+            <w:tcW w:type="dxa" w:w="1600"/>
             <w:tcBorders>
               <w:top w:val="single" w:color="999999" w:sz="4"/>
               <w:left w:val="single" w:color="999999" w:sz="4"/>
@@ -2340,6 +2777,35 @@
         </w:tc>
         <w:tc>
           <w:tcPr>
+            <w:tcW w:type="dxa" w:w="1300"/>
+            <w:tcBorders>
+              <w:top w:val="single" w:color="999999" w:sz="4"/>
+              <w:left w:val="single" w:color="999999" w:sz="4"/>
+              <w:bottom w:val="single" w:color="999999" w:sz="4"/>
+              <w:right w:val="single" w:color="999999" w:sz="4"/>
+            </w:tcBorders>
+            <w:tcMar>
+              <w:top w:type="dxa" w:w="60"/>
+              <w:left w:type="dxa" w:w="80"/>
+              <w:bottom w:type="dxa" w:w="60"/>
+              <w:right w:type="dxa" w:w="80"/>
+            </w:tcMar>
+          </w:tcPr>
+          <w:p>
+            <w:r>
+              <w:rPr>
+                <w:rFonts w:ascii="Arial" w:cs="Arial" w:eastAsia="Arial" w:hAnsi="Arial"/>
+                <w:b w:val="false"/>
+                <w:bCs w:val="false"/>
+                <w:sz w:val="16"/>
+                <w:szCs w:val="16"/>
+              </w:rPr>
+              <w:t xml:space="preserve">195210.00</w:t>
+            </w:r>
+          </w:p>
+        </w:tc>
+        <w:tc>
+          <w:tcPr>
             <w:tcW w:type="dxa" w:w="1400"/>
             <w:tcBorders>
               <w:top w:val="single" w:color="999999" w:sz="4"/>
@@ -2363,13 +2829,13 @@
                 <w:sz w:val="16"/>
                 <w:szCs w:val="16"/>
               </w:rPr>
-              <w:t xml:space="preserve">195210.00</w:t>
-            </w:r>
-          </w:p>
-        </w:tc>
-        <w:tc>
-          <w:tcPr>
-            <w:tcW w:type="dxa" w:w="5900"/>
+              <w:t xml:space="preserve">117126.00</w:t>
+            </w:r>
+          </w:p>
+        </w:tc>
+        <w:tc>
+          <w:tcPr>
+            <w:tcW w:type="dxa" w:w="5300"/>
             <w:tcBorders>
               <w:top w:val="single" w:color="999999" w:sz="4"/>
               <w:left w:val="single" w:color="999999" w:sz="4"/>
@@ -2398,7 +2864,7 @@
         </w:tc>
         <w:tc>
           <w:tcPr>
-            <w:tcW w:type="dxa" w:w="5900"/>
+            <w:tcW w:type="dxa" w:w="5300"/>
             <w:tcBorders>
               <w:top w:val="single" w:color="999999" w:sz="4"/>
               <w:left w:val="single" w:color="999999" w:sz="4"/>
@@ -2461,7 +2927,7 @@
         </w:tc>
         <w:tc>
           <w:tcPr>
-            <w:tcW w:type="dxa" w:w="1700"/>
+            <w:tcW w:type="dxa" w:w="1600"/>
             <w:tcBorders>
               <w:top w:val="single" w:color="999999" w:sz="4"/>
               <w:left w:val="single" w:color="999999" w:sz="4"/>
@@ -2490,6 +2956,35 @@
         </w:tc>
         <w:tc>
           <w:tcPr>
+            <w:tcW w:type="dxa" w:w="1300"/>
+            <w:tcBorders>
+              <w:top w:val="single" w:color="999999" w:sz="4"/>
+              <w:left w:val="single" w:color="999999" w:sz="4"/>
+              <w:bottom w:val="single" w:color="999999" w:sz="4"/>
+              <w:right w:val="single" w:color="999999" w:sz="4"/>
+            </w:tcBorders>
+            <w:tcMar>
+              <w:top w:type="dxa" w:w="60"/>
+              <w:left w:type="dxa" w:w="80"/>
+              <w:bottom w:type="dxa" w:w="60"/>
+              <w:right w:type="dxa" w:w="80"/>
+            </w:tcMar>
+          </w:tcPr>
+          <w:p>
+            <w:r>
+              <w:rPr>
+                <w:rFonts w:ascii="Arial" w:cs="Arial" w:eastAsia="Arial" w:hAnsi="Arial"/>
+                <w:b w:val="false"/>
+                <w:bCs w:val="false"/>
+                <w:sz w:val="16"/>
+                <w:szCs w:val="16"/>
+              </w:rPr>
+              <w:t xml:space="preserve">78987.75</w:t>
+            </w:r>
+          </w:p>
+        </w:tc>
+        <w:tc>
+          <w:tcPr>
             <w:tcW w:type="dxa" w:w="1400"/>
             <w:tcBorders>
               <w:top w:val="single" w:color="999999" w:sz="4"/>
@@ -2513,13 +3008,13 @@
                 <w:sz w:val="16"/>
                 <w:szCs w:val="16"/>
               </w:rPr>
-              <w:t xml:space="preserve">78987.75</w:t>
-            </w:r>
-          </w:p>
-        </w:tc>
-        <w:tc>
-          <w:tcPr>
-            <w:tcW w:type="dxa" w:w="5900"/>
+              <w:t xml:space="preserve">47392.65</w:t>
+            </w:r>
+          </w:p>
+        </w:tc>
+        <w:tc>
+          <w:tcPr>
+            <w:tcW w:type="dxa" w:w="5300"/>
             <w:tcBorders>
               <w:top w:val="single" w:color="999999" w:sz="4"/>
               <w:left w:val="single" w:color="999999" w:sz="4"/>
@@ -2548,7 +3043,7 @@
         </w:tc>
         <w:tc>
           <w:tcPr>
-            <w:tcW w:type="dxa" w:w="5900"/>
+            <w:tcW w:type="dxa" w:w="5300"/>
             <w:tcBorders>
               <w:top w:val="single" w:color="999999" w:sz="4"/>
               <w:left w:val="single" w:color="999999" w:sz="4"/>
@@ -2611,7 +3106,7 @@
         </w:tc>
         <w:tc>
           <w:tcPr>
-            <w:tcW w:type="dxa" w:w="1700"/>
+            <w:tcW w:type="dxa" w:w="1600"/>
             <w:tcBorders>
               <w:top w:val="single" w:color="999999" w:sz="4"/>
               <w:left w:val="single" w:color="999999" w:sz="4"/>
@@ -2640,6 +3135,35 @@
         </w:tc>
         <w:tc>
           <w:tcPr>
+            <w:tcW w:type="dxa" w:w="1300"/>
+            <w:tcBorders>
+              <w:top w:val="single" w:color="999999" w:sz="4"/>
+              <w:left w:val="single" w:color="999999" w:sz="4"/>
+              <w:bottom w:val="single" w:color="999999" w:sz="4"/>
+              <w:right w:val="single" w:color="999999" w:sz="4"/>
+            </w:tcBorders>
+            <w:tcMar>
+              <w:top w:type="dxa" w:w="60"/>
+              <w:left w:type="dxa" w:w="80"/>
+              <w:bottom w:type="dxa" w:w="60"/>
+              <w:right w:type="dxa" w:w="80"/>
+            </w:tcMar>
+          </w:tcPr>
+          <w:p>
+            <w:r>
+              <w:rPr>
+                <w:rFonts w:ascii="Arial" w:cs="Arial" w:eastAsia="Arial" w:hAnsi="Arial"/>
+                <w:b w:val="false"/>
+                <w:bCs w:val="false"/>
+                <w:sz w:val="16"/>
+                <w:szCs w:val="16"/>
+              </w:rPr>
+              <w:t xml:space="preserve">56665.12</w:t>
+            </w:r>
+          </w:p>
+        </w:tc>
+        <w:tc>
+          <w:tcPr>
             <w:tcW w:type="dxa" w:w="1400"/>
             <w:tcBorders>
               <w:top w:val="single" w:color="999999" w:sz="4"/>
@@ -2663,13 +3187,13 @@
                 <w:sz w:val="16"/>
                 <w:szCs w:val="16"/>
               </w:rPr>
-              <w:t xml:space="preserve">56665.12</w:t>
-            </w:r>
-          </w:p>
-        </w:tc>
-        <w:tc>
-          <w:tcPr>
-            <w:tcW w:type="dxa" w:w="5900"/>
+              <w:t xml:space="preserve">33999.07</w:t>
+            </w:r>
+          </w:p>
+        </w:tc>
+        <w:tc>
+          <w:tcPr>
+            <w:tcW w:type="dxa" w:w="5300"/>
             <w:tcBorders>
               <w:top w:val="single" w:color="999999" w:sz="4"/>
               <w:left w:val="single" w:color="999999" w:sz="4"/>
@@ -2698,7 +3222,7 @@
         </w:tc>
         <w:tc>
           <w:tcPr>
-            <w:tcW w:type="dxa" w:w="5900"/>
+            <w:tcW w:type="dxa" w:w="5300"/>
             <w:tcBorders>
               <w:top w:val="single" w:color="999999" w:sz="4"/>
               <w:left w:val="single" w:color="999999" w:sz="4"/>
@@ -2761,7 +3285,7 @@
         </w:tc>
         <w:tc>
           <w:tcPr>
-            <w:tcW w:type="dxa" w:w="1700"/>
+            <w:tcW w:type="dxa" w:w="1600"/>
             <w:tcBorders>
               <w:top w:val="single" w:color="999999" w:sz="4"/>
               <w:left w:val="single" w:color="999999" w:sz="4"/>
@@ -2790,6 +3314,35 @@
         </w:tc>
         <w:tc>
           <w:tcPr>
+            <w:tcW w:type="dxa" w:w="1300"/>
+            <w:tcBorders>
+              <w:top w:val="single" w:color="999999" w:sz="4"/>
+              <w:left w:val="single" w:color="999999" w:sz="4"/>
+              <w:bottom w:val="single" w:color="999999" w:sz="4"/>
+              <w:right w:val="single" w:color="999999" w:sz="4"/>
+            </w:tcBorders>
+            <w:tcMar>
+              <w:top w:type="dxa" w:w="60"/>
+              <w:left w:type="dxa" w:w="80"/>
+              <w:bottom w:type="dxa" w:w="60"/>
+              <w:right w:type="dxa" w:w="80"/>
+            </w:tcMar>
+          </w:tcPr>
+          <w:p>
+            <w:r>
+              <w:rPr>
+                <w:rFonts w:ascii="Arial" w:cs="Arial" w:eastAsia="Arial" w:hAnsi="Arial"/>
+                <w:b w:val="false"/>
+                <w:bCs w:val="false"/>
+                <w:sz w:val="16"/>
+                <w:szCs w:val="16"/>
+              </w:rPr>
+              <w:t xml:space="preserve">26570.25</w:t>
+            </w:r>
+          </w:p>
+        </w:tc>
+        <w:tc>
+          <w:tcPr>
             <w:tcW w:type="dxa" w:w="1400"/>
             <w:tcBorders>
               <w:top w:val="single" w:color="999999" w:sz="4"/>
@@ -2813,13 +3366,13 @@
                 <w:sz w:val="16"/>
                 <w:szCs w:val="16"/>
               </w:rPr>
-              <w:t xml:space="preserve">26570.25</w:t>
-            </w:r>
-          </w:p>
-        </w:tc>
-        <w:tc>
-          <w:tcPr>
-            <w:tcW w:type="dxa" w:w="5900"/>
+              <w:t xml:space="preserve">15942.15</w:t>
+            </w:r>
+          </w:p>
+        </w:tc>
+        <w:tc>
+          <w:tcPr>
+            <w:tcW w:type="dxa" w:w="5300"/>
             <w:tcBorders>
               <w:top w:val="single" w:color="999999" w:sz="4"/>
               <w:left w:val="single" w:color="999999" w:sz="4"/>
@@ -2848,7 +3401,7 @@
         </w:tc>
         <w:tc>
           <w:tcPr>
-            <w:tcW w:type="dxa" w:w="5900"/>
+            <w:tcW w:type="dxa" w:w="5300"/>
             <w:tcBorders>
               <w:top w:val="single" w:color="999999" w:sz="4"/>
               <w:left w:val="single" w:color="999999" w:sz="4"/>
@@ -2911,7 +3464,7 @@
         </w:tc>
         <w:tc>
           <w:tcPr>
-            <w:tcW w:type="dxa" w:w="1700"/>
+            <w:tcW w:type="dxa" w:w="1600"/>
             <w:tcBorders>
               <w:top w:val="single" w:color="999999" w:sz="4"/>
               <w:left w:val="single" w:color="999999" w:sz="4"/>
@@ -2940,6 +3493,35 @@
         </w:tc>
         <w:tc>
           <w:tcPr>
+            <w:tcW w:type="dxa" w:w="1300"/>
+            <w:tcBorders>
+              <w:top w:val="single" w:color="999999" w:sz="4"/>
+              <w:left w:val="single" w:color="999999" w:sz="4"/>
+              <w:bottom w:val="single" w:color="999999" w:sz="4"/>
+              <w:right w:val="single" w:color="999999" w:sz="4"/>
+            </w:tcBorders>
+            <w:tcMar>
+              <w:top w:type="dxa" w:w="60"/>
+              <w:left w:type="dxa" w:w="80"/>
+              <w:bottom w:type="dxa" w:w="60"/>
+              <w:right w:type="dxa" w:w="80"/>
+            </w:tcMar>
+          </w:tcPr>
+          <w:p>
+            <w:r>
+              <w:rPr>
+                <w:rFonts w:ascii="Arial" w:cs="Arial" w:eastAsia="Arial" w:hAnsi="Arial"/>
+                <w:b w:val="false"/>
+                <w:bCs w:val="false"/>
+                <w:sz w:val="16"/>
+                <w:szCs w:val="16"/>
+              </w:rPr>
+              <w:t xml:space="preserve">87001.00</w:t>
+            </w:r>
+          </w:p>
+        </w:tc>
+        <w:tc>
+          <w:tcPr>
             <w:tcW w:type="dxa" w:w="1400"/>
             <w:tcBorders>
               <w:top w:val="single" w:color="999999" w:sz="4"/>
@@ -2963,13 +3545,13 @@
                 <w:sz w:val="16"/>
                 <w:szCs w:val="16"/>
               </w:rPr>
-              <w:t xml:space="preserve">87001.00</w:t>
-            </w:r>
-          </w:p>
-        </w:tc>
-        <w:tc>
-          <w:tcPr>
-            <w:tcW w:type="dxa" w:w="5900"/>
+              <w:t xml:space="preserve">52200.60</w:t>
+            </w:r>
+          </w:p>
+        </w:tc>
+        <w:tc>
+          <w:tcPr>
+            <w:tcW w:type="dxa" w:w="5300"/>
             <w:tcBorders>
               <w:top w:val="single" w:color="999999" w:sz="4"/>
               <w:left w:val="single" w:color="999999" w:sz="4"/>
@@ -2998,7 +3580,7 @@
         </w:tc>
         <w:tc>
           <w:tcPr>
-            <w:tcW w:type="dxa" w:w="5900"/>
+            <w:tcW w:type="dxa" w:w="5300"/>
             <w:tcBorders>
               <w:top w:val="single" w:color="999999" w:sz="4"/>
               <w:left w:val="single" w:color="999999" w:sz="4"/>
@@ -3061,7 +3643,7 @@
         </w:tc>
         <w:tc>
           <w:tcPr>
-            <w:tcW w:type="dxa" w:w="1700"/>
+            <w:tcW w:type="dxa" w:w="1600"/>
             <w:tcBorders>
               <w:top w:val="single" w:color="999999" w:sz="4"/>
               <w:left w:val="single" w:color="999999" w:sz="4"/>
@@ -3090,6 +3672,35 @@
         </w:tc>
         <w:tc>
           <w:tcPr>
+            <w:tcW w:type="dxa" w:w="1300"/>
+            <w:tcBorders>
+              <w:top w:val="single" w:color="999999" w:sz="4"/>
+              <w:left w:val="single" w:color="999999" w:sz="4"/>
+              <w:bottom w:val="single" w:color="999999" w:sz="4"/>
+              <w:right w:val="single" w:color="999999" w:sz="4"/>
+            </w:tcBorders>
+            <w:tcMar>
+              <w:top w:type="dxa" w:w="60"/>
+              <w:left w:type="dxa" w:w="80"/>
+              <w:bottom w:type="dxa" w:w="60"/>
+              <w:right w:type="dxa" w:w="80"/>
+            </w:tcMar>
+          </w:tcPr>
+          <w:p>
+            <w:r>
+              <w:rPr>
+                <w:rFonts w:ascii="Arial" w:cs="Arial" w:eastAsia="Arial" w:hAnsi="Arial"/>
+                <w:b w:val="false"/>
+                <w:bCs w:val="false"/>
+                <w:sz w:val="16"/>
+                <w:szCs w:val="16"/>
+              </w:rPr>
+              <w:t xml:space="preserve">37957.50</w:t>
+            </w:r>
+          </w:p>
+        </w:tc>
+        <w:tc>
+          <w:tcPr>
             <w:tcW w:type="dxa" w:w="1400"/>
             <w:tcBorders>
               <w:top w:val="single" w:color="999999" w:sz="4"/>
@@ -3113,13 +3724,13 @@
                 <w:sz w:val="16"/>
                 <w:szCs w:val="16"/>
               </w:rPr>
-              <w:t xml:space="preserve">37957.50</w:t>
-            </w:r>
-          </w:p>
-        </w:tc>
-        <w:tc>
-          <w:tcPr>
-            <w:tcW w:type="dxa" w:w="5900"/>
+              <w:t xml:space="preserve">22774.50</w:t>
+            </w:r>
+          </w:p>
+        </w:tc>
+        <w:tc>
+          <w:tcPr>
+            <w:tcW w:type="dxa" w:w="5300"/>
             <w:tcBorders>
               <w:top w:val="single" w:color="999999" w:sz="4"/>
               <w:left w:val="single" w:color="999999" w:sz="4"/>
@@ -3148,7 +3759,7 @@
         </w:tc>
         <w:tc>
           <w:tcPr>
-            <w:tcW w:type="dxa" w:w="5900"/>
+            <w:tcW w:type="dxa" w:w="5300"/>
             <w:tcBorders>
               <w:top w:val="single" w:color="999999" w:sz="4"/>
               <w:left w:val="single" w:color="999999" w:sz="4"/>
@@ -3211,7 +3822,7 @@
         </w:tc>
         <w:tc>
           <w:tcPr>
-            <w:tcW w:type="dxa" w:w="1700"/>
+            <w:tcW w:type="dxa" w:w="1600"/>
             <w:tcBorders>
               <w:top w:val="single" w:color="999999" w:sz="4"/>
               <w:left w:val="single" w:color="999999" w:sz="4"/>
@@ -3240,6 +3851,35 @@
         </w:tc>
         <w:tc>
           <w:tcPr>
+            <w:tcW w:type="dxa" w:w="1300"/>
+            <w:tcBorders>
+              <w:top w:val="single" w:color="999999" w:sz="4"/>
+              <w:left w:val="single" w:color="999999" w:sz="4"/>
+              <w:bottom w:val="single" w:color="999999" w:sz="4"/>
+              <w:right w:val="single" w:color="999999" w:sz="4"/>
+            </w:tcBorders>
+            <w:tcMar>
+              <w:top w:type="dxa" w:w="60"/>
+              <w:left w:type="dxa" w:w="80"/>
+              <w:bottom w:type="dxa" w:w="60"/>
+              <w:right w:type="dxa" w:w="80"/>
+            </w:tcMar>
+          </w:tcPr>
+          <w:p>
+            <w:r>
+              <w:rPr>
+                <w:rFonts w:ascii="Arial" w:cs="Arial" w:eastAsia="Arial" w:hAnsi="Arial"/>
+                <w:b w:val="false"/>
+                <w:bCs w:val="false"/>
+                <w:sz w:val="16"/>
+                <w:szCs w:val="16"/>
+              </w:rPr>
+              <w:t xml:space="preserve">21690.00</w:t>
+            </w:r>
+          </w:p>
+        </w:tc>
+        <w:tc>
+          <w:tcPr>
             <w:tcW w:type="dxa" w:w="1400"/>
             <w:tcBorders>
               <w:top w:val="single" w:color="999999" w:sz="4"/>
@@ -3263,13 +3903,13 @@
                 <w:sz w:val="16"/>
                 <w:szCs w:val="16"/>
               </w:rPr>
-              <w:t xml:space="preserve">21690.00</w:t>
-            </w:r>
-          </w:p>
-        </w:tc>
-        <w:tc>
-          <w:tcPr>
-            <w:tcW w:type="dxa" w:w="5900"/>
+              <w:t xml:space="preserve">13014.00</w:t>
+            </w:r>
+          </w:p>
+        </w:tc>
+        <w:tc>
+          <w:tcPr>
+            <w:tcW w:type="dxa" w:w="5300"/>
             <w:tcBorders>
               <w:top w:val="single" w:color="999999" w:sz="4"/>
               <w:left w:val="single" w:color="999999" w:sz="4"/>
@@ -3298,7 +3938,7 @@
         </w:tc>
         <w:tc>
           <w:tcPr>
-            <w:tcW w:type="dxa" w:w="5900"/>
+            <w:tcW w:type="dxa" w:w="5300"/>
             <w:tcBorders>
               <w:top w:val="single" w:color="999999" w:sz="4"/>
               <w:left w:val="single" w:color="999999" w:sz="4"/>
@@ -3361,7 +4001,7 @@
         </w:tc>
         <w:tc>
           <w:tcPr>
-            <w:tcW w:type="dxa" w:w="1700"/>
+            <w:tcW w:type="dxa" w:w="1600"/>
             <w:tcBorders>
               <w:top w:val="single" w:color="999999" w:sz="4"/>
               <w:left w:val="single" w:color="999999" w:sz="4"/>
@@ -3390,6 +4030,35 @@
         </w:tc>
         <w:tc>
           <w:tcPr>
+            <w:tcW w:type="dxa" w:w="1300"/>
+            <w:tcBorders>
+              <w:top w:val="single" w:color="999999" w:sz="4"/>
+              <w:left w:val="single" w:color="999999" w:sz="4"/>
+              <w:bottom w:val="single" w:color="999999" w:sz="4"/>
+              <w:right w:val="single" w:color="999999" w:sz="4"/>
+            </w:tcBorders>
+            <w:tcMar>
+              <w:top w:type="dxa" w:w="60"/>
+              <w:left w:type="dxa" w:w="80"/>
+              <w:bottom w:type="dxa" w:w="60"/>
+              <w:right w:type="dxa" w:w="80"/>
+            </w:tcMar>
+          </w:tcPr>
+          <w:p>
+            <w:r>
+              <w:rPr>
+                <w:rFonts w:ascii="Arial" w:cs="Arial" w:eastAsia="Arial" w:hAnsi="Arial"/>
+                <w:b w:val="false"/>
+                <w:bCs w:val="false"/>
+                <w:sz w:val="16"/>
+                <w:szCs w:val="16"/>
+              </w:rPr>
+              <w:t xml:space="preserve">103931.25</w:t>
+            </w:r>
+          </w:p>
+        </w:tc>
+        <w:tc>
+          <w:tcPr>
             <w:tcW w:type="dxa" w:w="1400"/>
             <w:tcBorders>
               <w:top w:val="single" w:color="999999" w:sz="4"/>
@@ -3413,13 +4082,13 @@
                 <w:sz w:val="16"/>
                 <w:szCs w:val="16"/>
               </w:rPr>
-              <w:t xml:space="preserve">103931.25</w:t>
-            </w:r>
-          </w:p>
-        </w:tc>
-        <w:tc>
-          <w:tcPr>
-            <w:tcW w:type="dxa" w:w="5900"/>
+              <w:t xml:space="preserve">62358.75</w:t>
+            </w:r>
+          </w:p>
+        </w:tc>
+        <w:tc>
+          <w:tcPr>
+            <w:tcW w:type="dxa" w:w="5300"/>
             <w:tcBorders>
               <w:top w:val="single" w:color="999999" w:sz="4"/>
               <w:left w:val="single" w:color="999999" w:sz="4"/>
@@ -3448,7 +4117,7 @@
         </w:tc>
         <w:tc>
           <w:tcPr>
-            <w:tcW w:type="dxa" w:w="5900"/>
+            <w:tcW w:type="dxa" w:w="5300"/>
             <w:tcBorders>
               <w:top w:val="single" w:color="999999" w:sz="4"/>
               <w:left w:val="single" w:color="999999" w:sz="4"/>
@@ -3511,7 +4180,7 @@
         </w:tc>
         <w:tc>
           <w:tcPr>
-            <w:tcW w:type="dxa" w:w="1700"/>
+            <w:tcW w:type="dxa" w:w="1600"/>
             <w:tcBorders>
               <w:top w:val="single" w:color="999999" w:sz="4"/>
               <w:left w:val="single" w:color="999999" w:sz="4"/>
@@ -3540,6 +4209,35 @@
         </w:tc>
         <w:tc>
           <w:tcPr>
+            <w:tcW w:type="dxa" w:w="1300"/>
+            <w:tcBorders>
+              <w:top w:val="single" w:color="999999" w:sz="4"/>
+              <w:left w:val="single" w:color="999999" w:sz="4"/>
+              <w:bottom w:val="single" w:color="999999" w:sz="4"/>
+              <w:right w:val="single" w:color="999999" w:sz="4"/>
+            </w:tcBorders>
+            <w:tcMar>
+              <w:top w:type="dxa" w:w="60"/>
+              <w:left w:type="dxa" w:w="80"/>
+              <w:bottom w:type="dxa" w:w="60"/>
+              <w:right w:type="dxa" w:w="80"/>
+            </w:tcMar>
+          </w:tcPr>
+          <w:p>
+            <w:r>
+              <w:rPr>
+                <w:rFonts w:ascii="Arial" w:cs="Arial" w:eastAsia="Arial" w:hAnsi="Arial"/>
+                <w:b w:val="false"/>
+                <w:bCs w:val="false"/>
+                <w:sz w:val="16"/>
+                <w:szCs w:val="16"/>
+              </w:rPr>
+              <w:t xml:space="preserve">74559.38</w:t>
+            </w:r>
+          </w:p>
+        </w:tc>
+        <w:tc>
+          <w:tcPr>
             <w:tcW w:type="dxa" w:w="1400"/>
             <w:tcBorders>
               <w:top w:val="single" w:color="999999" w:sz="4"/>
@@ -3563,13 +4261,13 @@
                 <w:sz w:val="16"/>
                 <w:szCs w:val="16"/>
               </w:rPr>
-              <w:t xml:space="preserve">74559.38</w:t>
-            </w:r>
-          </w:p>
-        </w:tc>
-        <w:tc>
-          <w:tcPr>
-            <w:tcW w:type="dxa" w:w="5900"/>
+              <w:t xml:space="preserve">44735.63</w:t>
+            </w:r>
+          </w:p>
+        </w:tc>
+        <w:tc>
+          <w:tcPr>
+            <w:tcW w:type="dxa" w:w="5300"/>
             <w:tcBorders>
               <w:top w:val="single" w:color="999999" w:sz="4"/>
               <w:left w:val="single" w:color="999999" w:sz="4"/>
@@ -3598,7 +4296,7 @@
         </w:tc>
         <w:tc>
           <w:tcPr>
-            <w:tcW w:type="dxa" w:w="5900"/>
+            <w:tcW w:type="dxa" w:w="5300"/>
             <w:tcBorders>
               <w:top w:val="single" w:color="999999" w:sz="4"/>
               <w:left w:val="single" w:color="999999" w:sz="4"/>
@@ -3661,7 +4359,7 @@
         </w:tc>
         <w:tc>
           <w:tcPr>
-            <w:tcW w:type="dxa" w:w="1700"/>
+            <w:tcW w:type="dxa" w:w="1600"/>
             <w:tcBorders>
               <w:top w:val="single" w:color="999999" w:sz="4"/>
               <w:left w:val="single" w:color="999999" w:sz="4"/>
@@ -3690,6 +4388,35 @@
         </w:tc>
         <w:tc>
           <w:tcPr>
+            <w:tcW w:type="dxa" w:w="1300"/>
+            <w:tcBorders>
+              <w:top w:val="single" w:color="999999" w:sz="4"/>
+              <w:left w:val="single" w:color="999999" w:sz="4"/>
+              <w:bottom w:val="single" w:color="999999" w:sz="4"/>
+              <w:right w:val="single" w:color="999999" w:sz="4"/>
+            </w:tcBorders>
+            <w:tcMar>
+              <w:top w:type="dxa" w:w="60"/>
+              <w:left w:type="dxa" w:w="80"/>
+              <w:bottom w:type="dxa" w:w="60"/>
+              <w:right w:type="dxa" w:w="80"/>
+            </w:tcMar>
+          </w:tcPr>
+          <w:p>
+            <w:r>
+              <w:rPr>
+                <w:rFonts w:ascii="Arial" w:cs="Arial" w:eastAsia="Arial" w:hAnsi="Arial"/>
+                <w:b w:val="false"/>
+                <w:bCs w:val="false"/>
+                <w:sz w:val="16"/>
+                <w:szCs w:val="16"/>
+              </w:rPr>
+              <w:t xml:space="preserve">34161.75</w:t>
+            </w:r>
+          </w:p>
+        </w:tc>
+        <w:tc>
+          <w:tcPr>
             <w:tcW w:type="dxa" w:w="1400"/>
             <w:tcBorders>
               <w:top w:val="single" w:color="999999" w:sz="4"/>
@@ -3713,13 +4440,13 @@
                 <w:sz w:val="16"/>
                 <w:szCs w:val="16"/>
               </w:rPr>
-              <w:t xml:space="preserve">34161.75</w:t>
-            </w:r>
-          </w:p>
-        </w:tc>
-        <w:tc>
-          <w:tcPr>
-            <w:tcW w:type="dxa" w:w="5900"/>
+              <w:t xml:space="preserve">20497.05</w:t>
+            </w:r>
+          </w:p>
+        </w:tc>
+        <w:tc>
+          <w:tcPr>
+            <w:tcW w:type="dxa" w:w="5300"/>
             <w:tcBorders>
               <w:top w:val="single" w:color="999999" w:sz="4"/>
               <w:left w:val="single" w:color="999999" w:sz="4"/>
@@ -3748,7 +4475,7 @@
         </w:tc>
         <w:tc>
           <w:tcPr>
-            <w:tcW w:type="dxa" w:w="5900"/>
+            <w:tcW w:type="dxa" w:w="5300"/>
             <w:tcBorders>
               <w:top w:val="single" w:color="999999" w:sz="4"/>
               <w:left w:val="single" w:color="999999" w:sz="4"/>
@@ -3811,7 +4538,7 @@
         </w:tc>
         <w:tc>
           <w:tcPr>
-            <w:tcW w:type="dxa" w:w="1700"/>
+            <w:tcW w:type="dxa" w:w="1600"/>
             <w:tcBorders>
               <w:top w:val="single" w:color="999999" w:sz="4"/>
               <w:left w:val="single" w:color="999999" w:sz="4"/>
@@ -3840,6 +4567,35 @@
         </w:tc>
         <w:tc>
           <w:tcPr>
+            <w:tcW w:type="dxa" w:w="1300"/>
+            <w:tcBorders>
+              <w:top w:val="single" w:color="999999" w:sz="4"/>
+              <w:left w:val="single" w:color="999999" w:sz="4"/>
+              <w:bottom w:val="single" w:color="999999" w:sz="4"/>
+              <w:right w:val="single" w:color="999999" w:sz="4"/>
+            </w:tcBorders>
+            <w:tcMar>
+              <w:top w:type="dxa" w:w="60"/>
+              <w:left w:type="dxa" w:w="80"/>
+              <w:bottom w:type="dxa" w:w="60"/>
+              <w:right w:type="dxa" w:w="80"/>
+            </w:tcMar>
+          </w:tcPr>
+          <w:p>
+            <w:r>
+              <w:rPr>
+                <w:rFonts w:ascii="Arial" w:cs="Arial" w:eastAsia="Arial" w:hAnsi="Arial"/>
+                <w:b w:val="false"/>
+                <w:bCs w:val="false"/>
+                <w:sz w:val="16"/>
+                <w:szCs w:val="16"/>
+              </w:rPr>
+              <w:t xml:space="preserve">114475.00</w:t>
+            </w:r>
+          </w:p>
+        </w:tc>
+        <w:tc>
+          <w:tcPr>
             <w:tcW w:type="dxa" w:w="1400"/>
             <w:tcBorders>
               <w:top w:val="single" w:color="999999" w:sz="4"/>
@@ -3863,13 +4619,13 @@
                 <w:sz w:val="16"/>
                 <w:szCs w:val="16"/>
               </w:rPr>
-              <w:t xml:space="preserve">114475.00</w:t>
-            </w:r>
-          </w:p>
-        </w:tc>
-        <w:tc>
-          <w:tcPr>
-            <w:tcW w:type="dxa" w:w="5900"/>
+              <w:t xml:space="preserve">68685.00</w:t>
+            </w:r>
+          </w:p>
+        </w:tc>
+        <w:tc>
+          <w:tcPr>
+            <w:tcW w:type="dxa" w:w="5300"/>
             <w:tcBorders>
               <w:top w:val="single" w:color="999999" w:sz="4"/>
               <w:left w:val="single" w:color="999999" w:sz="4"/>
@@ -3898,7 +4654,7 @@
         </w:tc>
         <w:tc>
           <w:tcPr>
-            <w:tcW w:type="dxa" w:w="5900"/>
+            <w:tcW w:type="dxa" w:w="5300"/>
             <w:tcBorders>
               <w:top w:val="single" w:color="999999" w:sz="4"/>
               <w:left w:val="single" w:color="999999" w:sz="4"/>
@@ -3961,7 +4717,7 @@
         </w:tc>
         <w:tc>
           <w:tcPr>
-            <w:tcW w:type="dxa" w:w="1700"/>
+            <w:tcW w:type="dxa" w:w="1600"/>
             <w:tcBorders>
               <w:top w:val="single" w:color="999999" w:sz="4"/>
               <w:left w:val="single" w:color="999999" w:sz="4"/>
@@ -3990,6 +4746,35 @@
         </w:tc>
         <w:tc>
           <w:tcPr>
+            <w:tcW w:type="dxa" w:w="1300"/>
+            <w:tcBorders>
+              <w:top w:val="single" w:color="999999" w:sz="4"/>
+              <w:left w:val="single" w:color="999999" w:sz="4"/>
+              <w:bottom w:val="single" w:color="999999" w:sz="4"/>
+              <w:right w:val="single" w:color="999999" w:sz="4"/>
+            </w:tcBorders>
+            <w:tcMar>
+              <w:top w:type="dxa" w:w="60"/>
+              <w:left w:type="dxa" w:w="80"/>
+              <w:bottom w:type="dxa" w:w="60"/>
+              <w:right w:type="dxa" w:w="80"/>
+            </w:tcMar>
+          </w:tcPr>
+          <w:p>
+            <w:r>
+              <w:rPr>
+                <w:rFonts w:ascii="Arial" w:cs="Arial" w:eastAsia="Arial" w:hAnsi="Arial"/>
+                <w:b w:val="false"/>
+                <w:bCs w:val="false"/>
+                <w:sz w:val="16"/>
+                <w:szCs w:val="16"/>
+              </w:rPr>
+              <w:t xml:space="preserve">48802.50</w:t>
+            </w:r>
+          </w:p>
+        </w:tc>
+        <w:tc>
+          <w:tcPr>
             <w:tcW w:type="dxa" w:w="1400"/>
             <w:tcBorders>
               <w:top w:val="single" w:color="999999" w:sz="4"/>
@@ -4013,13 +4798,13 @@
                 <w:sz w:val="16"/>
                 <w:szCs w:val="16"/>
               </w:rPr>
-              <w:t xml:space="preserve">48802.50</w:t>
-            </w:r>
-          </w:p>
-        </w:tc>
-        <w:tc>
-          <w:tcPr>
-            <w:tcW w:type="dxa" w:w="5900"/>
+              <w:t xml:space="preserve">29281.50</w:t>
+            </w:r>
+          </w:p>
+        </w:tc>
+        <w:tc>
+          <w:tcPr>
+            <w:tcW w:type="dxa" w:w="5300"/>
             <w:tcBorders>
               <w:top w:val="single" w:color="999999" w:sz="4"/>
               <w:left w:val="single" w:color="999999" w:sz="4"/>
@@ -4048,7 +4833,7 @@
         </w:tc>
         <w:tc>
           <w:tcPr>
-            <w:tcW w:type="dxa" w:w="5900"/>
+            <w:tcW w:type="dxa" w:w="5300"/>
             <w:tcBorders>
               <w:top w:val="single" w:color="999999" w:sz="4"/>
               <w:left w:val="single" w:color="999999" w:sz="4"/>
@@ -4111,7 +4896,7 @@
         </w:tc>
         <w:tc>
           <w:tcPr>
-            <w:tcW w:type="dxa" w:w="1700"/>
+            <w:tcW w:type="dxa" w:w="1600"/>
             <w:tcBorders>
               <w:top w:val="single" w:color="999999" w:sz="4"/>
               <w:left w:val="single" w:color="999999" w:sz="4"/>
@@ -4140,6 +4925,35 @@
         </w:tc>
         <w:tc>
           <w:tcPr>
+            <w:tcW w:type="dxa" w:w="1300"/>
+            <w:tcBorders>
+              <w:top w:val="single" w:color="999999" w:sz="4"/>
+              <w:left w:val="single" w:color="999999" w:sz="4"/>
+              <w:bottom w:val="single" w:color="999999" w:sz="4"/>
+              <w:right w:val="single" w:color="999999" w:sz="4"/>
+            </w:tcBorders>
+            <w:tcMar>
+              <w:top w:type="dxa" w:w="60"/>
+              <w:left w:type="dxa" w:w="80"/>
+              <w:bottom w:type="dxa" w:w="60"/>
+              <w:right w:type="dxa" w:w="80"/>
+            </w:tcMar>
+          </w:tcPr>
+          <w:p>
+            <w:r>
+              <w:rPr>
+                <w:rFonts w:ascii="Arial" w:cs="Arial" w:eastAsia="Arial" w:hAnsi="Arial"/>
+                <w:b w:val="false"/>
+                <w:bCs w:val="false"/>
+                <w:sz w:val="16"/>
+                <w:szCs w:val="16"/>
+              </w:rPr>
+              <w:t xml:space="preserve">36150.00</w:t>
+            </w:r>
+          </w:p>
+        </w:tc>
+        <w:tc>
+          <w:tcPr>
             <w:tcW w:type="dxa" w:w="1400"/>
             <w:tcBorders>
               <w:top w:val="single" w:color="999999" w:sz="4"/>
@@ -4163,13 +4977,13 @@
                 <w:sz w:val="16"/>
                 <w:szCs w:val="16"/>
               </w:rPr>
-              <w:t xml:space="preserve">36150.00</w:t>
-            </w:r>
-          </w:p>
-        </w:tc>
-        <w:tc>
-          <w:tcPr>
-            <w:tcW w:type="dxa" w:w="5900"/>
+              <w:t xml:space="preserve">21690.00</w:t>
+            </w:r>
+          </w:p>
+        </w:tc>
+        <w:tc>
+          <w:tcPr>
+            <w:tcW w:type="dxa" w:w="5300"/>
             <w:tcBorders>
               <w:top w:val="single" w:color="999999" w:sz="4"/>
               <w:left w:val="single" w:color="999999" w:sz="4"/>
@@ -4198,7 +5012,7 @@
         </w:tc>
         <w:tc>
           <w:tcPr>
-            <w:tcW w:type="dxa" w:w="5900"/>
+            <w:tcW w:type="dxa" w:w="5300"/>
             <w:tcBorders>
               <w:top w:val="single" w:color="999999" w:sz="4"/>
               <w:left w:val="single" w:color="999999" w:sz="4"/>
@@ -4261,7 +5075,7 @@
         </w:tc>
         <w:tc>
           <w:tcPr>
-            <w:tcW w:type="dxa" w:w="1700"/>
+            <w:tcW w:type="dxa" w:w="1600"/>
             <w:tcBorders>
               <w:top w:val="single" w:color="999999" w:sz="4"/>
               <w:left w:val="single" w:color="999999" w:sz="4"/>
@@ -4290,6 +5104,35 @@
         </w:tc>
         <w:tc>
           <w:tcPr>
+            <w:tcW w:type="dxa" w:w="1300"/>
+            <w:tcBorders>
+              <w:top w:val="single" w:color="999999" w:sz="4"/>
+              <w:left w:val="single" w:color="999999" w:sz="4"/>
+              <w:bottom w:val="single" w:color="999999" w:sz="4"/>
+              <w:right w:val="single" w:color="999999" w:sz="4"/>
+            </w:tcBorders>
+            <w:tcMar>
+              <w:top w:type="dxa" w:w="60"/>
+              <w:left w:type="dxa" w:w="80"/>
+              <w:bottom w:type="dxa" w:w="60"/>
+              <w:right w:type="dxa" w:w="80"/>
+            </w:tcMar>
+          </w:tcPr>
+          <w:p>
+            <w:r>
+              <w:rPr>
+                <w:rFonts w:ascii="Arial" w:cs="Arial" w:eastAsia="Arial" w:hAnsi="Arial"/>
+                <w:b w:val="false"/>
+                <w:bCs w:val="false"/>
+                <w:sz w:val="16"/>
+                <w:szCs w:val="16"/>
+              </w:rPr>
+              <w:t xml:space="preserve">65070.00</w:t>
+            </w:r>
+          </w:p>
+        </w:tc>
+        <w:tc>
+          <w:tcPr>
             <w:tcW w:type="dxa" w:w="1400"/>
             <w:tcBorders>
               <w:top w:val="single" w:color="999999" w:sz="4"/>
@@ -4313,13 +5156,13 @@
                 <w:sz w:val="16"/>
                 <w:szCs w:val="16"/>
               </w:rPr>
-              <w:t xml:space="preserve">65070.00</w:t>
-            </w:r>
-          </w:p>
-        </w:tc>
-        <w:tc>
-          <w:tcPr>
-            <w:tcW w:type="dxa" w:w="5900"/>
+              <w:t xml:space="preserve">39042.00</w:t>
+            </w:r>
+          </w:p>
+        </w:tc>
+        <w:tc>
+          <w:tcPr>
+            <w:tcW w:type="dxa" w:w="5300"/>
             <w:tcBorders>
               <w:top w:val="single" w:color="999999" w:sz="4"/>
               <w:left w:val="single" w:color="999999" w:sz="4"/>
@@ -4348,7 +5191,7 @@
         </w:tc>
         <w:tc>
           <w:tcPr>
-            <w:tcW w:type="dxa" w:w="5900"/>
+            <w:tcW w:type="dxa" w:w="5300"/>
             <w:tcBorders>
               <w:top w:val="single" w:color="999999" w:sz="4"/>
               <w:left w:val="single" w:color="999999" w:sz="4"/>

</xml_diff>